<commit_message>
Add open hand gesture action prototype
</commit_message>
<xml_diff>
--- a/1776487919882-bac12ed1-3b86-420f-9fef-86cd76144ca9__community_file (1).docx
+++ b/1776487919882-bac12ed1-3b86-420f-9fef-86cd76144ca9__community_file (1).docx
@@ -672,15 +672,7 @@
           </w:tcPr>
           <w:p>
             <w:r>
-              <w:t xml:space="preserve">The </w:t>
-            </w:r>
-            <w:proofErr w:type="gramStart"/>
-            <w:r>
-              <w:t>final outcome</w:t>
-            </w:r>
-            <w:proofErr w:type="gramEnd"/>
-            <w:r>
-              <w:t xml:space="preserve"> will be a fully functional AI-powered platform that allows administrators to create and manage gesture-based interactive experiences. The system will demonstrate how computer vision can be used to build engaging, touch-free environments for education, exhibitions, events, and public spaces. </w:t>
+              <w:t xml:space="preserve">The final outcome will be a fully functional AI-powered platform that allows administrators to create and manage gesture-based interactive experiences. The system will demonstrate how computer vision can be used to build engaging, touch-free environments for education, exhibitions, events, and public spaces. </w:t>
             </w:r>
           </w:p>
         </w:tc>
@@ -770,15 +762,7 @@
               <w:t xml:space="preserve">people </w:t>
             </w:r>
             <w:r>
-              <w:t xml:space="preserve">want interactive screen </w:t>
-            </w:r>
-            <w:proofErr w:type="gramStart"/>
-            <w:r>
-              <w:t>experiences, but</w:t>
-            </w:r>
-            <w:proofErr w:type="gramEnd"/>
-            <w:r>
-              <w:t xml:space="preserve"> creating them usually requires coding or expensive custom systems.</w:t>
+              <w:t>want interactive screen experiences, but creating them usually requires coding or expensive custom systems.</w:t>
             </w:r>
           </w:p>
         </w:tc>
@@ -871,19 +855,7 @@
               <w:rPr>
                 <w:lang w:val="en-US"/>
               </w:rPr>
-              <w:t>Admin-created content, such as text,</w:t>
-            </w:r>
-            <w:r>
-              <w:rPr>
-                <w:lang w:val="en-US"/>
-              </w:rPr>
-              <w:t xml:space="preserve"> </w:t>
-            </w:r>
-            <w:r>
-              <w:rPr>
-                <w:lang w:val="en-US"/>
-              </w:rPr>
-              <w:t>images, videos, or effects</w:t>
+              <w:t>Admin-created content, such as text, images, videos, or effects</w:t>
             </w:r>
           </w:p>
           <w:p>
@@ -3803,8 +3775,14 @@
           <w:numId w:val="1"/>
         </w:numPr>
         <w:spacing w:after="0"/>
-      </w:pPr>
-      <w:r>
+        <w:rPr>
+          <w:highlight w:val="yellow"/>
+        </w:rPr>
+      </w:pPr>
+      <w:r>
+        <w:rPr>
+          <w:highlight w:val="yellow"/>
+        </w:rPr>
         <w:t>☐ Repository created and initial commit pushed</w:t>
       </w:r>
     </w:p>
@@ -3815,8 +3793,14 @@
           <w:numId w:val="1"/>
         </w:numPr>
         <w:spacing w:after="0"/>
-      </w:pPr>
-      <w:r>
+        <w:rPr>
+          <w:highlight w:val="yellow"/>
+        </w:rPr>
+      </w:pPr>
+      <w:r>
+        <w:rPr>
+          <w:highlight w:val="yellow"/>
+        </w:rPr>
         <w:t>☐ README created (project goal + how to run)</w:t>
       </w:r>
     </w:p>
@@ -3827,18 +3811,28 @@
           <w:numId w:val="1"/>
         </w:numPr>
         <w:spacing w:after="0"/>
-      </w:pPr>
-      <w:proofErr w:type="gramStart"/>
-      <w:r>
+        <w:rPr>
+          <w:highlight w:val="yellow"/>
+        </w:rPr>
+      </w:pPr>
+      <w:r>
+        <w:rPr>
+          <w:highlight w:val="yellow"/>
+        </w:rPr>
         <w:t>☐ .</w:t>
       </w:r>
       <w:proofErr w:type="spellStart"/>
       <w:r>
+        <w:rPr>
+          <w:highlight w:val="yellow"/>
+        </w:rPr>
         <w:t>gitignore</w:t>
       </w:r>
       <w:proofErr w:type="spellEnd"/>
-      <w:proofErr w:type="gramEnd"/>
-      <w:r>
+      <w:r>
+        <w:rPr>
+          <w:highlight w:val="yellow"/>
+        </w:rPr>
         <w:t xml:space="preserve"> configured (no secrets)</w:t>
       </w:r>
     </w:p>
@@ -3849,24 +3843,42 @@
           <w:numId w:val="1"/>
         </w:numPr>
         <w:spacing w:after="0"/>
-      </w:pPr>
-      <w:r>
+        <w:rPr>
+          <w:highlight w:val="yellow"/>
+        </w:rPr>
+      </w:pPr>
+      <w:r>
+        <w:rPr>
+          <w:highlight w:val="yellow"/>
+        </w:rPr>
         <w:t>☐ Python environment created (</w:t>
       </w:r>
       <w:proofErr w:type="spellStart"/>
       <w:r>
+        <w:rPr>
+          <w:highlight w:val="yellow"/>
+        </w:rPr>
         <w:t>venv</w:t>
       </w:r>
       <w:proofErr w:type="spellEnd"/>
       <w:r>
+        <w:rPr>
+          <w:highlight w:val="yellow"/>
+        </w:rPr>
         <w:t>/</w:t>
       </w:r>
       <w:proofErr w:type="spellStart"/>
       <w:r>
+        <w:rPr>
+          <w:highlight w:val="yellow"/>
+        </w:rPr>
         <w:t>conda</w:t>
       </w:r>
       <w:proofErr w:type="spellEnd"/>
       <w:r>
+        <w:rPr>
+          <w:highlight w:val="yellow"/>
+        </w:rPr>
         <w:t>) OR platform workspace created (no-code)</w:t>
       </w:r>
     </w:p>
@@ -3877,24 +3889,42 @@
           <w:numId w:val="1"/>
         </w:numPr>
         <w:spacing w:after="0"/>
-      </w:pPr>
-      <w:r>
+        <w:rPr>
+          <w:highlight w:val="yellow"/>
+        </w:rPr>
+      </w:pPr>
+      <w:r>
+        <w:rPr>
+          <w:highlight w:val="yellow"/>
+        </w:rPr>
         <w:t xml:space="preserve">☐ Dependencies installed and pinned (requirements.txt / </w:t>
       </w:r>
       <w:proofErr w:type="spellStart"/>
       <w:r>
+        <w:rPr>
+          <w:highlight w:val="yellow"/>
+        </w:rPr>
         <w:t>pyproject</w:t>
       </w:r>
       <w:proofErr w:type="spellEnd"/>
       <w:r>
+        <w:rPr>
+          <w:highlight w:val="yellow"/>
+        </w:rPr>
         <w:t xml:space="preserve"> / </w:t>
       </w:r>
       <w:proofErr w:type="spellStart"/>
       <w:r>
+        <w:rPr>
+          <w:highlight w:val="yellow"/>
+        </w:rPr>
         <w:t>lockfile</w:t>
       </w:r>
       <w:proofErr w:type="spellEnd"/>
       <w:r>
+        <w:rPr>
+          <w:highlight w:val="yellow"/>
+        </w:rPr>
         <w:t>)</w:t>
       </w:r>
     </w:p>
@@ -3907,15 +3937,7 @@
         <w:spacing w:after="0"/>
       </w:pPr>
       <w:r>
-        <w:t xml:space="preserve">☐ API keys stored safely </w:t>
-      </w:r>
-      <w:proofErr w:type="gramStart"/>
-      <w:r>
-        <w:t>(.env</w:t>
-      </w:r>
-      <w:proofErr w:type="gramEnd"/>
-      <w:r>
-        <w:t>, secrets manager, or platform secrets)</w:t>
+        <w:t>☐ API keys stored safely (.env, secrets manager, or platform secrets)</w:t>
       </w:r>
     </w:p>
     <w:p>
@@ -3925,17 +3947,15 @@
           <w:numId w:val="1"/>
         </w:numPr>
         <w:spacing w:after="0"/>
-      </w:pPr>
-      <w:r>
-        <w:t>☐ Basic '</w:t>
-      </w:r>
-      <w:proofErr w:type="gramStart"/>
-      <w:r>
-        <w:t>hello world</w:t>
-      </w:r>
-      <w:proofErr w:type="gramEnd"/>
-      <w:r>
-        <w:t>' run completed locally</w:t>
+        <w:rPr>
+          <w:highlight w:val="yellow"/>
+        </w:rPr>
+      </w:pPr>
+      <w:r>
+        <w:rPr>
+          <w:highlight w:val="yellow"/>
+        </w:rPr>
+        <w:t>☐ Basic 'hello world' run completed locally</w:t>
       </w:r>
     </w:p>
     <w:p>
@@ -3957,8 +3977,14 @@
           <w:numId w:val="1"/>
         </w:numPr>
         <w:spacing w:after="0"/>
-      </w:pPr>
-      <w:r>
+        <w:rPr>
+          <w:highlight w:val="yellow"/>
+        </w:rPr>
+      </w:pPr>
+      <w:r>
+        <w:rPr>
+          <w:highlight w:val="yellow"/>
+        </w:rPr>
         <w:t>☐ Folder structure created (src/, data/, notebooks/, etc.)</w:t>
       </w:r>
     </w:p>
@@ -3969,8 +3995,14 @@
           <w:numId w:val="1"/>
         </w:numPr>
         <w:spacing w:after="40"/>
-      </w:pPr>
-      <w:r>
+        <w:rPr>
+          <w:highlight w:val="yellow"/>
+        </w:rPr>
+      </w:pPr>
+      <w:r>
+        <w:rPr>
+          <w:highlight w:val="yellow"/>
+        </w:rPr>
         <w:t>☐ First prototype screen/flow created (UI stub acceptable)</w:t>
       </w:r>
     </w:p>
@@ -4014,6 +4046,16 @@
           <w:tcPr>
             <w:tcW w:w="4320" w:type="dxa"/>
           </w:tcPr>
+          <w:p>
+            <w:hyperlink r:id="rId6" w:history="1">
+              <w:r>
+                <w:rPr>
+                  <w:rStyle w:val="Hyperlink"/>
+                </w:rPr>
+                <w:t>https://github.com/AreenAlBattashi/Gesture-AI-Studios</w:t>
+              </w:r>
+            </w:hyperlink>
+          </w:p>
           <w:p/>
         </w:tc>
       </w:tr>
@@ -4032,7 +4074,11 @@
           <w:tcPr>
             <w:tcW w:w="4320" w:type="dxa"/>
           </w:tcPr>
-          <w:p/>
+          <w:p>
+            <w:r>
+              <w:t>98837e5</w:t>
+            </w:r>
+          </w:p>
         </w:tc>
       </w:tr>
       <w:tr>
@@ -4050,6 +4096,16 @@
           <w:tcPr>
             <w:tcW w:w="4320" w:type="dxa"/>
           </w:tcPr>
+          <w:p>
+            <w:hyperlink r:id="rId7" w:history="1">
+              <w:r>
+                <w:rPr>
+                  <w:rStyle w:val="Hyperlink"/>
+                </w:rPr>
+                <w:t>https://github.com/AreenAlBattashi/Gesture-AI-Studios/tree/main/screenshots</w:t>
+              </w:r>
+            </w:hyperlink>
+          </w:p>
           <w:p/>
         </w:tc>
       </w:tr>
@@ -4068,7 +4124,19 @@
           <w:tcPr>
             <w:tcW w:w="4320" w:type="dxa"/>
           </w:tcPr>
-          <w:p/>
+          <w:p>
+            <w:r>
+              <w:t xml:space="preserve">Python was selected as the primary development language due to its strong support for computer vision and AI applications. OpenCV was chosen for camera integration, while </w:t>
+            </w:r>
+            <w:proofErr w:type="spellStart"/>
+            <w:r>
+              <w:t>MediaPipe</w:t>
+            </w:r>
+            <w:proofErr w:type="spellEnd"/>
+            <w:r>
+              <w:t xml:space="preserve"> will be used for gesture recognition. GitHub was used for version control and project management. A virtual environment was created to manage project dependencies and maintain a clean development setup.</w:t>
+            </w:r>
+          </w:p>
         </w:tc>
       </w:tr>
     </w:tbl>
@@ -4078,18 +4146,42 @@
       </w:r>
     </w:p>
     <w:p>
-      <w:r>
-        <w:t xml:space="preserve">• </w:t>
-      </w:r>
-    </w:p>
-    <w:p>
-      <w:r>
-        <w:t xml:space="preserve">• </w:t>
-      </w:r>
-    </w:p>
-    <w:p>
-      <w:r>
-        <w:t xml:space="preserve">• </w:t>
+      <w:pPr>
+        <w:rPr>
+          <w:lang w:val="en-US"/>
+        </w:rPr>
+      </w:pPr>
+      <w:r>
+        <w:rPr>
+          <w:lang w:val="en-US"/>
+        </w:rPr>
+        <w:t>• Created the Gesture AI Studios project repository and configured GitHub version control.</w:t>
+      </w:r>
+    </w:p>
+    <w:p>
+      <w:pPr>
+        <w:rPr>
+          <w:lang w:val="en-US"/>
+        </w:rPr>
+      </w:pPr>
+      <w:r>
+        <w:rPr>
+          <w:lang w:val="en-US"/>
+        </w:rPr>
+        <w:t>• Set up the Python virtual environment and installed required libraries including OpenCV.</w:t>
+      </w:r>
+    </w:p>
+    <w:p>
+      <w:pPr>
+        <w:rPr>
+          <w:lang w:val="en-US"/>
+        </w:rPr>
+      </w:pPr>
+      <w:r>
+        <w:rPr>
+          <w:lang w:val="en-US"/>
+        </w:rPr>
+        <w:t>• Developed and tested the first webcam prototype, successfully displaying a live camera feed that will serve as the foundation for future gesture recognition features.</w:t>
       </w:r>
     </w:p>
     <w:p>
@@ -4098,13 +4190,30 @@
       </w:r>
     </w:p>
     <w:p>
-      <w:r>
-        <w:t xml:space="preserve">• </w:t>
-      </w:r>
-    </w:p>
-    <w:p>
-      <w:r>
-        <w:t xml:space="preserve">• </w:t>
+      <w:pPr>
+        <w:rPr>
+          <w:lang w:val="en-US"/>
+        </w:rPr>
+      </w:pPr>
+      <w:r>
+        <w:rPr>
+          <w:lang w:val="en-US"/>
+        </w:rPr>
+        <w:lastRenderedPageBreak/>
+        <w:t>• Git was not initially installed on the system. This was resolved by installing Git for Windows and configuring GitHub integration.</w:t>
+      </w:r>
+    </w:p>
+    <w:p>
+      <w:pPr>
+        <w:rPr>
+          <w:lang w:val="en-US"/>
+        </w:rPr>
+      </w:pPr>
+      <w:r>
+        <w:rPr>
+          <w:lang w:val="en-US"/>
+        </w:rPr>
+        <w:t>• PowerShell execution policy initially prevented virtual environment activation. This was resolved by adjusting the execution policy and successfully activating the virtual environment.</w:t>
       </w:r>
     </w:p>
     <w:p>
@@ -4133,8 +4242,14 @@
           <w:numId w:val="2"/>
         </w:numPr>
         <w:spacing w:after="0"/>
-      </w:pPr>
-      <w:r>
+        <w:rPr>
+          <w:highlight w:val="yellow"/>
+        </w:rPr>
+      </w:pPr>
+      <w:r>
+        <w:rPr>
+          <w:highlight w:val="yellow"/>
+        </w:rPr>
         <w:t>☐ Core logic implemented (model/prompt/workflow)</w:t>
       </w:r>
     </w:p>
@@ -4145,8 +4260,14 @@
           <w:numId w:val="2"/>
         </w:numPr>
         <w:spacing w:after="0"/>
-      </w:pPr>
-      <w:r>
+        <w:rPr>
+          <w:highlight w:val="yellow"/>
+        </w:rPr>
+      </w:pPr>
+      <w:r>
+        <w:rPr>
+          <w:highlight w:val="yellow"/>
+        </w:rPr>
         <w:t>☐ Data ingestion or API integration expanded beyond hello world</w:t>
       </w:r>
     </w:p>
@@ -4157,8 +4278,14 @@
           <w:numId w:val="2"/>
         </w:numPr>
         <w:spacing w:after="0"/>
-      </w:pPr>
-      <w:r>
+        <w:rPr>
+          <w:highlight w:val="yellow"/>
+        </w:rPr>
+      </w:pPr>
+      <w:r>
+        <w:rPr>
+          <w:highlight w:val="yellow"/>
+        </w:rPr>
         <w:t>☐ 10–20 test questions/examples drafted (start your 'exam set')</w:t>
       </w:r>
     </w:p>
@@ -4169,8 +4296,14 @@
           <w:numId w:val="2"/>
         </w:numPr>
         <w:spacing w:after="0"/>
-      </w:pPr>
-      <w:r>
+        <w:rPr>
+          <w:highlight w:val="yellow"/>
+        </w:rPr>
+      </w:pPr>
+      <w:r>
+        <w:rPr>
+          <w:highlight w:val="yellow"/>
+        </w:rPr>
         <w:t>☐ First measurable baseline created (even if rough)</w:t>
       </w:r>
     </w:p>
@@ -4181,8 +4314,14 @@
           <w:numId w:val="2"/>
         </w:numPr>
         <w:spacing w:after="40"/>
-      </w:pPr>
-      <w:r>
+        <w:rPr>
+          <w:highlight w:val="yellow"/>
+        </w:rPr>
+      </w:pPr>
+      <w:r>
+        <w:rPr>
+          <w:highlight w:val="yellow"/>
+        </w:rPr>
         <w:t>☐ README updated with run instructions</w:t>
       </w:r>
     </w:p>
@@ -4226,7 +4365,19 @@
           <w:tcPr>
             <w:tcW w:w="4320" w:type="dxa"/>
           </w:tcPr>
-          <w:p/>
+          <w:p>
+            <w:r>
+              <w:t xml:space="preserve">The brain of Gesture AI Studios is a computer vision system built using </w:t>
+            </w:r>
+            <w:proofErr w:type="spellStart"/>
+            <w:r>
+              <w:t>MediaPipe</w:t>
+            </w:r>
+            <w:proofErr w:type="spellEnd"/>
+            <w:r>
+              <w:t xml:space="preserve"> and OpenCV. It analyzes live camera input, detects hand landmarks in real time, and serves as the foundation for recognizing gestures and triggering customized actions.</w:t>
+            </w:r>
+          </w:p>
         </w:tc>
       </w:tr>
       <w:tr>
@@ -4244,7 +4395,26 @@
           <w:tcPr>
             <w:tcW w:w="4320" w:type="dxa"/>
           </w:tcPr>
+          <w:p>
+            <w:hyperlink r:id="rId8" w:history="1">
+              <w:r>
+                <w:rPr>
+                  <w:rStyle w:val="Hyperlink"/>
+                </w:rPr>
+                <w:t>https://github.com/AreenAlBattashi/Gesture-AI-Studios</w:t>
+              </w:r>
+            </w:hyperlink>
+          </w:p>
           <w:p/>
+          <w:p>
+            <w:r>
+              <w:t>Main workflow:</w:t>
+            </w:r>
+            <w:r>
+              <w:br/>
+              <w:t>Camera Input → Hand Detection → Landmark Extraction → Gesture Recognition → Action Trigger</w:t>
+            </w:r>
+          </w:p>
         </w:tc>
       </w:tr>
       <w:tr>
@@ -4262,7 +4432,11 @@
           <w:tcPr>
             <w:tcW w:w="4320" w:type="dxa"/>
           </w:tcPr>
-          <w:p/>
+          <w:p>
+            <w:r>
+              <w:t>Successfully detects one hand in real time using a webcam and displays hand landmarks on the screen. The system reliably tracks hand position and movement under normal lighting conditions.</w:t>
+            </w:r>
+          </w:p>
         </w:tc>
       </w:tr>
       <w:tr>
@@ -4280,7 +4454,11 @@
           <w:tcPr>
             <w:tcW w:w="4320" w:type="dxa"/>
           </w:tcPr>
-          <w:p/>
+          <w:p>
+            <w:r>
+              <w:t>Implement gesture recognition for specific gestures such as thumbs up, open hand, and raised finger. Connect recognized gestures to customizable actions such as displaying text, images, and animations.</w:t>
+            </w:r>
+          </w:p>
         </w:tc>
       </w:tr>
     </w:tbl>
@@ -4290,13 +4468,71 @@
       </w:r>
     </w:p>
     <w:p>
-      <w:r>
-        <w:t xml:space="preserve">• </w:t>
-      </w:r>
-    </w:p>
-    <w:p>
-      <w:r>
-        <w:t xml:space="preserve">• </w:t>
+      <w:pPr>
+        <w:rPr>
+          <w:lang w:val="en-US"/>
+        </w:rPr>
+      </w:pPr>
+      <w:r>
+        <w:rPr>
+          <w:lang w:val="en-US"/>
+        </w:rPr>
+        <w:t xml:space="preserve">• Selected </w:t>
+      </w:r>
+      <w:proofErr w:type="spellStart"/>
+      <w:r>
+        <w:rPr>
+          <w:lang w:val="en-US"/>
+        </w:rPr>
+        <w:t>MediaPipe</w:t>
+      </w:r>
+      <w:proofErr w:type="spellEnd"/>
+      <w:r>
+        <w:rPr>
+          <w:lang w:val="en-US"/>
+        </w:rPr>
+        <w:t xml:space="preserve"> Hand </w:t>
+      </w:r>
+      <w:proofErr w:type="spellStart"/>
+      <w:r>
+        <w:rPr>
+          <w:lang w:val="en-US"/>
+        </w:rPr>
+        <w:t>Landmarker</w:t>
+      </w:r>
+      <w:proofErr w:type="spellEnd"/>
+      <w:r>
+        <w:rPr>
+          <w:lang w:val="en-US"/>
+        </w:rPr>
+        <w:t xml:space="preserve"> because it provides accurate real-time hand tracking and is suitable for interactive applications.</w:t>
+      </w:r>
+    </w:p>
+    <w:p>
+      <w:pPr>
+        <w:rPr>
+          <w:lang w:val="en-US"/>
+        </w:rPr>
+      </w:pPr>
+      <w:r>
+        <w:rPr>
+          <w:lang w:val="en-US"/>
+        </w:rPr>
+        <w:t xml:space="preserve">• Chose OpenCV for camera processing due to its performance, simplicity, and strong integration with </w:t>
+      </w:r>
+      <w:proofErr w:type="spellStart"/>
+      <w:r>
+        <w:rPr>
+          <w:lang w:val="en-US"/>
+        </w:rPr>
+        <w:t>MediaPipe</w:t>
+      </w:r>
+      <w:proofErr w:type="spellEnd"/>
+      <w:r>
+        <w:rPr>
+          <w:lang w:val="en-US"/>
+        </w:rPr>
+        <w:t>.</w:t>
       </w:r>
     </w:p>
     <w:p>
@@ -4305,8 +4541,30 @@
       </w:r>
     </w:p>
     <w:p>
-      <w:r>
-        <w:t xml:space="preserve">• </w:t>
+      <w:pPr>
+        <w:rPr>
+          <w:lang w:val="en-US"/>
+        </w:rPr>
+      </w:pPr>
+      <w:r>
+        <w:rPr>
+          <w:lang w:val="en-US"/>
+        </w:rPr>
+        <w:t>• Need to develop a reliable gesture classification system that can distinguish between multiple gestures.</w:t>
+      </w:r>
+    </w:p>
+    <w:p>
+      <w:pPr>
+        <w:rPr>
+          <w:lang w:val="en-US"/>
+        </w:rPr>
+      </w:pPr>
+      <w:r>
+        <w:rPr>
+          <w:lang w:val="en-US"/>
+        </w:rPr>
+        <w:lastRenderedPageBreak/>
+        <w:t>• Need to design an administrator interface that allows users to assign custom actions to gestures.</w:t>
       </w:r>
     </w:p>
     <w:p>
@@ -4768,13 +5026,8 @@
         </w:numPr>
         <w:spacing w:after="0"/>
       </w:pPr>
-      <w:proofErr w:type="gramStart"/>
-      <w:r>
-        <w:t>☐ Secrets handling</w:t>
-      </w:r>
-      <w:proofErr w:type="gramEnd"/>
-      <w:r>
-        <w:t xml:space="preserve"> reviewed (no keys in repo)</w:t>
+      <w:r>
+        <w:t>☐ Secrets handling reviewed (no keys in repo)</w:t>
       </w:r>
     </w:p>
     <w:p>
@@ -8655,6 +8908,18 @@
       <w:contextualSpacing/>
     </w:pPr>
   </w:style>
+  <w:style w:type="character" w:styleId="FollowedHyperlink">
+    <w:name w:val="FollowedHyperlink"/>
+    <w:basedOn w:val="DefaultParagraphFont"/>
+    <w:uiPriority w:val="99"/>
+    <w:semiHidden/>
+    <w:unhideWhenUsed/>
+    <w:rsid w:val="00691683"/>
+    <w:rPr>
+      <w:color w:val="800080" w:themeColor="followedHyperlink"/>
+      <w:u w:val="single"/>
+    </w:rPr>
+  </w:style>
 </w:styles>
 </file>
 

</xml_diff>

<commit_message>
Day 4 optimization and evaluation updates
</commit_message>
<xml_diff>
--- a/1776487919882-bac12ed1-3b86-420f-9fef-86cd76144ca9__community_file (1).docx
+++ b/1776487919882-bac12ed1-3b86-420f-9fef-86cd76144ca9__community_file (1).docx
@@ -672,7 +672,15 @@
           </w:tcPr>
           <w:p>
             <w:r>
-              <w:t xml:space="preserve">The final outcome will be a fully functional AI-powered platform that allows administrators to create and manage gesture-based interactive experiences. The system will demonstrate how computer vision can be used to build engaging, touch-free environments for education, exhibitions, events, and public spaces. </w:t>
+              <w:t xml:space="preserve">The </w:t>
+            </w:r>
+            <w:proofErr w:type="gramStart"/>
+            <w:r>
+              <w:t>final outcome</w:t>
+            </w:r>
+            <w:proofErr w:type="gramEnd"/>
+            <w:r>
+              <w:t xml:space="preserve"> will be a fully functional AI-powered platform that allows administrators to create and manage gesture-based interactive experiences. The system will demonstrate how computer vision can be used to build engaging, touch-free environments for education, exhibitions, events, and public spaces. </w:t>
             </w:r>
           </w:p>
         </w:tc>
@@ -762,7 +770,15 @@
               <w:t xml:space="preserve">people </w:t>
             </w:r>
             <w:r>
-              <w:t>want interactive screen experiences, but creating them usually requires coding or expensive custom systems.</w:t>
+              <w:t xml:space="preserve">want interactive screen </w:t>
+            </w:r>
+            <w:proofErr w:type="gramStart"/>
+            <w:r>
+              <w:t>experiences, but</w:t>
+            </w:r>
+            <w:proofErr w:type="gramEnd"/>
+            <w:r>
+              <w:t xml:space="preserve"> creating them usually requires coding or expensive custom systems.</w:t>
             </w:r>
           </w:p>
         </w:tc>
@@ -3815,6 +3831,7 @@
           <w:highlight w:val="yellow"/>
         </w:rPr>
       </w:pPr>
+      <w:proofErr w:type="gramStart"/>
       <w:r>
         <w:rPr>
           <w:highlight w:val="yellow"/>
@@ -3829,6 +3846,7 @@
         <w:t>gitignore</w:t>
       </w:r>
       <w:proofErr w:type="spellEnd"/>
+      <w:proofErr w:type="gramEnd"/>
       <w:r>
         <w:rPr>
           <w:highlight w:val="yellow"/>
@@ -3937,7 +3955,15 @@
         <w:spacing w:after="0"/>
       </w:pPr>
       <w:r>
-        <w:t>☐ API keys stored safely (.env, secrets manager, or platform secrets)</w:t>
+        <w:t xml:space="preserve">☐ API keys stored safely </w:t>
+      </w:r>
+      <w:proofErr w:type="gramStart"/>
+      <w:r>
+        <w:t>(.env</w:t>
+      </w:r>
+      <w:proofErr w:type="gramEnd"/>
+      <w:r>
+        <w:t>, secrets manager, or platform secrets)</w:t>
       </w:r>
     </w:p>
     <w:p>
@@ -3955,7 +3981,21 @@
         <w:rPr>
           <w:highlight w:val="yellow"/>
         </w:rPr>
-        <w:t>☐ Basic 'hello world' run completed locally</w:t>
+        <w:t>☐ Basic '</w:t>
+      </w:r>
+      <w:proofErr w:type="gramStart"/>
+      <w:r>
+        <w:rPr>
+          <w:highlight w:val="yellow"/>
+        </w:rPr>
+        <w:t>hello world</w:t>
+      </w:r>
+      <w:proofErr w:type="gramEnd"/>
+      <w:r>
+        <w:rPr>
+          <w:highlight w:val="yellow"/>
+        </w:rPr>
+        <w:t>' run completed locally</w:t>
       </w:r>
     </w:p>
     <w:p>
@@ -4593,8 +4633,14 @@
           <w:numId w:val="8"/>
         </w:numPr>
         <w:spacing w:after="0"/>
-      </w:pPr>
-      <w:r>
+        <w:rPr>
+          <w:highlight w:val="yellow"/>
+        </w:rPr>
+      </w:pPr>
+      <w:r>
+        <w:rPr>
+          <w:highlight w:val="yellow"/>
+        </w:rPr>
         <w:t>☐ Evaluation approach defined (metrics + test set)</w:t>
       </w:r>
     </w:p>
@@ -4605,8 +4651,14 @@
           <w:numId w:val="8"/>
         </w:numPr>
         <w:spacing w:after="0"/>
-      </w:pPr>
-      <w:r>
+        <w:rPr>
+          <w:highlight w:val="yellow"/>
+        </w:rPr>
+      </w:pPr>
+      <w:r>
+        <w:rPr>
+          <w:highlight w:val="yellow"/>
+        </w:rPr>
         <w:t>☐ Error handling + retries added (API) OR validation rules added (no-code)</w:t>
       </w:r>
     </w:p>
@@ -4617,8 +4669,14 @@
           <w:numId w:val="8"/>
         </w:numPr>
         <w:spacing w:after="0"/>
-      </w:pPr>
-      <w:r>
+        <w:rPr>
+          <w:highlight w:val="yellow"/>
+        </w:rPr>
+      </w:pPr>
+      <w:r>
+        <w:rPr>
+          <w:highlight w:val="yellow"/>
+        </w:rPr>
         <w:t>☐ Prompt/model iteration based on failures</w:t>
       </w:r>
     </w:p>
@@ -4629,8 +4687,14 @@
           <w:numId w:val="8"/>
         </w:numPr>
         <w:spacing w:after="0"/>
-      </w:pPr>
-      <w:r>
+        <w:rPr>
+          <w:highlight w:val="yellow"/>
+        </w:rPr>
+      </w:pPr>
+      <w:r>
+        <w:rPr>
+          <w:highlight w:val="yellow"/>
+        </w:rPr>
         <w:t>☐ Latency/cost notes captured</w:t>
       </w:r>
     </w:p>
@@ -4641,8 +4705,14 @@
           <w:numId w:val="8"/>
         </w:numPr>
         <w:spacing w:after="40"/>
-      </w:pPr>
-      <w:r>
+        <w:rPr>
+          <w:highlight w:val="yellow"/>
+        </w:rPr>
+      </w:pPr>
+      <w:r>
+        <w:rPr>
+          <w:highlight w:val="yellow"/>
+        </w:rPr>
         <w:t>☐ Safety/guardrails considered (content, PII, injection)</w:t>
       </w:r>
     </w:p>
@@ -4686,7 +4756,27 @@
           <w:tcPr>
             <w:tcW w:w="4320" w:type="dxa"/>
           </w:tcPr>
-          <w:p/>
+          <w:p>
+            <w:r>
+              <w:t xml:space="preserve">Live webcam testing using </w:t>
+            </w:r>
+            <w:proofErr w:type="spellStart"/>
+            <w:r>
+              <w:t>MediaPipe</w:t>
+            </w:r>
+            <w:proofErr w:type="spellEnd"/>
+            <w:r>
+              <w:t xml:space="preserve"> Hand </w:t>
+            </w:r>
+            <w:proofErr w:type="spellStart"/>
+            <w:r>
+              <w:t>Landmarker</w:t>
+            </w:r>
+            <w:proofErr w:type="spellEnd"/>
+            <w:r>
+              <w:t xml:space="preserve"> and custom gesture test scenarios.</w:t>
+            </w:r>
+          </w:p>
         </w:tc>
       </w:tr>
       <w:tr>
@@ -4704,7 +4794,11 @@
           <w:tcPr>
             <w:tcW w:w="4320" w:type="dxa"/>
           </w:tcPr>
-          <w:p/>
+          <w:p>
+            <w:r>
+              <w:t>Gesture recognition accuracy, gesture stability, response time (latency), successful action trigger rate, user experience observations.</w:t>
+            </w:r>
+          </w:p>
         </w:tc>
       </w:tr>
       <w:tr>
@@ -4722,7 +4816,19 @@
           <w:tcPr>
             <w:tcW w:w="4320" w:type="dxa"/>
           </w:tcPr>
-          <w:p/>
+          <w:p>
+            <w:r>
+              <w:t xml:space="preserve">Open Hand confused with Four Fingers, unstable gesture switching, false gesture detection during movement, slow response when running inside </w:t>
+            </w:r>
+            <w:proofErr w:type="spellStart"/>
+            <w:r>
+              <w:t>Streamlit</w:t>
+            </w:r>
+            <w:proofErr w:type="spellEnd"/>
+            <w:r>
+              <w:t>.</w:t>
+            </w:r>
+          </w:p>
         </w:tc>
       </w:tr>
       <w:tr>
@@ -4740,7 +4846,11 @@
           <w:tcPr>
             <w:tcW w:w="4320" w:type="dxa"/>
           </w:tcPr>
-          <w:p/>
+          <w:p>
+            <w:r>
+              <w:t>Added gesture smoothing (history buffer), cooldown timer, removed ambiguous gestures, improved gesture validation logic, separated Smart Mirror from Admin Panel.</w:t>
+            </w:r>
+          </w:p>
         </w:tc>
       </w:tr>
     </w:tbl>
@@ -4750,13 +4860,39 @@
       </w:r>
     </w:p>
     <w:p>
-      <w:r>
-        <w:t xml:space="preserve">• </w:t>
-      </w:r>
-    </w:p>
-    <w:p>
-      <w:r>
-        <w:t xml:space="preserve">• </w:t>
+      <w:pPr>
+        <w:pStyle w:val="ListParagraph"/>
+        <w:numPr>
+          <w:ilvl w:val="0"/>
+          <w:numId w:val="17"/>
+        </w:numPr>
+        <w:rPr>
+          <w:lang w:val="en-US"/>
+        </w:rPr>
+      </w:pPr>
+      <w:r>
+        <w:rPr>
+          <w:lang w:val="en-US"/>
+        </w:rPr>
+        <w:t>Implemented gesture smoothing and stabilization to reduce false detections and improve user experience.</w:t>
+      </w:r>
+    </w:p>
+    <w:p>
+      <w:pPr>
+        <w:pStyle w:val="ListParagraph"/>
+        <w:numPr>
+          <w:ilvl w:val="0"/>
+          <w:numId w:val="17"/>
+        </w:numPr>
+        <w:rPr>
+          <w:lang w:val="en-US"/>
+        </w:rPr>
+      </w:pPr>
+      <w:r>
+        <w:rPr>
+          <w:lang w:val="en-US"/>
+        </w:rPr>
+        <w:t>Split the system into two components (Admin Panel and Smart Mirror Engine) to improve performance and reduce camera latency.</w:t>
       </w:r>
     </w:p>
     <w:p>
@@ -4765,8 +4901,39 @@
       </w:r>
     </w:p>
     <w:p>
-      <w:r>
-        <w:t xml:space="preserve">• </w:t>
+      <w:pPr>
+        <w:pStyle w:val="ListParagraph"/>
+        <w:numPr>
+          <w:ilvl w:val="0"/>
+          <w:numId w:val="19"/>
+        </w:numPr>
+        <w:rPr>
+          <w:lang w:val="en-US"/>
+        </w:rPr>
+      </w:pPr>
+      <w:r>
+        <w:rPr>
+          <w:lang w:val="en-US"/>
+        </w:rPr>
+        <w:t>Complex gestures such as Thumbs Up and Thumbs Down still require a more advanced recognition approach.</w:t>
+      </w:r>
+    </w:p>
+    <w:p>
+      <w:pPr>
+        <w:pStyle w:val="ListParagraph"/>
+        <w:numPr>
+          <w:ilvl w:val="0"/>
+          <w:numId w:val="19"/>
+        </w:numPr>
+        <w:rPr>
+          <w:lang w:val="en-US"/>
+        </w:rPr>
+      </w:pPr>
+      <w:r>
+        <w:rPr>
+          <w:lang w:val="en-US"/>
+        </w:rPr>
+        <w:t>Future work includes training a custom gesture classification model to improve recognition accuracy and support additional gestures.</w:t>
       </w:r>
     </w:p>
     <w:p>
@@ -4776,10 +4943,585 @@
     </w:p>
     <w:p>
       <w:pPr>
+        <w:rPr>
+          <w:rFonts w:asciiTheme="majorBidi" w:hAnsiTheme="majorBidi" w:cstheme="majorBidi"/>
+          <w:b/>
+          <w:bCs/>
+          <w:sz w:val="32"/>
+          <w:szCs w:val="32"/>
+        </w:rPr>
+      </w:pPr>
+    </w:p>
+    <w:p>
+      <w:pPr>
+        <w:rPr>
+          <w:rFonts w:asciiTheme="majorBidi" w:hAnsiTheme="majorBidi" w:cstheme="majorBidi"/>
+          <w:b/>
+          <w:bCs/>
+          <w:sz w:val="32"/>
+          <w:szCs w:val="32"/>
+          <w:lang w:val="en-US"/>
+        </w:rPr>
+      </w:pPr>
+      <w:r>
+        <w:rPr>
+          <w:rFonts w:asciiTheme="majorBidi" w:hAnsiTheme="majorBidi" w:cstheme="majorBidi"/>
+          <w:b/>
+          <w:bCs/>
+          <w:sz w:val="32"/>
+          <w:szCs w:val="32"/>
+          <w:lang w:val="en-US"/>
+        </w:rPr>
+        <w:t>Day 4 Progress Report</w:t>
+      </w:r>
+    </w:p>
+    <w:p>
+      <w:pPr>
+        <w:rPr>
+          <w:rFonts w:asciiTheme="majorBidi" w:hAnsiTheme="majorBidi" w:cstheme="majorBidi"/>
+          <w:b/>
+          <w:bCs/>
+          <w:sz w:val="24"/>
+          <w:szCs w:val="24"/>
+          <w:lang w:val="en-US"/>
+        </w:rPr>
+      </w:pPr>
+      <w:r>
+        <w:rPr>
+          <w:rFonts w:asciiTheme="majorBidi" w:hAnsiTheme="majorBidi" w:cstheme="majorBidi"/>
+          <w:b/>
+          <w:bCs/>
+          <w:sz w:val="24"/>
+          <w:szCs w:val="24"/>
+          <w:lang w:val="en-US"/>
+        </w:rPr>
+        <w:t>Project Overview</w:t>
+      </w:r>
+    </w:p>
+    <w:p>
+      <w:pPr>
+        <w:rPr>
+          <w:rFonts w:asciiTheme="majorBidi" w:hAnsiTheme="majorBidi" w:cstheme="majorBidi"/>
+          <w:sz w:val="24"/>
+          <w:szCs w:val="24"/>
+          <w:lang w:val="en-US"/>
+        </w:rPr>
+      </w:pPr>
+      <w:r>
+        <w:rPr>
+          <w:rFonts w:asciiTheme="majorBidi" w:hAnsiTheme="majorBidi" w:cstheme="majorBidi"/>
+          <w:sz w:val="24"/>
+          <w:szCs w:val="24"/>
+          <w:lang w:val="en-US"/>
+        </w:rPr>
+        <w:t>Gesture AI Studios is an AI-powered interactive platform that allows administrators to create customized gesture-based experiences using computer vision and hand gesture recognition. Users interact with a camera-enabled display using hand gestures, while administrators configure actions such as displaying messages, animations, and visual effects through a web-based control panel.</w:t>
+      </w:r>
+    </w:p>
+    <w:p>
+      <w:pPr>
+        <w:rPr>
+          <w:rFonts w:asciiTheme="majorBidi" w:hAnsiTheme="majorBidi" w:cstheme="majorBidi"/>
+          <w:b/>
+          <w:bCs/>
+          <w:sz w:val="24"/>
+          <w:szCs w:val="24"/>
+          <w:lang w:val="en-US"/>
+        </w:rPr>
+      </w:pPr>
+      <w:r>
+        <w:rPr>
+          <w:rFonts w:asciiTheme="majorBidi" w:hAnsiTheme="majorBidi" w:cstheme="majorBidi"/>
+          <w:b/>
+          <w:bCs/>
+          <w:sz w:val="24"/>
+          <w:szCs w:val="24"/>
+          <w:lang w:val="en-US"/>
+        </w:rPr>
+        <w:t>Technology Stack</w:t>
+      </w:r>
+    </w:p>
+    <w:p>
+      <w:pPr>
+        <w:numPr>
+          <w:ilvl w:val="0"/>
+          <w:numId w:val="20"/>
+        </w:numPr>
+        <w:rPr>
+          <w:rFonts w:asciiTheme="majorBidi" w:hAnsiTheme="majorBidi" w:cstheme="majorBidi"/>
+          <w:sz w:val="24"/>
+          <w:szCs w:val="24"/>
+          <w:lang w:val="en-US"/>
+        </w:rPr>
+      </w:pPr>
+      <w:r>
+        <w:rPr>
+          <w:rFonts w:asciiTheme="majorBidi" w:hAnsiTheme="majorBidi" w:cstheme="majorBidi"/>
+          <w:sz w:val="24"/>
+          <w:szCs w:val="24"/>
+          <w:lang w:val="en-US"/>
+        </w:rPr>
+        <w:t>Python</w:t>
+      </w:r>
+    </w:p>
+    <w:p>
+      <w:pPr>
+        <w:numPr>
+          <w:ilvl w:val="0"/>
+          <w:numId w:val="20"/>
+        </w:numPr>
+        <w:rPr>
+          <w:rFonts w:asciiTheme="majorBidi" w:hAnsiTheme="majorBidi" w:cstheme="majorBidi"/>
+          <w:sz w:val="24"/>
+          <w:szCs w:val="24"/>
+          <w:lang w:val="en-US"/>
+        </w:rPr>
+      </w:pPr>
+      <w:r>
+        <w:rPr>
+          <w:rFonts w:asciiTheme="majorBidi" w:hAnsiTheme="majorBidi" w:cstheme="majorBidi"/>
+          <w:sz w:val="24"/>
+          <w:szCs w:val="24"/>
+          <w:lang w:val="en-US"/>
+        </w:rPr>
+        <w:t>OpenCV</w:t>
+      </w:r>
+    </w:p>
+    <w:p>
+      <w:pPr>
+        <w:numPr>
+          <w:ilvl w:val="0"/>
+          <w:numId w:val="20"/>
+        </w:numPr>
+        <w:rPr>
+          <w:rFonts w:asciiTheme="majorBidi" w:hAnsiTheme="majorBidi" w:cstheme="majorBidi"/>
+          <w:sz w:val="24"/>
+          <w:szCs w:val="24"/>
+          <w:lang w:val="en-US"/>
+        </w:rPr>
+      </w:pPr>
+      <w:proofErr w:type="spellStart"/>
+      <w:r>
+        <w:rPr>
+          <w:rFonts w:asciiTheme="majorBidi" w:hAnsiTheme="majorBidi" w:cstheme="majorBidi"/>
+          <w:sz w:val="24"/>
+          <w:szCs w:val="24"/>
+          <w:lang w:val="en-US"/>
+        </w:rPr>
+        <w:t>MediaPipe</w:t>
+      </w:r>
+      <w:proofErr w:type="spellEnd"/>
+      <w:r>
+        <w:rPr>
+          <w:rFonts w:asciiTheme="majorBidi" w:hAnsiTheme="majorBidi" w:cstheme="majorBidi"/>
+          <w:sz w:val="24"/>
+          <w:szCs w:val="24"/>
+          <w:lang w:val="en-US"/>
+        </w:rPr>
+        <w:t xml:space="preserve"> Hand </w:t>
+      </w:r>
+      <w:proofErr w:type="spellStart"/>
+      <w:r>
+        <w:rPr>
+          <w:rFonts w:asciiTheme="majorBidi" w:hAnsiTheme="majorBidi" w:cstheme="majorBidi"/>
+          <w:sz w:val="24"/>
+          <w:szCs w:val="24"/>
+          <w:lang w:val="en-US"/>
+        </w:rPr>
+        <w:t>Landmarker</w:t>
+      </w:r>
+      <w:proofErr w:type="spellEnd"/>
+    </w:p>
+    <w:p>
+      <w:pPr>
+        <w:numPr>
+          <w:ilvl w:val="0"/>
+          <w:numId w:val="20"/>
+        </w:numPr>
+        <w:rPr>
+          <w:rFonts w:asciiTheme="majorBidi" w:hAnsiTheme="majorBidi" w:cstheme="majorBidi"/>
+          <w:sz w:val="24"/>
+          <w:szCs w:val="24"/>
+          <w:lang w:val="en-US"/>
+        </w:rPr>
+      </w:pPr>
+      <w:proofErr w:type="spellStart"/>
+      <w:r>
+        <w:rPr>
+          <w:rFonts w:asciiTheme="majorBidi" w:hAnsiTheme="majorBidi" w:cstheme="majorBidi"/>
+          <w:sz w:val="24"/>
+          <w:szCs w:val="24"/>
+          <w:lang w:val="en-US"/>
+        </w:rPr>
+        <w:t>Streamlit</w:t>
+      </w:r>
+      <w:proofErr w:type="spellEnd"/>
+    </w:p>
+    <w:p>
+      <w:pPr>
+        <w:numPr>
+          <w:ilvl w:val="0"/>
+          <w:numId w:val="20"/>
+        </w:numPr>
+        <w:rPr>
+          <w:rFonts w:asciiTheme="majorBidi" w:hAnsiTheme="majorBidi" w:cstheme="majorBidi"/>
+          <w:sz w:val="24"/>
+          <w:szCs w:val="24"/>
+          <w:lang w:val="en-US"/>
+        </w:rPr>
+      </w:pPr>
+      <w:r>
+        <w:rPr>
+          <w:rFonts w:asciiTheme="majorBidi" w:hAnsiTheme="majorBidi" w:cstheme="majorBidi"/>
+          <w:sz w:val="24"/>
+          <w:szCs w:val="24"/>
+          <w:lang w:val="en-US"/>
+        </w:rPr>
+        <w:t>JSON Configuration Storage</w:t>
+      </w:r>
+    </w:p>
+    <w:p>
+      <w:pPr>
+        <w:numPr>
+          <w:ilvl w:val="0"/>
+          <w:numId w:val="20"/>
+        </w:numPr>
+        <w:rPr>
+          <w:rFonts w:asciiTheme="majorBidi" w:hAnsiTheme="majorBidi" w:cstheme="majorBidi"/>
+          <w:sz w:val="24"/>
+          <w:szCs w:val="24"/>
+          <w:lang w:val="en-US"/>
+        </w:rPr>
+      </w:pPr>
+      <w:r>
+        <w:rPr>
+          <w:rFonts w:asciiTheme="majorBidi" w:hAnsiTheme="majorBidi" w:cstheme="majorBidi"/>
+          <w:sz w:val="24"/>
+          <w:szCs w:val="24"/>
+          <w:lang w:val="en-US"/>
+        </w:rPr>
+        <w:t>GitHub Version Control</w:t>
+      </w:r>
+    </w:p>
+    <w:p>
+      <w:pPr>
+        <w:rPr>
+          <w:rFonts w:asciiTheme="majorBidi" w:hAnsiTheme="majorBidi" w:cstheme="majorBidi"/>
+          <w:b/>
+          <w:bCs/>
+          <w:sz w:val="24"/>
+          <w:szCs w:val="24"/>
+          <w:lang w:val="en-US"/>
+        </w:rPr>
+      </w:pPr>
+      <w:r>
+        <w:rPr>
+          <w:rFonts w:asciiTheme="majorBidi" w:hAnsiTheme="majorBidi" w:cstheme="majorBidi"/>
+          <w:b/>
+          <w:bCs/>
+          <w:sz w:val="24"/>
+          <w:szCs w:val="24"/>
+          <w:lang w:val="en-US"/>
+        </w:rPr>
+        <w:t>Testing and Evaluation</w:t>
+      </w:r>
+    </w:p>
+    <w:p>
+      <w:pPr>
+        <w:rPr>
+          <w:rFonts w:asciiTheme="majorBidi" w:hAnsiTheme="majorBidi" w:cstheme="majorBidi"/>
+          <w:sz w:val="24"/>
+          <w:szCs w:val="24"/>
+          <w:lang w:val="en-US"/>
+        </w:rPr>
+      </w:pPr>
+      <w:r>
+        <w:rPr>
+          <w:rFonts w:asciiTheme="majorBidi" w:hAnsiTheme="majorBidi" w:cstheme="majorBidi"/>
+          <w:sz w:val="24"/>
+          <w:szCs w:val="24"/>
+          <w:lang w:val="en-US"/>
+        </w:rPr>
+        <w:t>Testing was performed using a live webcam feed and multiple gesture scenarios. The evaluation focused on gesture recognition accuracy, response time, stability of detection, and successful action execution.</w:t>
+      </w:r>
+    </w:p>
+    <w:p>
+      <w:pPr>
+        <w:rPr>
+          <w:rFonts w:asciiTheme="majorBidi" w:hAnsiTheme="majorBidi" w:cstheme="majorBidi"/>
+          <w:sz w:val="24"/>
+          <w:szCs w:val="24"/>
+          <w:lang w:val="en-US"/>
+        </w:rPr>
+      </w:pPr>
+      <w:r>
+        <w:rPr>
+          <w:rFonts w:asciiTheme="majorBidi" w:hAnsiTheme="majorBidi" w:cstheme="majorBidi"/>
+          <w:sz w:val="24"/>
+          <w:szCs w:val="24"/>
+          <w:lang w:val="en-US"/>
+        </w:rPr>
+        <w:t>Several test cases were created for Open Hand, Closed Fist, One Finger, Peace Sign, Three Fingers, Index and Pinky, and Rock Sign gestures. Each gesture was tested under different lighting conditions and hand positions.</w:t>
+      </w:r>
+    </w:p>
+    <w:p>
+      <w:pPr>
+        <w:rPr>
+          <w:rFonts w:asciiTheme="majorBidi" w:hAnsiTheme="majorBidi" w:cstheme="majorBidi"/>
+          <w:b/>
+          <w:bCs/>
+          <w:sz w:val="24"/>
+          <w:szCs w:val="24"/>
+          <w:lang w:val="en-US"/>
+        </w:rPr>
+      </w:pPr>
+      <w:r>
+        <w:rPr>
+          <w:rFonts w:asciiTheme="majorBidi" w:hAnsiTheme="majorBidi" w:cstheme="majorBidi"/>
+          <w:b/>
+          <w:bCs/>
+          <w:sz w:val="24"/>
+          <w:szCs w:val="24"/>
+          <w:lang w:val="en-US"/>
+        </w:rPr>
+        <w:t>Challenges Identified</w:t>
+      </w:r>
+    </w:p>
+    <w:p>
+      <w:pPr>
+        <w:rPr>
+          <w:rFonts w:asciiTheme="majorBidi" w:hAnsiTheme="majorBidi" w:cstheme="majorBidi"/>
+          <w:sz w:val="24"/>
+          <w:szCs w:val="24"/>
+          <w:lang w:val="en-US"/>
+        </w:rPr>
+      </w:pPr>
+      <w:r>
+        <w:rPr>
+          <w:rFonts w:asciiTheme="majorBidi" w:hAnsiTheme="majorBidi" w:cstheme="majorBidi"/>
+          <w:sz w:val="24"/>
+          <w:szCs w:val="24"/>
+          <w:lang w:val="en-US"/>
+        </w:rPr>
+        <w:t>The primary challenge encountered was gesture instability. Certain gestures, particularly Open Hand and Four Fingers, produced similar landmark patterns and were frequently misclassified. Thumbs Up and Thumbs Down gestures also demonstrated inconsistent detection due to the simple rule-based classification approach.</w:t>
+      </w:r>
+    </w:p>
+    <w:p>
+      <w:pPr>
+        <w:rPr>
+          <w:rFonts w:asciiTheme="majorBidi" w:hAnsiTheme="majorBidi" w:cstheme="majorBidi"/>
+          <w:sz w:val="24"/>
+          <w:szCs w:val="24"/>
+          <w:lang w:val="en-US"/>
+        </w:rPr>
+      </w:pPr>
+      <w:r>
+        <w:rPr>
+          <w:rFonts w:asciiTheme="majorBidi" w:hAnsiTheme="majorBidi" w:cstheme="majorBidi"/>
+          <w:sz w:val="24"/>
+          <w:szCs w:val="24"/>
+          <w:lang w:val="en-US"/>
+        </w:rPr>
+        <w:t xml:space="preserve">Another challenge was performance. Running the camera processing directly within </w:t>
+      </w:r>
+      <w:proofErr w:type="spellStart"/>
+      <w:r>
+        <w:rPr>
+          <w:rFonts w:asciiTheme="majorBidi" w:hAnsiTheme="majorBidi" w:cstheme="majorBidi"/>
+          <w:sz w:val="24"/>
+          <w:szCs w:val="24"/>
+          <w:lang w:val="en-US"/>
+        </w:rPr>
+        <w:t>Streamlit</w:t>
+      </w:r>
+      <w:proofErr w:type="spellEnd"/>
+      <w:r>
+        <w:rPr>
+          <w:rFonts w:asciiTheme="majorBidi" w:hAnsiTheme="majorBidi" w:cstheme="majorBidi"/>
+          <w:sz w:val="24"/>
+          <w:szCs w:val="24"/>
+          <w:lang w:val="en-US"/>
+        </w:rPr>
+        <w:t xml:space="preserve"> introduced noticeable latency and reduced the responsiveness of the application.</w:t>
+      </w:r>
+    </w:p>
+    <w:p>
+      <w:pPr>
+        <w:rPr>
+          <w:rFonts w:asciiTheme="majorBidi" w:hAnsiTheme="majorBidi" w:cstheme="majorBidi"/>
+          <w:b/>
+          <w:bCs/>
+          <w:sz w:val="24"/>
+          <w:szCs w:val="24"/>
+          <w:lang w:val="en-US"/>
+        </w:rPr>
+      </w:pPr>
+      <w:r>
+        <w:rPr>
+          <w:rFonts w:asciiTheme="majorBidi" w:hAnsiTheme="majorBidi" w:cstheme="majorBidi"/>
+          <w:b/>
+          <w:bCs/>
+          <w:sz w:val="24"/>
+          <w:szCs w:val="24"/>
+          <w:lang w:val="en-US"/>
+        </w:rPr>
+        <w:lastRenderedPageBreak/>
+        <w:t>Improvements Implemented</w:t>
+      </w:r>
+    </w:p>
+    <w:p>
+      <w:pPr>
+        <w:rPr>
+          <w:rFonts w:asciiTheme="majorBidi" w:hAnsiTheme="majorBidi" w:cstheme="majorBidi"/>
+          <w:sz w:val="24"/>
+          <w:szCs w:val="24"/>
+          <w:lang w:val="en-US"/>
+        </w:rPr>
+      </w:pPr>
+      <w:r>
+        <w:rPr>
+          <w:rFonts w:asciiTheme="majorBidi" w:hAnsiTheme="majorBidi" w:cstheme="majorBidi"/>
+          <w:sz w:val="24"/>
+          <w:szCs w:val="24"/>
+          <w:lang w:val="en-US"/>
+        </w:rPr>
+        <w:t>To improve reliability, a gesture smoothing system was implemented using a gesture history buffer. A gesture must now be detected consistently across multiple frames before being accepted as valid.</w:t>
+      </w:r>
+    </w:p>
+    <w:p>
+      <w:pPr>
+        <w:rPr>
+          <w:rFonts w:asciiTheme="majorBidi" w:hAnsiTheme="majorBidi" w:cstheme="majorBidi"/>
+          <w:sz w:val="24"/>
+          <w:szCs w:val="24"/>
+          <w:lang w:val="en-US"/>
+        </w:rPr>
+      </w:pPr>
+      <w:r>
+        <w:rPr>
+          <w:rFonts w:asciiTheme="majorBidi" w:hAnsiTheme="majorBidi" w:cstheme="majorBidi"/>
+          <w:sz w:val="24"/>
+          <w:szCs w:val="24"/>
+          <w:lang w:val="en-US"/>
+        </w:rPr>
+        <w:t xml:space="preserve">A cooldown mechanism was also introduced to prevent rapid triggering of actions. Additionally, the application architecture was redesigned by separating the </w:t>
+      </w:r>
+      <w:proofErr w:type="spellStart"/>
+      <w:r>
+        <w:rPr>
+          <w:rFonts w:asciiTheme="majorBidi" w:hAnsiTheme="majorBidi" w:cstheme="majorBidi"/>
+          <w:sz w:val="24"/>
+          <w:szCs w:val="24"/>
+          <w:lang w:val="en-US"/>
+        </w:rPr>
+        <w:t>Streamlit</w:t>
+      </w:r>
+      <w:proofErr w:type="spellEnd"/>
+      <w:r>
+        <w:rPr>
+          <w:rFonts w:asciiTheme="majorBidi" w:hAnsiTheme="majorBidi" w:cstheme="majorBidi"/>
+          <w:sz w:val="24"/>
+          <w:szCs w:val="24"/>
+          <w:lang w:val="en-US"/>
+        </w:rPr>
+        <w:t xml:space="preserve"> administrator interface from the Smart Mirror camera engine. This significantly improved runtime performance and reduced latency.</w:t>
+      </w:r>
+    </w:p>
+    <w:p>
+      <w:pPr>
+        <w:rPr>
+          <w:rFonts w:asciiTheme="majorBidi" w:hAnsiTheme="majorBidi" w:cstheme="majorBidi"/>
+          <w:b/>
+          <w:bCs/>
+          <w:sz w:val="24"/>
+          <w:szCs w:val="24"/>
+          <w:lang w:val="en-US"/>
+        </w:rPr>
+      </w:pPr>
+      <w:r>
+        <w:rPr>
+          <w:rFonts w:asciiTheme="majorBidi" w:hAnsiTheme="majorBidi" w:cstheme="majorBidi"/>
+          <w:b/>
+          <w:bCs/>
+          <w:sz w:val="24"/>
+          <w:szCs w:val="24"/>
+          <w:lang w:val="en-US"/>
+        </w:rPr>
+        <w:t>Current Status</w:t>
+      </w:r>
+    </w:p>
+    <w:p>
+      <w:pPr>
+        <w:rPr>
+          <w:rFonts w:asciiTheme="majorBidi" w:hAnsiTheme="majorBidi" w:cstheme="majorBidi"/>
+          <w:sz w:val="24"/>
+          <w:szCs w:val="24"/>
+          <w:lang w:val="en-US"/>
+        </w:rPr>
+      </w:pPr>
+      <w:r>
+        <w:rPr>
+          <w:rFonts w:asciiTheme="majorBidi" w:hAnsiTheme="majorBidi" w:cstheme="majorBidi"/>
+          <w:sz w:val="24"/>
+          <w:szCs w:val="24"/>
+          <w:lang w:val="en-US"/>
+        </w:rPr>
+        <w:t>The application now supports customizable gestures, configurable messages, color selection, text sizing, animations, menu-based interaction, and Smart Mirror mode. Administrators can configure gesture actions through the web interface and launch the Smart Mirror directly from the application.</w:t>
+      </w:r>
+    </w:p>
+    <w:p>
+      <w:pPr>
+        <w:rPr>
+          <w:rFonts w:asciiTheme="majorBidi" w:hAnsiTheme="majorBidi" w:cstheme="majorBidi"/>
+          <w:b/>
+          <w:bCs/>
+          <w:sz w:val="24"/>
+          <w:szCs w:val="24"/>
+          <w:lang w:val="en-US"/>
+        </w:rPr>
+      </w:pPr>
+      <w:r>
+        <w:rPr>
+          <w:rFonts w:asciiTheme="majorBidi" w:hAnsiTheme="majorBidi" w:cstheme="majorBidi"/>
+          <w:b/>
+          <w:bCs/>
+          <w:sz w:val="24"/>
+          <w:szCs w:val="24"/>
+          <w:lang w:val="en-US"/>
+        </w:rPr>
+        <w:t>Future Work</w:t>
+      </w:r>
+    </w:p>
+    <w:p>
+      <w:pPr>
+        <w:rPr>
+          <w:rFonts w:asciiTheme="majorBidi" w:hAnsiTheme="majorBidi" w:cstheme="majorBidi"/>
+          <w:sz w:val="24"/>
+          <w:szCs w:val="24"/>
+          <w:lang w:val="en-US"/>
+        </w:rPr>
+      </w:pPr>
+      <w:r>
+        <w:rPr>
+          <w:rFonts w:asciiTheme="majorBidi" w:hAnsiTheme="majorBidi" w:cstheme="majorBidi"/>
+          <w:sz w:val="24"/>
+          <w:szCs w:val="24"/>
+          <w:lang w:val="en-US"/>
+        </w:rPr>
+        <w:t>Future development will focus on replacing the rule-based gesture recognition system with a machine learning-based gesture classifier trained on custom gesture datasets. Additional features such as image display, video playback, audio effects, gesture sequences, and advanced interaction workflows will also be implemented.</w:t>
+      </w:r>
+    </w:p>
+    <w:p>
+      <w:pPr>
+        <w:rPr>
+          <w:lang w:val="en-US"/>
+        </w:rPr>
+      </w:pPr>
+    </w:p>
+    <w:p>
+      <w:pPr>
         <w:pStyle w:val="Heading1"/>
       </w:pPr>
       <w:r>
-        <w:lastRenderedPageBreak/>
         <w:t>Day 5 — Integration of Model/API with Interface</w:t>
       </w:r>
     </w:p>
@@ -4969,6 +5711,7 @@
     </w:p>
     <w:p>
       <w:r>
+        <w:lastRenderedPageBreak/>
         <w:t xml:space="preserve">• </w:t>
       </w:r>
     </w:p>
@@ -5026,8 +5769,13 @@
         </w:numPr>
         <w:spacing w:after="0"/>
       </w:pPr>
-      <w:r>
-        <w:t>☐ Secrets handling reviewed (no keys in repo)</w:t>
+      <w:proofErr w:type="gramStart"/>
+      <w:r>
+        <w:t>☐ Secrets handling</w:t>
+      </w:r>
+      <w:proofErr w:type="gramEnd"/>
+      <w:r>
+        <w:t xml:space="preserve"> reviewed (no keys in repo)</w:t>
       </w:r>
     </w:p>
     <w:p>
@@ -6071,6 +6819,119 @@
 <file path=word/numbering.xml><?xml version="1.0" encoding="utf-8"?>
 <w:numbering xmlns:wpc="http://schemas.microsoft.com/office/word/2010/wordprocessingCanvas" xmlns:cx="http://schemas.microsoft.com/office/drawing/2014/chartex" xmlns:cx1="http://schemas.microsoft.com/office/drawing/2015/9/8/chartex" xmlns:cx2="http://schemas.microsoft.com/office/drawing/2015/10/21/chartex" xmlns:cx3="http://schemas.microsoft.com/office/drawing/2016/5/9/chartex" xmlns:cx4="http://schemas.microsoft.com/office/drawing/2016/5/10/chartex" xmlns:cx5="http://schemas.microsoft.com/office/drawing/2016/5/11/chartex" xmlns:cx6="http://schemas.microsoft.com/office/drawing/2016/5/12/chartex" xmlns:cx7="http://schemas.microsoft.com/office/drawing/2016/5/13/chartex" xmlns:cx8="http://schemas.microsoft.com/office/drawing/2016/5/14/chartex" xmlns:mc="http://schemas.openxmlformats.org/markup-compatibility/2006" xmlns:aink="http://schemas.microsoft.com/office/drawing/2016/ink" xmlns:am3d="http://schemas.microsoft.com/office/drawing/2017/model3d" xmlns:o="urn:schemas-microsoft-com:office:office" xmlns:oel="http://schemas.microsoft.com/office/2019/extlst" xmlns:r="http://schemas.openxmlformats.org/officeDocument/2006/relationships" xmlns:m="http://schemas.openxmlformats.org/officeDocument/2006/math" xmlns:v="urn:schemas-microsoft-com:vml" xmlns:wp14="http://schemas.microsoft.com/office/word/2010/wordprocessingDrawing" xmlns:wp="http://schemas.openxmlformats.org/drawingml/2006/wordprocessingDrawing" xmlns:w10="urn:schemas-microsoft-com:office:word" xmlns:w="http://schemas.openxmlformats.org/wordprocessingml/2006/main" xmlns:w14="http://schemas.microsoft.com/office/word/2010/wordml" xmlns:w15="http://schemas.microsoft.com/office/word/2012/wordml" xmlns:w16cex="http://schemas.microsoft.com/office/word/2018/wordml/cex" xmlns:w16cid="http://schemas.microsoft.com/office/word/2016/wordml/cid" xmlns:w16="http://schemas.microsoft.com/office/word/2018/wordml" xmlns:w16du="http://schemas.microsoft.com/office/word/2023/wordml/word16du" xmlns:w16sdtdh="http://schemas.microsoft.com/office/word/2020/wordml/sdtdatahash" xmlns:w16sdtfl="http://schemas.microsoft.com/office/word/2024/wordml/sdtformatlock" xmlns:w16se="http://schemas.microsoft.com/office/word/2015/wordml/symex" xmlns:wpg="http://schemas.microsoft.com/office/word/2010/wordprocessingGroup" xmlns:wpi="http://schemas.microsoft.com/office/word/2010/wordprocessingInk" xmlns:wne="http://schemas.microsoft.com/office/word/2006/wordml" xmlns:wps="http://schemas.microsoft.com/office/word/2010/wordprocessingShape" mc:Ignorable="w14 w15 w16se w16cid w16 w16cex w16sdtdh w16sdtfl w16du wp14">
   <w:abstractNum w:abstractNumId="0" w15:restartNumberingAfterBreak="0">
+    <w:nsid w:val="034F28F7"/>
+    <w:multiLevelType w:val="hybridMultilevel"/>
+    <w:tmpl w:val="B2CE060C"/>
+    <w:lvl w:ilvl="0" w:tplc="04090001">
+      <w:start w:val="1"/>
+      <w:numFmt w:val="bullet"/>
+      <w:lvlText w:val=""/>
+      <w:lvlJc w:val="left"/>
+      <w:pPr>
+        <w:ind w:left="720" w:hanging="360"/>
+      </w:pPr>
+      <w:rPr>
+        <w:rFonts w:ascii="Symbol" w:hAnsi="Symbol" w:hint="default"/>
+      </w:rPr>
+    </w:lvl>
+    <w:lvl w:ilvl="1" w:tplc="04090003" w:tentative="1">
+      <w:start w:val="1"/>
+      <w:numFmt w:val="bullet"/>
+      <w:lvlText w:val="o"/>
+      <w:lvlJc w:val="left"/>
+      <w:pPr>
+        <w:ind w:left="1440" w:hanging="360"/>
+      </w:pPr>
+      <w:rPr>
+        <w:rFonts w:ascii="Courier New" w:hAnsi="Courier New" w:cs="Courier New" w:hint="default"/>
+      </w:rPr>
+    </w:lvl>
+    <w:lvl w:ilvl="2" w:tplc="04090005" w:tentative="1">
+      <w:start w:val="1"/>
+      <w:numFmt w:val="bullet"/>
+      <w:lvlText w:val=""/>
+      <w:lvlJc w:val="left"/>
+      <w:pPr>
+        <w:ind w:left="2160" w:hanging="360"/>
+      </w:pPr>
+      <w:rPr>
+        <w:rFonts w:ascii="Wingdings" w:hAnsi="Wingdings" w:hint="default"/>
+      </w:rPr>
+    </w:lvl>
+    <w:lvl w:ilvl="3" w:tplc="04090001" w:tentative="1">
+      <w:start w:val="1"/>
+      <w:numFmt w:val="bullet"/>
+      <w:lvlText w:val=""/>
+      <w:lvlJc w:val="left"/>
+      <w:pPr>
+        <w:ind w:left="2880" w:hanging="360"/>
+      </w:pPr>
+      <w:rPr>
+        <w:rFonts w:ascii="Symbol" w:hAnsi="Symbol" w:hint="default"/>
+      </w:rPr>
+    </w:lvl>
+    <w:lvl w:ilvl="4" w:tplc="04090003" w:tentative="1">
+      <w:start w:val="1"/>
+      <w:numFmt w:val="bullet"/>
+      <w:lvlText w:val="o"/>
+      <w:lvlJc w:val="left"/>
+      <w:pPr>
+        <w:ind w:left="3600" w:hanging="360"/>
+      </w:pPr>
+      <w:rPr>
+        <w:rFonts w:ascii="Courier New" w:hAnsi="Courier New" w:cs="Courier New" w:hint="default"/>
+      </w:rPr>
+    </w:lvl>
+    <w:lvl w:ilvl="5" w:tplc="04090005" w:tentative="1">
+      <w:start w:val="1"/>
+      <w:numFmt w:val="bullet"/>
+      <w:lvlText w:val=""/>
+      <w:lvlJc w:val="left"/>
+      <w:pPr>
+        <w:ind w:left="4320" w:hanging="360"/>
+      </w:pPr>
+      <w:rPr>
+        <w:rFonts w:ascii="Wingdings" w:hAnsi="Wingdings" w:hint="default"/>
+      </w:rPr>
+    </w:lvl>
+    <w:lvl w:ilvl="6" w:tplc="04090001" w:tentative="1">
+      <w:start w:val="1"/>
+      <w:numFmt w:val="bullet"/>
+      <w:lvlText w:val=""/>
+      <w:lvlJc w:val="left"/>
+      <w:pPr>
+        <w:ind w:left="5040" w:hanging="360"/>
+      </w:pPr>
+      <w:rPr>
+        <w:rFonts w:ascii="Symbol" w:hAnsi="Symbol" w:hint="default"/>
+      </w:rPr>
+    </w:lvl>
+    <w:lvl w:ilvl="7" w:tplc="04090003" w:tentative="1">
+      <w:start w:val="1"/>
+      <w:numFmt w:val="bullet"/>
+      <w:lvlText w:val="o"/>
+      <w:lvlJc w:val="left"/>
+      <w:pPr>
+        <w:ind w:left="5760" w:hanging="360"/>
+      </w:pPr>
+      <w:rPr>
+        <w:rFonts w:ascii="Courier New" w:hAnsi="Courier New" w:cs="Courier New" w:hint="default"/>
+      </w:rPr>
+    </w:lvl>
+    <w:lvl w:ilvl="8" w:tplc="04090005" w:tentative="1">
+      <w:start w:val="1"/>
+      <w:numFmt w:val="bullet"/>
+      <w:lvlText w:val=""/>
+      <w:lvlJc w:val="left"/>
+      <w:pPr>
+        <w:ind w:left="6480" w:hanging="360"/>
+      </w:pPr>
+      <w:rPr>
+        <w:rFonts w:ascii="Wingdings" w:hAnsi="Wingdings" w:hint="default"/>
+      </w:rPr>
+    </w:lvl>
+  </w:abstractNum>
+  <w:abstractNum w:abstractNumId="1" w15:restartNumberingAfterBreak="0">
     <w:nsid w:val="082946DC"/>
     <w:multiLevelType w:val="hybridMultilevel"/>
     <w:tmpl w:val="DC6826DC"/>
@@ -6183,7 +7044,7 @@
       </w:rPr>
     </w:lvl>
   </w:abstractNum>
-  <w:abstractNum w:abstractNumId="1" w15:restartNumberingAfterBreak="0">
+  <w:abstractNum w:abstractNumId="2" w15:restartNumberingAfterBreak="0">
     <w:nsid w:val="09A64D50"/>
     <w:multiLevelType w:val="hybridMultilevel"/>
     <w:tmpl w:val="9694115A"/>
@@ -6296,7 +7157,7 @@
       </w:rPr>
     </w:lvl>
   </w:abstractNum>
-  <w:abstractNum w:abstractNumId="2" w15:restartNumberingAfterBreak="0">
+  <w:abstractNum w:abstractNumId="3" w15:restartNumberingAfterBreak="0">
     <w:nsid w:val="0FDB0959"/>
     <w:multiLevelType w:val="multilevel"/>
     <w:tmpl w:val="B4362476"/>
@@ -6409,7 +7270,120 @@
       </w:rPr>
     </w:lvl>
   </w:abstractNum>
-  <w:abstractNum w:abstractNumId="3" w15:restartNumberingAfterBreak="0">
+  <w:abstractNum w:abstractNumId="4" w15:restartNumberingAfterBreak="0">
+    <w:nsid w:val="155F187D"/>
+    <w:multiLevelType w:val="hybridMultilevel"/>
+    <w:tmpl w:val="4266A608"/>
+    <w:lvl w:ilvl="0" w:tplc="04090001">
+      <w:start w:val="1"/>
+      <w:numFmt w:val="bullet"/>
+      <w:lvlText w:val=""/>
+      <w:lvlJc w:val="left"/>
+      <w:pPr>
+        <w:ind w:left="720" w:hanging="360"/>
+      </w:pPr>
+      <w:rPr>
+        <w:rFonts w:ascii="Symbol" w:hAnsi="Symbol" w:hint="default"/>
+      </w:rPr>
+    </w:lvl>
+    <w:lvl w:ilvl="1" w:tplc="04090003" w:tentative="1">
+      <w:start w:val="1"/>
+      <w:numFmt w:val="bullet"/>
+      <w:lvlText w:val="o"/>
+      <w:lvlJc w:val="left"/>
+      <w:pPr>
+        <w:ind w:left="1440" w:hanging="360"/>
+      </w:pPr>
+      <w:rPr>
+        <w:rFonts w:ascii="Courier New" w:hAnsi="Courier New" w:cs="Courier New" w:hint="default"/>
+      </w:rPr>
+    </w:lvl>
+    <w:lvl w:ilvl="2" w:tplc="04090005" w:tentative="1">
+      <w:start w:val="1"/>
+      <w:numFmt w:val="bullet"/>
+      <w:lvlText w:val=""/>
+      <w:lvlJc w:val="left"/>
+      <w:pPr>
+        <w:ind w:left="2160" w:hanging="360"/>
+      </w:pPr>
+      <w:rPr>
+        <w:rFonts w:ascii="Wingdings" w:hAnsi="Wingdings" w:hint="default"/>
+      </w:rPr>
+    </w:lvl>
+    <w:lvl w:ilvl="3" w:tplc="04090001" w:tentative="1">
+      <w:start w:val="1"/>
+      <w:numFmt w:val="bullet"/>
+      <w:lvlText w:val=""/>
+      <w:lvlJc w:val="left"/>
+      <w:pPr>
+        <w:ind w:left="2880" w:hanging="360"/>
+      </w:pPr>
+      <w:rPr>
+        <w:rFonts w:ascii="Symbol" w:hAnsi="Symbol" w:hint="default"/>
+      </w:rPr>
+    </w:lvl>
+    <w:lvl w:ilvl="4" w:tplc="04090003" w:tentative="1">
+      <w:start w:val="1"/>
+      <w:numFmt w:val="bullet"/>
+      <w:lvlText w:val="o"/>
+      <w:lvlJc w:val="left"/>
+      <w:pPr>
+        <w:ind w:left="3600" w:hanging="360"/>
+      </w:pPr>
+      <w:rPr>
+        <w:rFonts w:ascii="Courier New" w:hAnsi="Courier New" w:cs="Courier New" w:hint="default"/>
+      </w:rPr>
+    </w:lvl>
+    <w:lvl w:ilvl="5" w:tplc="04090005" w:tentative="1">
+      <w:start w:val="1"/>
+      <w:numFmt w:val="bullet"/>
+      <w:lvlText w:val=""/>
+      <w:lvlJc w:val="left"/>
+      <w:pPr>
+        <w:ind w:left="4320" w:hanging="360"/>
+      </w:pPr>
+      <w:rPr>
+        <w:rFonts w:ascii="Wingdings" w:hAnsi="Wingdings" w:hint="default"/>
+      </w:rPr>
+    </w:lvl>
+    <w:lvl w:ilvl="6" w:tplc="04090001" w:tentative="1">
+      <w:start w:val="1"/>
+      <w:numFmt w:val="bullet"/>
+      <w:lvlText w:val=""/>
+      <w:lvlJc w:val="left"/>
+      <w:pPr>
+        <w:ind w:left="5040" w:hanging="360"/>
+      </w:pPr>
+      <w:rPr>
+        <w:rFonts w:ascii="Symbol" w:hAnsi="Symbol" w:hint="default"/>
+      </w:rPr>
+    </w:lvl>
+    <w:lvl w:ilvl="7" w:tplc="04090003" w:tentative="1">
+      <w:start w:val="1"/>
+      <w:numFmt w:val="bullet"/>
+      <w:lvlText w:val="o"/>
+      <w:lvlJc w:val="left"/>
+      <w:pPr>
+        <w:ind w:left="5760" w:hanging="360"/>
+      </w:pPr>
+      <w:rPr>
+        <w:rFonts w:ascii="Courier New" w:hAnsi="Courier New" w:cs="Courier New" w:hint="default"/>
+      </w:rPr>
+    </w:lvl>
+    <w:lvl w:ilvl="8" w:tplc="04090005" w:tentative="1">
+      <w:start w:val="1"/>
+      <w:numFmt w:val="bullet"/>
+      <w:lvlText w:val=""/>
+      <w:lvlJc w:val="left"/>
+      <w:pPr>
+        <w:ind w:left="6480" w:hanging="360"/>
+      </w:pPr>
+      <w:rPr>
+        <w:rFonts w:ascii="Wingdings" w:hAnsi="Wingdings" w:hint="default"/>
+      </w:rPr>
+    </w:lvl>
+  </w:abstractNum>
+  <w:abstractNum w:abstractNumId="5" w15:restartNumberingAfterBreak="0">
     <w:nsid w:val="15935AC0"/>
     <w:multiLevelType w:val="multilevel"/>
     <w:tmpl w:val="89B68FD4"/>
@@ -6522,7 +7496,7 @@
       </w:rPr>
     </w:lvl>
   </w:abstractNum>
-  <w:abstractNum w:abstractNumId="4" w15:restartNumberingAfterBreak="0">
+  <w:abstractNum w:abstractNumId="6" w15:restartNumberingAfterBreak="0">
     <w:nsid w:val="15B921A5"/>
     <w:multiLevelType w:val="multilevel"/>
     <w:tmpl w:val="E9D65116"/>
@@ -6635,7 +7609,7 @@
       </w:rPr>
     </w:lvl>
   </w:abstractNum>
-  <w:abstractNum w:abstractNumId="5" w15:restartNumberingAfterBreak="0">
+  <w:abstractNum w:abstractNumId="7" w15:restartNumberingAfterBreak="0">
     <w:nsid w:val="1CBC1F86"/>
     <w:multiLevelType w:val="multilevel"/>
     <w:tmpl w:val="18B65EB6"/>
@@ -6748,7 +7722,119 @@
       </w:rPr>
     </w:lvl>
   </w:abstractNum>
-  <w:abstractNum w:abstractNumId="6" w15:restartNumberingAfterBreak="0">
+  <w:abstractNum w:abstractNumId="8" w15:restartNumberingAfterBreak="0">
+    <w:nsid w:val="1FB35F6E"/>
+    <w:multiLevelType w:val="hybridMultilevel"/>
+    <w:tmpl w:val="6CD00770"/>
+    <w:lvl w:ilvl="0" w:tplc="E12AACDE">
+      <w:numFmt w:val="bullet"/>
+      <w:lvlText w:val="•"/>
+      <w:lvlJc w:val="left"/>
+      <w:pPr>
+        <w:ind w:left="720" w:hanging="360"/>
+      </w:pPr>
+      <w:rPr>
+        <w:rFonts w:ascii="Cambria" w:eastAsia="Cambria" w:hAnsi="Cambria" w:cs="Cambria" w:hint="default"/>
+      </w:rPr>
+    </w:lvl>
+    <w:lvl w:ilvl="1" w:tplc="04090003" w:tentative="1">
+      <w:start w:val="1"/>
+      <w:numFmt w:val="bullet"/>
+      <w:lvlText w:val="o"/>
+      <w:lvlJc w:val="left"/>
+      <w:pPr>
+        <w:ind w:left="1440" w:hanging="360"/>
+      </w:pPr>
+      <w:rPr>
+        <w:rFonts w:ascii="Courier New" w:hAnsi="Courier New" w:cs="Courier New" w:hint="default"/>
+      </w:rPr>
+    </w:lvl>
+    <w:lvl w:ilvl="2" w:tplc="04090005" w:tentative="1">
+      <w:start w:val="1"/>
+      <w:numFmt w:val="bullet"/>
+      <w:lvlText w:val=""/>
+      <w:lvlJc w:val="left"/>
+      <w:pPr>
+        <w:ind w:left="2160" w:hanging="360"/>
+      </w:pPr>
+      <w:rPr>
+        <w:rFonts w:ascii="Wingdings" w:hAnsi="Wingdings" w:hint="default"/>
+      </w:rPr>
+    </w:lvl>
+    <w:lvl w:ilvl="3" w:tplc="04090001" w:tentative="1">
+      <w:start w:val="1"/>
+      <w:numFmt w:val="bullet"/>
+      <w:lvlText w:val=""/>
+      <w:lvlJc w:val="left"/>
+      <w:pPr>
+        <w:ind w:left="2880" w:hanging="360"/>
+      </w:pPr>
+      <w:rPr>
+        <w:rFonts w:ascii="Symbol" w:hAnsi="Symbol" w:hint="default"/>
+      </w:rPr>
+    </w:lvl>
+    <w:lvl w:ilvl="4" w:tplc="04090003" w:tentative="1">
+      <w:start w:val="1"/>
+      <w:numFmt w:val="bullet"/>
+      <w:lvlText w:val="o"/>
+      <w:lvlJc w:val="left"/>
+      <w:pPr>
+        <w:ind w:left="3600" w:hanging="360"/>
+      </w:pPr>
+      <w:rPr>
+        <w:rFonts w:ascii="Courier New" w:hAnsi="Courier New" w:cs="Courier New" w:hint="default"/>
+      </w:rPr>
+    </w:lvl>
+    <w:lvl w:ilvl="5" w:tplc="04090005" w:tentative="1">
+      <w:start w:val="1"/>
+      <w:numFmt w:val="bullet"/>
+      <w:lvlText w:val=""/>
+      <w:lvlJc w:val="left"/>
+      <w:pPr>
+        <w:ind w:left="4320" w:hanging="360"/>
+      </w:pPr>
+      <w:rPr>
+        <w:rFonts w:ascii="Wingdings" w:hAnsi="Wingdings" w:hint="default"/>
+      </w:rPr>
+    </w:lvl>
+    <w:lvl w:ilvl="6" w:tplc="04090001" w:tentative="1">
+      <w:start w:val="1"/>
+      <w:numFmt w:val="bullet"/>
+      <w:lvlText w:val=""/>
+      <w:lvlJc w:val="left"/>
+      <w:pPr>
+        <w:ind w:left="5040" w:hanging="360"/>
+      </w:pPr>
+      <w:rPr>
+        <w:rFonts w:ascii="Symbol" w:hAnsi="Symbol" w:hint="default"/>
+      </w:rPr>
+    </w:lvl>
+    <w:lvl w:ilvl="7" w:tplc="04090003" w:tentative="1">
+      <w:start w:val="1"/>
+      <w:numFmt w:val="bullet"/>
+      <w:lvlText w:val="o"/>
+      <w:lvlJc w:val="left"/>
+      <w:pPr>
+        <w:ind w:left="5760" w:hanging="360"/>
+      </w:pPr>
+      <w:rPr>
+        <w:rFonts w:ascii="Courier New" w:hAnsi="Courier New" w:cs="Courier New" w:hint="default"/>
+      </w:rPr>
+    </w:lvl>
+    <w:lvl w:ilvl="8" w:tplc="04090005" w:tentative="1">
+      <w:start w:val="1"/>
+      <w:numFmt w:val="bullet"/>
+      <w:lvlText w:val=""/>
+      <w:lvlJc w:val="left"/>
+      <w:pPr>
+        <w:ind w:left="6480" w:hanging="360"/>
+      </w:pPr>
+      <w:rPr>
+        <w:rFonts w:ascii="Wingdings" w:hAnsi="Wingdings" w:hint="default"/>
+      </w:rPr>
+    </w:lvl>
+  </w:abstractNum>
+  <w:abstractNum w:abstractNumId="9" w15:restartNumberingAfterBreak="0">
     <w:nsid w:val="24377F16"/>
     <w:multiLevelType w:val="multilevel"/>
     <w:tmpl w:val="6E2C138E"/>
@@ -6897,7 +7983,156 @@
       </w:rPr>
     </w:lvl>
   </w:abstractNum>
-  <w:abstractNum w:abstractNumId="7" w15:restartNumberingAfterBreak="0">
+  <w:abstractNum w:abstractNumId="10" w15:restartNumberingAfterBreak="0">
+    <w:nsid w:val="27E7760C"/>
+    <w:multiLevelType w:val="multilevel"/>
+    <w:tmpl w:val="D262B3C6"/>
+    <w:lvl w:ilvl="0">
+      <w:start w:val="1"/>
+      <w:numFmt w:val="bullet"/>
+      <w:lvlText w:val=""/>
+      <w:lvlJc w:val="left"/>
+      <w:pPr>
+        <w:tabs>
+          <w:tab w:val="num" w:pos="720"/>
+        </w:tabs>
+        <w:ind w:left="720" w:hanging="360"/>
+      </w:pPr>
+      <w:rPr>
+        <w:rFonts w:ascii="Symbol" w:hAnsi="Symbol" w:hint="default"/>
+        <w:sz w:val="20"/>
+      </w:rPr>
+    </w:lvl>
+    <w:lvl w:ilvl="1" w:tentative="1">
+      <w:start w:val="1"/>
+      <w:numFmt w:val="bullet"/>
+      <w:lvlText w:val="o"/>
+      <w:lvlJc w:val="left"/>
+      <w:pPr>
+        <w:tabs>
+          <w:tab w:val="num" w:pos="1440"/>
+        </w:tabs>
+        <w:ind w:left="1440" w:hanging="360"/>
+      </w:pPr>
+      <w:rPr>
+        <w:rFonts w:ascii="Courier New" w:hAnsi="Courier New" w:hint="default"/>
+        <w:sz w:val="20"/>
+      </w:rPr>
+    </w:lvl>
+    <w:lvl w:ilvl="2" w:tentative="1">
+      <w:start w:val="1"/>
+      <w:numFmt w:val="bullet"/>
+      <w:lvlText w:val=""/>
+      <w:lvlJc w:val="left"/>
+      <w:pPr>
+        <w:tabs>
+          <w:tab w:val="num" w:pos="2160"/>
+        </w:tabs>
+        <w:ind w:left="2160" w:hanging="360"/>
+      </w:pPr>
+      <w:rPr>
+        <w:rFonts w:ascii="Wingdings" w:hAnsi="Wingdings" w:hint="default"/>
+        <w:sz w:val="20"/>
+      </w:rPr>
+    </w:lvl>
+    <w:lvl w:ilvl="3" w:tentative="1">
+      <w:start w:val="1"/>
+      <w:numFmt w:val="bullet"/>
+      <w:lvlText w:val=""/>
+      <w:lvlJc w:val="left"/>
+      <w:pPr>
+        <w:tabs>
+          <w:tab w:val="num" w:pos="2880"/>
+        </w:tabs>
+        <w:ind w:left="2880" w:hanging="360"/>
+      </w:pPr>
+      <w:rPr>
+        <w:rFonts w:ascii="Wingdings" w:hAnsi="Wingdings" w:hint="default"/>
+        <w:sz w:val="20"/>
+      </w:rPr>
+    </w:lvl>
+    <w:lvl w:ilvl="4" w:tentative="1">
+      <w:start w:val="1"/>
+      <w:numFmt w:val="bullet"/>
+      <w:lvlText w:val=""/>
+      <w:lvlJc w:val="left"/>
+      <w:pPr>
+        <w:tabs>
+          <w:tab w:val="num" w:pos="3600"/>
+        </w:tabs>
+        <w:ind w:left="3600" w:hanging="360"/>
+      </w:pPr>
+      <w:rPr>
+        <w:rFonts w:ascii="Wingdings" w:hAnsi="Wingdings" w:hint="default"/>
+        <w:sz w:val="20"/>
+      </w:rPr>
+    </w:lvl>
+    <w:lvl w:ilvl="5" w:tentative="1">
+      <w:start w:val="1"/>
+      <w:numFmt w:val="bullet"/>
+      <w:lvlText w:val=""/>
+      <w:lvlJc w:val="left"/>
+      <w:pPr>
+        <w:tabs>
+          <w:tab w:val="num" w:pos="4320"/>
+        </w:tabs>
+        <w:ind w:left="4320" w:hanging="360"/>
+      </w:pPr>
+      <w:rPr>
+        <w:rFonts w:ascii="Wingdings" w:hAnsi="Wingdings" w:hint="default"/>
+        <w:sz w:val="20"/>
+      </w:rPr>
+    </w:lvl>
+    <w:lvl w:ilvl="6" w:tentative="1">
+      <w:start w:val="1"/>
+      <w:numFmt w:val="bullet"/>
+      <w:lvlText w:val=""/>
+      <w:lvlJc w:val="left"/>
+      <w:pPr>
+        <w:tabs>
+          <w:tab w:val="num" w:pos="5040"/>
+        </w:tabs>
+        <w:ind w:left="5040" w:hanging="360"/>
+      </w:pPr>
+      <w:rPr>
+        <w:rFonts w:ascii="Wingdings" w:hAnsi="Wingdings" w:hint="default"/>
+        <w:sz w:val="20"/>
+      </w:rPr>
+    </w:lvl>
+    <w:lvl w:ilvl="7" w:tentative="1">
+      <w:start w:val="1"/>
+      <w:numFmt w:val="bullet"/>
+      <w:lvlText w:val=""/>
+      <w:lvlJc w:val="left"/>
+      <w:pPr>
+        <w:tabs>
+          <w:tab w:val="num" w:pos="5760"/>
+        </w:tabs>
+        <w:ind w:left="5760" w:hanging="360"/>
+      </w:pPr>
+      <w:rPr>
+        <w:rFonts w:ascii="Wingdings" w:hAnsi="Wingdings" w:hint="default"/>
+        <w:sz w:val="20"/>
+      </w:rPr>
+    </w:lvl>
+    <w:lvl w:ilvl="8" w:tentative="1">
+      <w:start w:val="1"/>
+      <w:numFmt w:val="bullet"/>
+      <w:lvlText w:val=""/>
+      <w:lvlJc w:val="left"/>
+      <w:pPr>
+        <w:tabs>
+          <w:tab w:val="num" w:pos="6480"/>
+        </w:tabs>
+        <w:ind w:left="6480" w:hanging="360"/>
+      </w:pPr>
+      <w:rPr>
+        <w:rFonts w:ascii="Wingdings" w:hAnsi="Wingdings" w:hint="default"/>
+        <w:sz w:val="20"/>
+      </w:rPr>
+    </w:lvl>
+  </w:abstractNum>
+  <w:abstractNum w:abstractNumId="11" w15:restartNumberingAfterBreak="0">
     <w:nsid w:val="30C828CB"/>
     <w:multiLevelType w:val="hybridMultilevel"/>
     <w:tmpl w:val="A7620370"/>
@@ -7009,7 +8244,7 @@
       </w:rPr>
     </w:lvl>
   </w:abstractNum>
-  <w:abstractNum w:abstractNumId="8" w15:restartNumberingAfterBreak="0">
+  <w:abstractNum w:abstractNumId="12" w15:restartNumberingAfterBreak="0">
     <w:nsid w:val="42B260B7"/>
     <w:multiLevelType w:val="multilevel"/>
     <w:tmpl w:val="0B74B46E"/>
@@ -7158,7 +8393,7 @@
       </w:rPr>
     </w:lvl>
   </w:abstractNum>
-  <w:abstractNum w:abstractNumId="9" w15:restartNumberingAfterBreak="0">
+  <w:abstractNum w:abstractNumId="13" w15:restartNumberingAfterBreak="0">
     <w:nsid w:val="45965C31"/>
     <w:multiLevelType w:val="multilevel"/>
     <w:tmpl w:val="FAF2A56C"/>
@@ -7307,7 +8542,7 @@
       </w:rPr>
     </w:lvl>
   </w:abstractNum>
-  <w:abstractNum w:abstractNumId="10" w15:restartNumberingAfterBreak="0">
+  <w:abstractNum w:abstractNumId="14" w15:restartNumberingAfterBreak="0">
     <w:nsid w:val="48B50FC6"/>
     <w:multiLevelType w:val="multilevel"/>
     <w:tmpl w:val="AEF4799A"/>
@@ -7420,7 +8655,7 @@
       </w:rPr>
     </w:lvl>
   </w:abstractNum>
-  <w:abstractNum w:abstractNumId="11" w15:restartNumberingAfterBreak="0">
+  <w:abstractNum w:abstractNumId="15" w15:restartNumberingAfterBreak="0">
     <w:nsid w:val="5F90624B"/>
     <w:multiLevelType w:val="multilevel"/>
     <w:tmpl w:val="5D54B6EE"/>
@@ -7533,7 +8768,7 @@
       </w:rPr>
     </w:lvl>
   </w:abstractNum>
-  <w:abstractNum w:abstractNumId="12" w15:restartNumberingAfterBreak="0">
+  <w:abstractNum w:abstractNumId="16" w15:restartNumberingAfterBreak="0">
     <w:nsid w:val="6D4C5AB3"/>
     <w:multiLevelType w:val="hybridMultilevel"/>
     <w:tmpl w:val="8B92E3A4"/>
@@ -7645,7 +8880,7 @@
       </w:rPr>
     </w:lvl>
   </w:abstractNum>
-  <w:abstractNum w:abstractNumId="13" w15:restartNumberingAfterBreak="0">
+  <w:abstractNum w:abstractNumId="17" w15:restartNumberingAfterBreak="0">
     <w:nsid w:val="719F31B3"/>
     <w:multiLevelType w:val="multilevel"/>
     <w:tmpl w:val="ACBC53C4"/>
@@ -7758,7 +8993,7 @@
       </w:rPr>
     </w:lvl>
   </w:abstractNum>
-  <w:abstractNum w:abstractNumId="14" w15:restartNumberingAfterBreak="0">
+  <w:abstractNum w:abstractNumId="18" w15:restartNumberingAfterBreak="0">
     <w:nsid w:val="7294751F"/>
     <w:multiLevelType w:val="multilevel"/>
     <w:tmpl w:val="0CE046A8"/>
@@ -7871,7 +9106,7 @@
       </w:rPr>
     </w:lvl>
   </w:abstractNum>
-  <w:abstractNum w:abstractNumId="15" w15:restartNumberingAfterBreak="0">
+  <w:abstractNum w:abstractNumId="19" w15:restartNumberingAfterBreak="0">
     <w:nsid w:val="781F0F93"/>
     <w:multiLevelType w:val="multilevel"/>
     <w:tmpl w:val="677A3D68"/>
@@ -7985,52 +9220,64 @@
     </w:lvl>
   </w:abstractNum>
   <w:num w:numId="1" w16cid:durableId="1091974608">
+    <w:abstractNumId w:val="3"/>
+  </w:num>
+  <w:num w:numId="2" w16cid:durableId="216476576">
+    <w:abstractNumId w:val="14"/>
+  </w:num>
+  <w:num w:numId="3" w16cid:durableId="1759398743">
+    <w:abstractNumId w:val="17"/>
+  </w:num>
+  <w:num w:numId="4" w16cid:durableId="2047168883">
+    <w:abstractNumId w:val="15"/>
+  </w:num>
+  <w:num w:numId="5" w16cid:durableId="367877644">
+    <w:abstractNumId w:val="6"/>
+  </w:num>
+  <w:num w:numId="6" w16cid:durableId="1146775677">
+    <w:abstractNumId w:val="7"/>
+  </w:num>
+  <w:num w:numId="7" w16cid:durableId="351421425">
+    <w:abstractNumId w:val="19"/>
+  </w:num>
+  <w:num w:numId="8" w16cid:durableId="1290748980">
+    <w:abstractNumId w:val="18"/>
+  </w:num>
+  <w:num w:numId="9" w16cid:durableId="1424301968">
+    <w:abstractNumId w:val="5"/>
+  </w:num>
+  <w:num w:numId="10" w16cid:durableId="868492089">
     <w:abstractNumId w:val="2"/>
   </w:num>
-  <w:num w:numId="2" w16cid:durableId="216476576">
-    <w:abstractNumId w:val="10"/>
+  <w:num w:numId="11" w16cid:durableId="400294190">
+    <w:abstractNumId w:val="11"/>
   </w:num>
-  <w:num w:numId="3" w16cid:durableId="1759398743">
+  <w:num w:numId="12" w16cid:durableId="2048485772">
+    <w:abstractNumId w:val="16"/>
+  </w:num>
+  <w:num w:numId="13" w16cid:durableId="602230517">
+    <w:abstractNumId w:val="1"/>
+  </w:num>
+  <w:num w:numId="14" w16cid:durableId="1302927409">
     <w:abstractNumId w:val="13"/>
   </w:num>
-  <w:num w:numId="4" w16cid:durableId="2047168883">
-    <w:abstractNumId w:val="11"/>
+  <w:num w:numId="15" w16cid:durableId="675763303">
+    <w:abstractNumId w:val="12"/>
   </w:num>
-  <w:num w:numId="5" w16cid:durableId="367877644">
+  <w:num w:numId="16" w16cid:durableId="1487286115">
+    <w:abstractNumId w:val="9"/>
+  </w:num>
+  <w:num w:numId="17" w16cid:durableId="230315997">
+    <w:abstractNumId w:val="0"/>
+  </w:num>
+  <w:num w:numId="18" w16cid:durableId="399521388">
     <w:abstractNumId w:val="4"/>
   </w:num>
-  <w:num w:numId="6" w16cid:durableId="1146775677">
-    <w:abstractNumId w:val="5"/>
-  </w:num>
-  <w:num w:numId="7" w16cid:durableId="351421425">
-    <w:abstractNumId w:val="15"/>
-  </w:num>
-  <w:num w:numId="8" w16cid:durableId="1290748980">
-    <w:abstractNumId w:val="14"/>
-  </w:num>
-  <w:num w:numId="9" w16cid:durableId="1424301968">
-    <w:abstractNumId w:val="3"/>
-  </w:num>
-  <w:num w:numId="10" w16cid:durableId="868492089">
-    <w:abstractNumId w:val="1"/>
-  </w:num>
-  <w:num w:numId="11" w16cid:durableId="400294190">
-    <w:abstractNumId w:val="7"/>
-  </w:num>
-  <w:num w:numId="12" w16cid:durableId="2048485772">
-    <w:abstractNumId w:val="12"/>
-  </w:num>
-  <w:num w:numId="13" w16cid:durableId="602230517">
-    <w:abstractNumId w:val="0"/>
-  </w:num>
-  <w:num w:numId="14" w16cid:durableId="1302927409">
-    <w:abstractNumId w:val="9"/>
-  </w:num>
-  <w:num w:numId="15" w16cid:durableId="675763303">
+  <w:num w:numId="19" w16cid:durableId="598559544">
     <w:abstractNumId w:val="8"/>
   </w:num>
-  <w:num w:numId="16" w16cid:durableId="1487286115">
-    <w:abstractNumId w:val="6"/>
+  <w:num w:numId="20" w16cid:durableId="627857045">
+    <w:abstractNumId w:val="10"/>
   </w:num>
 </w:numbering>
 </file>

</xml_diff>

<commit_message>
Day 7 final review and evaluation updates
</commit_message>
<xml_diff>
--- a/1776487919882-bac12ed1-3b86-420f-9fef-86cd76144ca9__community_file (1).docx
+++ b/1776487919882-bac12ed1-3b86-420f-9fef-86cd76144ca9__community_file (1).docx
@@ -106,15 +106,7 @@
           </w:tcPr>
           <w:p>
             <w:r>
-              <w:t xml:space="preserve">Areen Ahmed Nasser Al </w:t>
-            </w:r>
-            <w:proofErr w:type="spellStart"/>
-            <w:r>
-              <w:t>Battashi</w:t>
-            </w:r>
-            <w:proofErr w:type="spellEnd"/>
-            <w:r>
-              <w:t xml:space="preserve"> </w:t>
+              <w:t xml:space="preserve">Areen Ahmed Nasser Al Battashi </w:t>
             </w:r>
           </w:p>
         </w:tc>
@@ -152,11 +144,9 @@
             <w:tcW w:w="4320" w:type="dxa"/>
           </w:tcPr>
           <w:p>
-            <w:proofErr w:type="spellStart"/>
             <w:r>
               <w:t>Timezone</w:t>
             </w:r>
-            <w:proofErr w:type="spellEnd"/>
           </w:p>
         </w:tc>
         <w:tc>
@@ -350,15 +340,7 @@
         <w:spacing w:after="0"/>
       </w:pPr>
       <w:r>
-        <w:t xml:space="preserve">☐ Deployment link (Hugging Face / </w:t>
-      </w:r>
-      <w:proofErr w:type="spellStart"/>
-      <w:r>
-        <w:t>Streamlit</w:t>
-      </w:r>
-      <w:proofErr w:type="spellEnd"/>
-      <w:r>
-        <w:t xml:space="preserve"> / other)</w:t>
+        <w:t>☐ Deployment link (Hugging Face / Streamlit / other)</w:t>
       </w:r>
     </w:p>
     <w:p>
@@ -620,15 +602,7 @@
           </w:tcPr>
           <w:p>
             <w:r>
-              <w:t xml:space="preserve">The system will use computer vision techniques to detect and recognize hand gestures and body movements through a webcam. Technologies such as Python, OpenCV, and </w:t>
-            </w:r>
-            <w:proofErr w:type="spellStart"/>
-            <w:r>
-              <w:t>MediaPipe</w:t>
-            </w:r>
-            <w:proofErr w:type="spellEnd"/>
-            <w:r>
-              <w:t xml:space="preserve"> will be used for gesture detection. An administrator interface will allow users to create projects, select gestures, upload content, and define actions. The application will execute the corresponding action whenever the selected gesture is detected.</w:t>
+              <w:t>The system will use computer vision techniques to detect and recognize hand gestures and body movements through a webcam. Technologies such as Python, OpenCV, and MediaPipe will be used for gesture detection. An administrator interface will allow users to create projects, select gestures, upload content, and define actions. The application will execute the corresponding action whenever the selected gesture is detected.</w:t>
             </w:r>
           </w:p>
         </w:tc>
@@ -672,15 +646,7 @@
           </w:tcPr>
           <w:p>
             <w:r>
-              <w:t xml:space="preserve">The </w:t>
-            </w:r>
-            <w:proofErr w:type="gramStart"/>
-            <w:r>
-              <w:t>final outcome</w:t>
-            </w:r>
-            <w:proofErr w:type="gramEnd"/>
-            <w:r>
-              <w:t xml:space="preserve"> will be a fully functional AI-powered platform that allows administrators to create and manage gesture-based interactive experiences. The system will demonstrate how computer vision can be used to build engaging, touch-free environments for education, exhibitions, events, and public spaces. </w:t>
+              <w:t xml:space="preserve">The final outcome will be a fully functional AI-powered platform that allows administrators to create and manage gesture-based interactive experiences. The system will demonstrate how computer vision can be used to build engaging, touch-free environments for education, exhibitions, events, and public spaces. </w:t>
             </w:r>
           </w:p>
         </w:tc>
@@ -770,15 +736,7 @@
               <w:t xml:space="preserve">people </w:t>
             </w:r>
             <w:r>
-              <w:t xml:space="preserve">want interactive screen </w:t>
-            </w:r>
-            <w:proofErr w:type="gramStart"/>
-            <w:r>
-              <w:t>experiences, but</w:t>
-            </w:r>
-            <w:proofErr w:type="gramEnd"/>
-            <w:r>
-              <w:t xml:space="preserve"> creating them usually requires coding or expensive custom systems.</w:t>
+              <w:t>want interactive screen experiences, but creating them usually requires coding or expensive custom systems.</w:t>
             </w:r>
           </w:p>
         </w:tc>
@@ -1394,13 +1352,8 @@
           </w:tcPr>
           <w:p>
             <w:r>
-              <w:t xml:space="preserve">Update </w:t>
-            </w:r>
-            <w:proofErr w:type="spellStart"/>
-            <w:r>
-              <w:t>freq</w:t>
-            </w:r>
-            <w:proofErr w:type="spellEnd"/>
+              <w:t>Update freq</w:t>
+            </w:r>
           </w:p>
         </w:tc>
         <w:tc>
@@ -2012,13 +1965,8 @@
           </w:tcPr>
           <w:p>
             <w:r>
-              <w:t>Compression/</w:t>
-            </w:r>
-            <w:proofErr w:type="spellStart"/>
-            <w:r>
-              <w:t>validat</w:t>
-            </w:r>
-            <w:proofErr w:type="spellEnd"/>
+              <w:t>Compression/validat</w:t>
+            </w:r>
           </w:p>
         </w:tc>
         <w:tc>
@@ -2579,14 +2527,12 @@
             <w:vAlign w:val="center"/>
           </w:tcPr>
           <w:p>
-            <w:proofErr w:type="spellStart"/>
             <w:r>
               <w:rPr>
                 <w:lang w:val="en-US"/>
               </w:rPr>
               <w:t>MediaPipe</w:t>
             </w:r>
-            <w:proofErr w:type="spellEnd"/>
           </w:p>
         </w:tc>
         <w:tc>
@@ -3491,16 +3437,8 @@
               <w:rPr>
                 <w:lang w:val="en-US"/>
               </w:rPr>
-              <w:t xml:space="preserve">Python, OpenCV, </w:t>
-            </w:r>
-            <w:proofErr w:type="spellStart"/>
-            <w:r>
-              <w:rPr>
-                <w:lang w:val="en-US"/>
-              </w:rPr>
-              <w:t>MediaPipe</w:t>
-            </w:r>
-            <w:proofErr w:type="spellEnd"/>
+              <w:t>Python, OpenCV, MediaPipe</w:t>
+            </w:r>
           </w:p>
         </w:tc>
       </w:tr>
@@ -3576,19 +3514,11 @@
                 <w:lang w:val="en-US"/>
               </w:rPr>
             </w:pPr>
-            <w:proofErr w:type="spellStart"/>
-            <w:r>
-              <w:rPr>
-                <w:lang w:val="en-US"/>
-              </w:rPr>
-              <w:t>MediaPipe</w:t>
-            </w:r>
-            <w:proofErr w:type="spellEnd"/>
-            <w:r>
-              <w:rPr>
-                <w:lang w:val="en-US"/>
-              </w:rPr>
-              <w:t xml:space="preserve"> hand landmark detection model and real-time camera input.</w:t>
+            <w:r>
+              <w:rPr>
+                <w:lang w:val="en-US"/>
+              </w:rPr>
+              <w:t>MediaPipe hand landmark detection model and real-time camera input.</w:t>
             </w:r>
           </w:p>
           <w:p>
@@ -3831,27 +3761,11 @@
           <w:highlight w:val="yellow"/>
         </w:rPr>
       </w:pPr>
-      <w:proofErr w:type="gramStart"/>
       <w:r>
         <w:rPr>
           <w:highlight w:val="yellow"/>
         </w:rPr>
-        <w:t>☐ .</w:t>
-      </w:r>
-      <w:proofErr w:type="spellStart"/>
-      <w:r>
-        <w:rPr>
-          <w:highlight w:val="yellow"/>
-        </w:rPr>
-        <w:t>gitignore</w:t>
-      </w:r>
-      <w:proofErr w:type="spellEnd"/>
-      <w:proofErr w:type="gramEnd"/>
-      <w:r>
-        <w:rPr>
-          <w:highlight w:val="yellow"/>
-        </w:rPr>
-        <w:t xml:space="preserve"> configured (no secrets)</w:t>
+        <w:t>☐ .gitignore configured (no secrets)</w:t>
       </w:r>
     </w:p>
     <w:p>
@@ -3869,35 +3783,7 @@
         <w:rPr>
           <w:highlight w:val="yellow"/>
         </w:rPr>
-        <w:t>☐ Python environment created (</w:t>
-      </w:r>
-      <w:proofErr w:type="spellStart"/>
-      <w:r>
-        <w:rPr>
-          <w:highlight w:val="yellow"/>
-        </w:rPr>
-        <w:t>venv</w:t>
-      </w:r>
-      <w:proofErr w:type="spellEnd"/>
-      <w:r>
-        <w:rPr>
-          <w:highlight w:val="yellow"/>
-        </w:rPr>
-        <w:t>/</w:t>
-      </w:r>
-      <w:proofErr w:type="spellStart"/>
-      <w:r>
-        <w:rPr>
-          <w:highlight w:val="yellow"/>
-        </w:rPr>
-        <w:t>conda</w:t>
-      </w:r>
-      <w:proofErr w:type="spellEnd"/>
-      <w:r>
-        <w:rPr>
-          <w:highlight w:val="yellow"/>
-        </w:rPr>
-        <w:t>) OR platform workspace created (no-code)</w:t>
+        <w:t>☐ Python environment created (venv/conda) OR platform workspace created (no-code)</w:t>
       </w:r>
     </w:p>
     <w:p>
@@ -3915,35 +3801,7 @@
         <w:rPr>
           <w:highlight w:val="yellow"/>
         </w:rPr>
-        <w:t xml:space="preserve">☐ Dependencies installed and pinned (requirements.txt / </w:t>
-      </w:r>
-      <w:proofErr w:type="spellStart"/>
-      <w:r>
-        <w:rPr>
-          <w:highlight w:val="yellow"/>
-        </w:rPr>
-        <w:t>pyproject</w:t>
-      </w:r>
-      <w:proofErr w:type="spellEnd"/>
-      <w:r>
-        <w:rPr>
-          <w:highlight w:val="yellow"/>
-        </w:rPr>
-        <w:t xml:space="preserve"> / </w:t>
-      </w:r>
-      <w:proofErr w:type="spellStart"/>
-      <w:r>
-        <w:rPr>
-          <w:highlight w:val="yellow"/>
-        </w:rPr>
-        <w:t>lockfile</w:t>
-      </w:r>
-      <w:proofErr w:type="spellEnd"/>
-      <w:r>
-        <w:rPr>
-          <w:highlight w:val="yellow"/>
-        </w:rPr>
-        <w:t>)</w:t>
+        <w:t>☐ Dependencies installed and pinned (requirements.txt / pyproject / lockfile)</w:t>
       </w:r>
     </w:p>
     <w:p>
@@ -3955,15 +3813,7 @@
         <w:spacing w:after="0"/>
       </w:pPr>
       <w:r>
-        <w:t xml:space="preserve">☐ API keys stored safely </w:t>
-      </w:r>
-      <w:proofErr w:type="gramStart"/>
-      <w:r>
-        <w:t>(.env</w:t>
-      </w:r>
-      <w:proofErr w:type="gramEnd"/>
-      <w:r>
-        <w:t>, secrets manager, or platform secrets)</w:t>
+        <w:t>☐ API keys stored safely (.env, secrets manager, or platform secrets)</w:t>
       </w:r>
     </w:p>
     <w:p>
@@ -3981,21 +3831,7 @@
         <w:rPr>
           <w:highlight w:val="yellow"/>
         </w:rPr>
-        <w:t>☐ Basic '</w:t>
-      </w:r>
-      <w:proofErr w:type="gramStart"/>
-      <w:r>
-        <w:rPr>
-          <w:highlight w:val="yellow"/>
-        </w:rPr>
-        <w:t>hello world</w:t>
-      </w:r>
-      <w:proofErr w:type="gramEnd"/>
-      <w:r>
-        <w:rPr>
-          <w:highlight w:val="yellow"/>
-        </w:rPr>
-        <w:t>' run completed locally</w:t>
+        <w:t>☐ Basic 'hello world' run completed locally</w:t>
       </w:r>
     </w:p>
     <w:p>
@@ -4166,15 +4002,7 @@
           </w:tcPr>
           <w:p>
             <w:r>
-              <w:t xml:space="preserve">Python was selected as the primary development language due to its strong support for computer vision and AI applications. OpenCV was chosen for camera integration, while </w:t>
-            </w:r>
-            <w:proofErr w:type="spellStart"/>
-            <w:r>
-              <w:t>MediaPipe</w:t>
-            </w:r>
-            <w:proofErr w:type="spellEnd"/>
-            <w:r>
-              <w:t xml:space="preserve"> will be used for gesture recognition. GitHub was used for version control and project management. A virtual environment was created to manage project dependencies and maintain a clean development setup.</w:t>
+              <w:t>Python was selected as the primary development language due to its strong support for computer vision and AI applications. OpenCV was chosen for camera integration, while MediaPipe will be used for gesture recognition. GitHub was used for version control and project management. A virtual environment was created to manage project dependencies and maintain a clean development setup.</w:t>
             </w:r>
           </w:p>
         </w:tc>
@@ -4407,15 +4235,7 @@
           </w:tcPr>
           <w:p>
             <w:r>
-              <w:t xml:space="preserve">The brain of Gesture AI Studios is a computer vision system built using </w:t>
-            </w:r>
-            <w:proofErr w:type="spellStart"/>
-            <w:r>
-              <w:t>MediaPipe</w:t>
-            </w:r>
-            <w:proofErr w:type="spellEnd"/>
-            <w:r>
-              <w:t xml:space="preserve"> and OpenCV. It analyzes live camera input, detects hand landmarks in real time, and serves as the foundation for recognizing gestures and triggering customized actions.</w:t>
+              <w:t>The brain of Gesture AI Studios is a computer vision system built using MediaPipe and OpenCV. It analyzes live camera input, detects hand landmarks in real time, and serves as the foundation for recognizing gestures and triggering customized actions.</w:t>
             </w:r>
           </w:p>
         </w:tc>
@@ -4517,62 +4337,20 @@
         <w:rPr>
           <w:lang w:val="en-US"/>
         </w:rPr>
-        <w:t xml:space="preserve">• Selected </w:t>
-      </w:r>
-      <w:proofErr w:type="spellStart"/>
-      <w:r>
-        <w:rPr>
-          <w:lang w:val="en-US"/>
-        </w:rPr>
-        <w:t>MediaPipe</w:t>
-      </w:r>
-      <w:proofErr w:type="spellEnd"/>
-      <w:r>
-        <w:rPr>
-          <w:lang w:val="en-US"/>
-        </w:rPr>
-        <w:t xml:space="preserve"> Hand </w:t>
-      </w:r>
-      <w:proofErr w:type="spellStart"/>
-      <w:r>
-        <w:rPr>
-          <w:lang w:val="en-US"/>
-        </w:rPr>
-        <w:t>Landmarker</w:t>
-      </w:r>
-      <w:proofErr w:type="spellEnd"/>
-      <w:r>
-        <w:rPr>
-          <w:lang w:val="en-US"/>
-        </w:rPr>
-        <w:t xml:space="preserve"> because it provides accurate real-time hand tracking and is suitable for interactive applications.</w:t>
-      </w:r>
-    </w:p>
-    <w:p>
-      <w:pPr>
-        <w:rPr>
-          <w:lang w:val="en-US"/>
-        </w:rPr>
-      </w:pPr>
-      <w:r>
-        <w:rPr>
-          <w:lang w:val="en-US"/>
-        </w:rPr>
-        <w:t xml:space="preserve">• Chose OpenCV for camera processing due to its performance, simplicity, and strong integration with </w:t>
-      </w:r>
-      <w:proofErr w:type="spellStart"/>
-      <w:r>
-        <w:rPr>
-          <w:lang w:val="en-US"/>
-        </w:rPr>
-        <w:t>MediaPipe</w:t>
-      </w:r>
-      <w:proofErr w:type="spellEnd"/>
-      <w:r>
-        <w:rPr>
-          <w:lang w:val="en-US"/>
-        </w:rPr>
-        <w:t>.</w:t>
+        <w:t>• Selected MediaPipe Hand Landmarker because it provides accurate real-time hand tracking and is suitable for interactive applications.</w:t>
+      </w:r>
+    </w:p>
+    <w:p>
+      <w:pPr>
+        <w:rPr>
+          <w:lang w:val="en-US"/>
+        </w:rPr>
+      </w:pPr>
+      <w:r>
+        <w:rPr>
+          <w:lang w:val="en-US"/>
+        </w:rPr>
+        <w:t>• Chose OpenCV for camera processing due to its performance, simplicity, and strong integration with MediaPipe.</w:t>
       </w:r>
     </w:p>
     <w:p>
@@ -4758,23 +4536,7 @@
           </w:tcPr>
           <w:p>
             <w:r>
-              <w:t xml:space="preserve">Live webcam testing using </w:t>
-            </w:r>
-            <w:proofErr w:type="spellStart"/>
-            <w:r>
-              <w:t>MediaPipe</w:t>
-            </w:r>
-            <w:proofErr w:type="spellEnd"/>
-            <w:r>
-              <w:t xml:space="preserve"> Hand </w:t>
-            </w:r>
-            <w:proofErr w:type="spellStart"/>
-            <w:r>
-              <w:t>Landmarker</w:t>
-            </w:r>
-            <w:proofErr w:type="spellEnd"/>
-            <w:r>
-              <w:t xml:space="preserve"> and custom gesture test scenarios.</w:t>
+              <w:t>Live webcam testing using MediaPipe Hand Landmarker and custom gesture test scenarios.</w:t>
             </w:r>
           </w:p>
         </w:tc>
@@ -4818,15 +4580,7 @@
           </w:tcPr>
           <w:p>
             <w:r>
-              <w:t xml:space="preserve">Open Hand confused with Four Fingers, unstable gesture switching, false gesture detection during movement, slow response when running inside </w:t>
-            </w:r>
-            <w:proofErr w:type="spellStart"/>
-            <w:r>
-              <w:t>Streamlit</w:t>
-            </w:r>
-            <w:proofErr w:type="spellEnd"/>
-            <w:r>
-              <w:t>.</w:t>
+              <w:t>Open Hand confused with Four Fingers, unstable gesture switching, false gesture detection during movement, slow response when running inside Streamlit.</w:t>
             </w:r>
           </w:p>
         </w:tc>
@@ -5099,7 +4853,6 @@
           <w:lang w:val="en-US"/>
         </w:rPr>
       </w:pPr>
-      <w:proofErr w:type="spellStart"/>
       <w:r>
         <w:rPr>
           <w:rFonts w:asciiTheme="majorBidi" w:hAnsiTheme="majorBidi" w:cstheme="majorBidi"/>
@@ -5107,29 +4860,8 @@
           <w:szCs w:val="24"/>
           <w:lang w:val="en-US"/>
         </w:rPr>
-        <w:t>MediaPipe</w:t>
-      </w:r>
-      <w:proofErr w:type="spellEnd"/>
-      <w:r>
-        <w:rPr>
-          <w:rFonts w:asciiTheme="majorBidi" w:hAnsiTheme="majorBidi" w:cstheme="majorBidi"/>
-          <w:sz w:val="24"/>
-          <w:szCs w:val="24"/>
-          <w:lang w:val="en-US"/>
-        </w:rPr>
-        <w:t xml:space="preserve"> Hand </w:t>
-      </w:r>
-      <w:proofErr w:type="spellStart"/>
-      <w:r>
-        <w:rPr>
-          <w:rFonts w:asciiTheme="majorBidi" w:hAnsiTheme="majorBidi" w:cstheme="majorBidi"/>
-          <w:sz w:val="24"/>
-          <w:szCs w:val="24"/>
-          <w:lang w:val="en-US"/>
-        </w:rPr>
-        <w:t>Landmarker</w:t>
-      </w:r>
-      <w:proofErr w:type="spellEnd"/>
+        <w:t>MediaPipe Hand Landmarker</w:t>
+      </w:r>
     </w:p>
     <w:p>
       <w:pPr>
@@ -5144,7 +4876,6 @@
           <w:lang w:val="en-US"/>
         </w:rPr>
       </w:pPr>
-      <w:proofErr w:type="spellStart"/>
       <w:r>
         <w:rPr>
           <w:rFonts w:asciiTheme="majorBidi" w:hAnsiTheme="majorBidi" w:cstheme="majorBidi"/>
@@ -5154,7 +4885,6 @@
         </w:rPr>
         <w:t>Streamlit</w:t>
       </w:r>
-      <w:proofErr w:type="spellEnd"/>
     </w:p>
     <w:p>
       <w:pPr>
@@ -5321,27 +5051,7 @@
           <w:szCs w:val="24"/>
           <w:lang w:val="en-US"/>
         </w:rPr>
-        <w:t xml:space="preserve">Another challenge was performance. Running the camera processing directly within </w:t>
-      </w:r>
-      <w:proofErr w:type="spellStart"/>
-      <w:r>
-        <w:rPr>
-          <w:rFonts w:asciiTheme="majorBidi" w:hAnsiTheme="majorBidi" w:cstheme="majorBidi"/>
-          <w:sz w:val="24"/>
-          <w:szCs w:val="24"/>
-          <w:lang w:val="en-US"/>
-        </w:rPr>
-        <w:t>Streamlit</w:t>
-      </w:r>
-      <w:proofErr w:type="spellEnd"/>
-      <w:r>
-        <w:rPr>
-          <w:rFonts w:asciiTheme="majorBidi" w:hAnsiTheme="majorBidi" w:cstheme="majorBidi"/>
-          <w:sz w:val="24"/>
-          <w:szCs w:val="24"/>
-          <w:lang w:val="en-US"/>
-        </w:rPr>
-        <w:t xml:space="preserve"> introduced noticeable latency and reduced the responsiveness of the application.</w:t>
+        <w:t>Another challenge was performance. Running the camera processing directly within Streamlit introduced noticeable latency and reduced the responsiveness of the application.</w:t>
       </w:r>
     </w:p>
     <w:p>
@@ -5403,27 +5113,7 @@
           <w:szCs w:val="24"/>
           <w:lang w:val="en-US"/>
         </w:rPr>
-        <w:t xml:space="preserve">A cooldown mechanism was also introduced to prevent rapid triggering of actions. Additionally, the application architecture was redesigned by separating the </w:t>
-      </w:r>
-      <w:proofErr w:type="spellStart"/>
-      <w:r>
-        <w:rPr>
-          <w:rFonts w:asciiTheme="majorBidi" w:hAnsiTheme="majorBidi" w:cstheme="majorBidi"/>
-          <w:sz w:val="24"/>
-          <w:szCs w:val="24"/>
-          <w:lang w:val="en-US"/>
-        </w:rPr>
-        <w:t>Streamlit</w:t>
-      </w:r>
-      <w:proofErr w:type="spellEnd"/>
-      <w:r>
-        <w:rPr>
-          <w:rFonts w:asciiTheme="majorBidi" w:hAnsiTheme="majorBidi" w:cstheme="majorBidi"/>
-          <w:sz w:val="24"/>
-          <w:szCs w:val="24"/>
-          <w:lang w:val="en-US"/>
-        </w:rPr>
-        <w:t xml:space="preserve"> administrator interface from the Smart Mirror camera engine. This significantly improved runtime performance and reduced latency.</w:t>
+        <w:t>A cooldown mechanism was also introduced to prevent rapid triggering of actions. Additionally, the application architecture was redesigned by separating the Streamlit administrator interface from the Smart Mirror camera engine. This significantly improved runtime performance and reduced latency.</w:t>
       </w:r>
     </w:p>
     <w:p>
@@ -5519,9 +5209,73 @@
     </w:p>
     <w:p>
       <w:pPr>
+        <w:rPr>
+          <w:lang w:val="en-US"/>
+        </w:rPr>
+      </w:pPr>
+    </w:p>
+    <w:p>
+      <w:pPr>
+        <w:rPr>
+          <w:lang w:val="en-US"/>
+        </w:rPr>
+      </w:pPr>
+    </w:p>
+    <w:p>
+      <w:pPr>
+        <w:rPr>
+          <w:lang w:val="en-US"/>
+        </w:rPr>
+      </w:pPr>
+    </w:p>
+    <w:p>
+      <w:pPr>
+        <w:rPr>
+          <w:lang w:val="en-US"/>
+        </w:rPr>
+      </w:pPr>
+    </w:p>
+    <w:p>
+      <w:pPr>
+        <w:rPr>
+          <w:lang w:val="en-US"/>
+        </w:rPr>
+      </w:pPr>
+    </w:p>
+    <w:p>
+      <w:pPr>
+        <w:rPr>
+          <w:lang w:val="en-US"/>
+        </w:rPr>
+      </w:pPr>
+    </w:p>
+    <w:p>
+      <w:pPr>
+        <w:rPr>
+          <w:lang w:val="en-US"/>
+        </w:rPr>
+      </w:pPr>
+    </w:p>
+    <w:p>
+      <w:pPr>
+        <w:rPr>
+          <w:lang w:val="en-US"/>
+        </w:rPr>
+      </w:pPr>
+    </w:p>
+    <w:p>
+      <w:pPr>
+        <w:rPr>
+          <w:lang w:val="en-US"/>
+        </w:rPr>
+      </w:pPr>
+    </w:p>
+    <w:p>
+      <w:pPr>
         <w:pStyle w:val="Heading1"/>
       </w:pPr>
       <w:r>
+        <w:lastRenderedPageBreak/>
         <w:t>Day 5 — Integration of Model/API with Interface</w:t>
       </w:r>
     </w:p>
@@ -5622,23 +5376,7 @@
           </w:tcPr>
           <w:p>
             <w:r>
-              <w:t>Interface tech (</w:t>
-            </w:r>
-            <w:proofErr w:type="spellStart"/>
-            <w:r>
-              <w:t>Gradio</w:t>
-            </w:r>
-            <w:proofErr w:type="spellEnd"/>
-            <w:r>
-              <w:t>/</w:t>
-            </w:r>
-            <w:proofErr w:type="spellStart"/>
-            <w:r>
-              <w:t>Streamlit</w:t>
-            </w:r>
-            <w:proofErr w:type="spellEnd"/>
-            <w:r>
-              <w:t>/React/No-code UI)</w:t>
+              <w:t>Interface tech (Gradio/Streamlit/React/No-code UI)</w:t>
             </w:r>
           </w:p>
         </w:tc>
@@ -5711,25 +5449,363 @@
     </w:p>
     <w:p>
       <w:r>
+        <w:t xml:space="preserve">• </w:t>
+      </w:r>
+    </w:p>
+    <w:p>
+      <w:r>
+        <w:t xml:space="preserve">• </w:t>
+      </w:r>
+    </w:p>
+    <w:p>
+      <w:r>
+        <w:t>Blockers / help needed:</w:t>
+      </w:r>
+    </w:p>
+    <w:p>
+      <w:r>
+        <w:t xml:space="preserve">• </w:t>
+      </w:r>
+    </w:p>
+    <w:p>
+      <w:pPr>
+        <w:rPr>
+          <w:lang w:val="en-US"/>
+        </w:rPr>
+      </w:pPr>
+      <w:r>
+        <w:rPr>
+          <w:lang w:val="en-US"/>
+        </w:rPr>
+        <w:t>Day 5 – Integration of Model/API with Interface</w:t>
+      </w:r>
+    </w:p>
+    <w:p>
+      <w:pPr>
+        <w:rPr>
+          <w:lang w:val="en-US"/>
+        </w:rPr>
+      </w:pPr>
+      <w:r>
+        <w:rPr>
+          <w:lang w:val="en-US"/>
+        </w:rPr>
+        <w:t>Project: Gesture AI Studios</w:t>
+      </w:r>
+    </w:p>
+    <w:p>
+      <w:pPr>
+        <w:rPr>
+          <w:lang w:val="en-US"/>
+        </w:rPr>
+      </w:pPr>
+      <w:r>
+        <w:rPr>
+          <w:lang w:val="en-US"/>
+        </w:rPr>
+        <w:t>Interface Setup:</w:t>
+      </w:r>
+      <w:r>
+        <w:rPr>
+          <w:lang w:val="en-US"/>
+        </w:rPr>
+        <w:br/>
+        <w:t>For Day 5, I focused on integrating the gesture recognition backend with a user-friendly Streamlit interface. The interface acts as an administrator control panel where users can customize gesture actions, messages, colors, text size, animations, and Open Hand behavior. I also added the project logo and adjusted the interface colors to match the branding of Gesture AI Studios.</w:t>
+      </w:r>
+    </w:p>
+    <w:p>
+      <w:pPr>
+        <w:rPr>
+          <w:lang w:val="en-US"/>
+        </w:rPr>
+      </w:pPr>
+      <w:r>
+        <w:rPr>
+          <w:lang w:val="en-US"/>
+        </w:rPr>
+        <w:t>Backend Integration:</w:t>
+      </w:r>
+      <w:r>
+        <w:rPr>
+          <w:lang w:val="en-US"/>
+        </w:rPr>
+        <w:br/>
+        <w:t>The backend uses OpenCV and MediaPipe Hand Landmarker to detect hand gestures through a live webcam feed. The Streamlit interface saves the administrator’s settings into a JSON configuration file. When the Smart Mirror is launched, it reads these saved settings and applies them to the detected gestures in real time.</w:t>
+      </w:r>
+    </w:p>
+    <w:p>
+      <w:pPr>
+        <w:rPr>
+          <w:lang w:val="en-US"/>
+        </w:rPr>
+      </w:pPr>
+      <w:r>
+        <w:rPr>
+          <w:lang w:val="en-US"/>
+        </w:rPr>
+        <w:t>User Interaction Flow:</w:t>
+      </w:r>
+    </w:p>
+    <w:p>
+      <w:pPr>
+        <w:numPr>
+          <w:ilvl w:val="0"/>
+          <w:numId w:val="21"/>
+        </w:numPr>
+        <w:rPr>
+          <w:lang w:val="en-US"/>
+        </w:rPr>
+      </w:pPr>
+      <w:r>
+        <w:rPr>
+          <w:lang w:val="en-US"/>
+        </w:rPr>
+        <w:t>The administrator opens the Streamlit interface.</w:t>
+      </w:r>
+    </w:p>
+    <w:p>
+      <w:pPr>
+        <w:numPr>
+          <w:ilvl w:val="0"/>
+          <w:numId w:val="21"/>
+        </w:numPr>
+        <w:rPr>
+          <w:lang w:val="en-US"/>
+        </w:rPr>
+      </w:pPr>
+      <w:r>
+        <w:rPr>
+          <w:lang w:val="en-US"/>
+        </w:rPr>
+        <w:t>The administrator customizes gesture actions and visual styles.</w:t>
+      </w:r>
+    </w:p>
+    <w:p>
+      <w:pPr>
+        <w:numPr>
+          <w:ilvl w:val="0"/>
+          <w:numId w:val="21"/>
+        </w:numPr>
+        <w:rPr>
+          <w:lang w:val="en-US"/>
+        </w:rPr>
+      </w:pPr>
+      <w:r>
+        <w:rPr>
+          <w:lang w:val="en-US"/>
+        </w:rPr>
         <w:lastRenderedPageBreak/>
-        <w:t xml:space="preserve">• </w:t>
-      </w:r>
-    </w:p>
-    <w:p>
-      <w:r>
-        <w:t xml:space="preserve">• </w:t>
-      </w:r>
-    </w:p>
-    <w:p>
-      <w:r>
-        <w:t>Blockers / help needed:</w:t>
-      </w:r>
-    </w:p>
-    <w:p>
-      <w:r>
-        <w:t xml:space="preserve">• </w:t>
-      </w:r>
-    </w:p>
+        <w:t>The settings are saved into config.json.</w:t>
+      </w:r>
+    </w:p>
+    <w:p>
+      <w:pPr>
+        <w:numPr>
+          <w:ilvl w:val="0"/>
+          <w:numId w:val="21"/>
+        </w:numPr>
+        <w:rPr>
+          <w:lang w:val="en-US"/>
+        </w:rPr>
+      </w:pPr>
+      <w:r>
+        <w:rPr>
+          <w:lang w:val="en-US"/>
+        </w:rPr>
+        <w:t>The administrator clicks “Run Smart Mirror.”</w:t>
+      </w:r>
+    </w:p>
+    <w:p>
+      <w:pPr>
+        <w:numPr>
+          <w:ilvl w:val="0"/>
+          <w:numId w:val="21"/>
+        </w:numPr>
+        <w:rPr>
+          <w:lang w:val="en-US"/>
+        </w:rPr>
+      </w:pPr>
+      <w:r>
+        <w:rPr>
+          <w:lang w:val="en-US"/>
+        </w:rPr>
+        <w:t>The camera opens and detects the user’s hand gestures.</w:t>
+      </w:r>
+    </w:p>
+    <w:p>
+      <w:pPr>
+        <w:numPr>
+          <w:ilvl w:val="0"/>
+          <w:numId w:val="21"/>
+        </w:numPr>
+        <w:rPr>
+          <w:lang w:val="en-US"/>
+        </w:rPr>
+      </w:pPr>
+      <w:r>
+        <w:rPr>
+          <w:lang w:val="en-US"/>
+        </w:rPr>
+        <w:t>The correct customized message, color, or animation appears based on the gesture.</w:t>
+      </w:r>
+    </w:p>
+    <w:p>
+      <w:pPr>
+        <w:rPr>
+          <w:lang w:val="en-US"/>
+        </w:rPr>
+      </w:pPr>
+      <w:r>
+        <w:rPr>
+          <w:lang w:val="en-US"/>
+        </w:rPr>
+        <w:t>Features Added:</w:t>
+      </w:r>
+      <w:r>
+        <w:rPr>
+          <w:lang w:val="en-US"/>
+        </w:rPr>
+        <w:br/>
+        <w:t>• Streamlit administrator interface</w:t>
+      </w:r>
+      <w:r>
+        <w:rPr>
+          <w:lang w:val="en-US"/>
+        </w:rPr>
+        <w:br/>
+        <w:t>• Logo and color styling based on the Gesture AI Studios brand</w:t>
+      </w:r>
+      <w:r>
+        <w:rPr>
+          <w:lang w:val="en-US"/>
+        </w:rPr>
+        <w:br/>
+        <w:t>• Custom gesture messages</w:t>
+      </w:r>
+      <w:r>
+        <w:rPr>
+          <w:lang w:val="en-US"/>
+        </w:rPr>
+        <w:br/>
+        <w:t>• Text color and text size customization</w:t>
+      </w:r>
+      <w:r>
+        <w:rPr>
+          <w:lang w:val="en-US"/>
+        </w:rPr>
+        <w:br/>
+        <w:t>• Animation selection</w:t>
+      </w:r>
+      <w:r>
+        <w:rPr>
+          <w:lang w:val="en-US"/>
+        </w:rPr>
+        <w:br/>
+        <w:t>• Open Hand behavior setting</w:t>
+      </w:r>
+      <w:r>
+        <w:rPr>
+          <w:lang w:val="en-US"/>
+        </w:rPr>
+        <w:br/>
+        <w:t>• Run Smart Mirror button</w:t>
+      </w:r>
+      <w:r>
+        <w:rPr>
+          <w:lang w:val="en-US"/>
+        </w:rPr>
+        <w:br/>
+        <w:t>• Stop Smart Mirror button</w:t>
+      </w:r>
+      <w:r>
+        <w:rPr>
+          <w:lang w:val="en-US"/>
+        </w:rPr>
+        <w:br/>
+        <w:t>• JSON-based configuration storage</w:t>
+      </w:r>
+      <w:r>
+        <w:rPr>
+          <w:lang w:val="en-US"/>
+        </w:rPr>
+        <w:br/>
+        <w:t>• Integration between the UI and the gesture recognition engine</w:t>
+      </w:r>
+    </w:p>
+    <w:p>
+      <w:pPr>
+        <w:rPr>
+          <w:lang w:val="en-US"/>
+        </w:rPr>
+      </w:pPr>
+      <w:r>
+        <w:rPr>
+          <w:lang w:val="en-US"/>
+        </w:rPr>
+        <w:t>Challenges Faced:</w:t>
+      </w:r>
+      <w:r>
+        <w:rPr>
+          <w:lang w:val="en-US"/>
+        </w:rPr>
+        <w:br/>
+        <w:t>One challenge was connecting the Streamlit interface with the live camera system while maintaining good performance. Running the camera directly inside Streamlit caused slow performance, so I separated the project into two parts: the Streamlit administrator panel and the Smart Mirror camera engine.</w:t>
+      </w:r>
+    </w:p>
+    <w:p>
+      <w:pPr>
+        <w:rPr>
+          <w:lang w:val="en-US"/>
+        </w:rPr>
+      </w:pPr>
+      <w:r>
+        <w:rPr>
+          <w:lang w:val="en-US"/>
+        </w:rPr>
+        <w:t>Another challenge was gesture accuracy. Some gestures were too similar and caused misclassification. To improve this, I focused on clearer gestures and added gesture stabilization using a history buffer and cooldown logic.</w:t>
+      </w:r>
+    </w:p>
+    <w:p>
+      <w:pPr>
+        <w:rPr>
+          <w:lang w:val="en-US"/>
+        </w:rPr>
+      </w:pPr>
+      <w:r>
+        <w:rPr>
+          <w:lang w:val="en-US"/>
+        </w:rPr>
+        <w:t>Current Status:</w:t>
+      </w:r>
+      <w:r>
+        <w:rPr>
+          <w:lang w:val="en-US"/>
+        </w:rPr>
+        <w:br/>
+        <w:t>The project now has a working user interface connected to the gesture recognition backend. Administrators can customize gesture behavior from the website and launch the Smart Mirror experience from the same interface.</w:t>
+      </w:r>
+    </w:p>
+    <w:p>
+      <w:pPr>
+        <w:rPr>
+          <w:lang w:val="en-US"/>
+        </w:rPr>
+      </w:pPr>
+      <w:r>
+        <w:rPr>
+          <w:lang w:val="en-US"/>
+        </w:rPr>
+        <w:t>Next Steps:</w:t>
+      </w:r>
+      <w:r>
+        <w:rPr>
+          <w:lang w:val="en-US"/>
+        </w:rPr>
+        <w:br/>
+        <w:t>The next improvements will include making gesture recognition more accurate, supporting image/video actions, adding export options for project settings, and improving the final demo experience.</w:t>
+      </w:r>
+    </w:p>
+    <w:p/>
     <w:p>
       <w:r>
         <w:br w:type="page"/>
@@ -5756,8 +5832,14 @@
           <w:numId w:val="7"/>
         </w:numPr>
         <w:spacing w:after="0"/>
-      </w:pPr>
-      <w:r>
+        <w:rPr>
+          <w:highlight w:val="yellow"/>
+        </w:rPr>
+      </w:pPr>
+      <w:r>
+        <w:rPr>
+          <w:highlight w:val="yellow"/>
+        </w:rPr>
         <w:t>☐ Input validation + sanitization</w:t>
       </w:r>
     </w:p>
@@ -5768,14 +5850,15 @@
           <w:numId w:val="7"/>
         </w:numPr>
         <w:spacing w:after="0"/>
-      </w:pPr>
-      <w:proofErr w:type="gramStart"/>
-      <w:r>
-        <w:t>☐ Secrets handling</w:t>
-      </w:r>
-      <w:proofErr w:type="gramEnd"/>
-      <w:r>
-        <w:t xml:space="preserve"> reviewed (no keys in repo)</w:t>
+        <w:rPr>
+          <w:highlight w:val="yellow"/>
+        </w:rPr>
+      </w:pPr>
+      <w:r>
+        <w:rPr>
+          <w:highlight w:val="yellow"/>
+        </w:rPr>
+        <w:t>☐ Secrets handling reviewed (no keys in repo)</w:t>
       </w:r>
     </w:p>
     <w:p>
@@ -5785,8 +5868,14 @@
           <w:numId w:val="7"/>
         </w:numPr>
         <w:spacing w:after="0"/>
-      </w:pPr>
-      <w:r>
+        <w:rPr>
+          <w:highlight w:val="yellow"/>
+        </w:rPr>
+      </w:pPr>
+      <w:r>
+        <w:rPr>
+          <w:highlight w:val="yellow"/>
+        </w:rPr>
         <w:t>☐ Rate limits / caching considered</w:t>
       </w:r>
     </w:p>
@@ -5797,8 +5886,14 @@
           <w:numId w:val="7"/>
         </w:numPr>
         <w:spacing w:after="0"/>
-      </w:pPr>
-      <w:r>
+        <w:rPr>
+          <w:highlight w:val="yellow"/>
+        </w:rPr>
+      </w:pPr>
+      <w:r>
+        <w:rPr>
+          <w:highlight w:val="yellow"/>
+        </w:rPr>
         <w:t>☐ Bug list triaged and reduced</w:t>
       </w:r>
     </w:p>
@@ -5809,8 +5904,14 @@
           <w:numId w:val="7"/>
         </w:numPr>
         <w:spacing w:after="40"/>
-      </w:pPr>
-      <w:r>
+        <w:rPr>
+          <w:highlight w:val="yellow"/>
+        </w:rPr>
+      </w:pPr>
+      <w:r>
+        <w:rPr>
+          <w:highlight w:val="yellow"/>
+        </w:rPr>
         <w:t>☐ README + architecture notes cleaned up</w:t>
       </w:r>
     </w:p>
@@ -5822,7 +5923,7 @@
     <w:tbl>
       <w:tblPr>
         <w:tblStyle w:val="aa"/>
-        <w:tblW w:w="8640" w:type="dxa"/>
+        <w:tblW w:w="10183" w:type="dxa"/>
         <w:tblInd w:w="-108" w:type="dxa"/>
         <w:tblBorders>
           <w:top w:val="single" w:sz="4" w:space="0" w:color="000000"/>
@@ -5836,13 +5937,13 @@
         <w:tblLook w:val="0400" w:firstRow="0" w:lastRow="0" w:firstColumn="0" w:lastColumn="0" w:noHBand="0" w:noVBand="1"/>
       </w:tblPr>
       <w:tblGrid>
-        <w:gridCol w:w="4320"/>
-        <w:gridCol w:w="4320"/>
+        <w:gridCol w:w="1903"/>
+        <w:gridCol w:w="8280"/>
       </w:tblGrid>
       <w:tr>
         <w:tc>
           <w:tcPr>
-            <w:tcW w:w="4320" w:type="dxa"/>
+            <w:tcW w:w="1903" w:type="dxa"/>
           </w:tcPr>
           <w:p>
             <w:r>
@@ -5852,15 +5953,129 @@
         </w:tc>
         <w:tc>
           <w:tcPr>
-            <w:tcW w:w="4320" w:type="dxa"/>
-          </w:tcPr>
+            <w:tcW w:w="8280" w:type="dxa"/>
+          </w:tcPr>
+          <w:tbl>
+            <w:tblPr>
+              <w:tblW w:w="0" w:type="auto"/>
+              <w:tblCellSpacing w:w="15" w:type="dxa"/>
+              <w:tblCellMar>
+                <w:top w:w="15" w:type="dxa"/>
+                <w:left w:w="15" w:type="dxa"/>
+                <w:bottom w:w="15" w:type="dxa"/>
+                <w:right w:w="15" w:type="dxa"/>
+              </w:tblCellMar>
+              <w:tblLook w:val="04A0" w:firstRow="1" w:lastRow="0" w:firstColumn="1" w:lastColumn="0" w:noHBand="0" w:noVBand="1"/>
+            </w:tblPr>
+            <w:tblGrid>
+              <w:gridCol w:w="110"/>
+            </w:tblGrid>
+            <w:tr>
+              <w:trPr>
+                <w:tblCellSpacing w:w="15" w:type="dxa"/>
+              </w:trPr>
+              <w:tc>
+                <w:tcPr>
+                  <w:tcW w:w="36" w:type="dxa"/>
+                  <w:vAlign w:val="center"/>
+                  <w:hideMark/>
+                </w:tcPr>
+                <w:p>
+                  <w:pPr>
+                    <w:spacing w:after="0" w:line="240" w:lineRule="auto"/>
+                    <w:rPr>
+                      <w:lang w:val="en-US"/>
+                    </w:rPr>
+                  </w:pPr>
+                </w:p>
+              </w:tc>
+            </w:tr>
+          </w:tbl>
+          <w:p>
+            <w:pPr>
+              <w:rPr>
+                <w:vanish/>
+                <w:lang w:val="en-US"/>
+              </w:rPr>
+            </w:pPr>
+          </w:p>
+          <w:tbl>
+            <w:tblPr>
+              <w:tblW w:w="0" w:type="auto"/>
+              <w:tblCellSpacing w:w="15" w:type="dxa"/>
+              <w:tblCellMar>
+                <w:top w:w="15" w:type="dxa"/>
+                <w:left w:w="15" w:type="dxa"/>
+                <w:bottom w:w="15" w:type="dxa"/>
+                <w:right w:w="15" w:type="dxa"/>
+              </w:tblCellMar>
+              <w:tblLook w:val="04A0" w:firstRow="1" w:lastRow="0" w:firstColumn="1" w:lastColumn="0" w:noHBand="0" w:noVBand="1"/>
+            </w:tblPr>
+            <w:tblGrid>
+              <w:gridCol w:w="9360"/>
+            </w:tblGrid>
+            <w:tr>
+              <w:trPr>
+                <w:tblCellSpacing w:w="15" w:type="dxa"/>
+              </w:trPr>
+              <w:tc>
+                <w:tcPr>
+                  <w:tcW w:w="9300" w:type="dxa"/>
+                  <w:vAlign w:val="center"/>
+                  <w:hideMark/>
+                </w:tcPr>
+                <w:p>
+                  <w:pPr>
+                    <w:spacing w:after="0" w:line="240" w:lineRule="auto"/>
+                    <w:rPr>
+                      <w:lang w:val="en-US"/>
+                    </w:rPr>
+                  </w:pPr>
+                  <w:r>
+                    <w:rPr>
+                      <w:lang w:val="en-US"/>
+                    </w:rPr>
+                    <w:t xml:space="preserve">Project settings are stored locally in a JSON configuration file. No API keys </w:t>
+                  </w:r>
+                </w:p>
+                <w:p>
+                  <w:pPr>
+                    <w:spacing w:after="0" w:line="240" w:lineRule="auto"/>
+                    <w:rPr>
+                      <w:lang w:val="en-US"/>
+                    </w:rPr>
+                  </w:pPr>
+                  <w:r>
+                    <w:rPr>
+                      <w:lang w:val="en-US"/>
+                    </w:rPr>
+                    <w:t>or sensitive credentials are included in the repository. User inputs are validated</w:t>
+                  </w:r>
+                </w:p>
+                <w:p>
+                  <w:pPr>
+                    <w:spacing w:after="0" w:line="240" w:lineRule="auto"/>
+                    <w:rPr>
+                      <w:lang w:val="en-US"/>
+                    </w:rPr>
+                  </w:pPr>
+                  <w:r>
+                    <w:rPr>
+                      <w:lang w:val="en-US"/>
+                    </w:rPr>
+                    <w:t xml:space="preserve"> before saving, and only predefined gesture options are accepted.</w:t>
+                  </w:r>
+                </w:p>
+              </w:tc>
+            </w:tr>
+          </w:tbl>
           <w:p/>
         </w:tc>
       </w:tr>
       <w:tr>
         <w:tc>
           <w:tcPr>
-            <w:tcW w:w="4320" w:type="dxa"/>
+            <w:tcW w:w="1903" w:type="dxa"/>
           </w:tcPr>
           <w:p>
             <w:r>
@@ -5870,15 +6085,19 @@
         </w:tc>
         <w:tc>
           <w:tcPr>
-            <w:tcW w:w="4320" w:type="dxa"/>
-          </w:tcPr>
-          <w:p/>
+            <w:tcW w:w="8280" w:type="dxa"/>
+          </w:tcPr>
+          <w:p>
+            <w:r>
+              <w:t>Improved gesture stability using gesture smoothing and cooldown logic. Fixed issues with Smart Mirror startup, configuration loading, and interface-to-backend communication. Added better handling when the Smart Mirror is already running or stopped.</w:t>
+            </w:r>
+          </w:p>
         </w:tc>
       </w:tr>
       <w:tr>
         <w:tc>
           <w:tcPr>
-            <w:tcW w:w="4320" w:type="dxa"/>
+            <w:tcW w:w="1903" w:type="dxa"/>
           </w:tcPr>
           <w:p>
             <w:r>
@@ -5888,9 +6107,13 @@
         </w:tc>
         <w:tc>
           <w:tcPr>
-            <w:tcW w:w="4320" w:type="dxa"/>
-          </w:tcPr>
-          <w:p/>
+            <w:tcW w:w="8280" w:type="dxa"/>
+          </w:tcPr>
+          <w:p>
+            <w:r>
+              <w:t>Some similar gestures (e.g., Open Hand vs. Four Fingers or Thumbs Up) may still be misclassified. Future versions will replace rule-based detection with a trained gesture classification model for higher accuracy.</w:t>
+            </w:r>
+          </w:p>
         </w:tc>
       </w:tr>
     </w:tbl>
@@ -5900,23 +6123,49 @@
       </w:r>
     </w:p>
     <w:p>
+      <w:pPr>
+        <w:pStyle w:val="ListParagraph"/>
+        <w:numPr>
+          <w:ilvl w:val="0"/>
+          <w:numId w:val="20"/>
+        </w:numPr>
+        <w:rPr>
+          <w:lang w:val="en-US"/>
+        </w:rPr>
+      </w:pPr>
+      <w:r>
+        <w:rPr>
+          <w:lang w:val="en-US"/>
+        </w:rPr>
+        <w:t xml:space="preserve">Focused on improving application stability instead of adding many new features to provide a smoother user experience. </w:t>
+      </w:r>
+    </w:p>
+    <w:p>
+      <w:pPr>
+        <w:pStyle w:val="ListParagraph"/>
+        <w:numPr>
+          <w:ilvl w:val="0"/>
+          <w:numId w:val="20"/>
+        </w:numPr>
+      </w:pPr>
+      <w:r>
+        <w:rPr>
+          <w:lang w:val="en-US"/>
+        </w:rPr>
+        <w:t>Reviewed the project structure, improved security by avoiding hardcoded sensitive information, and prepared the application for future deployment.</w:t>
+      </w:r>
+    </w:p>
+    <w:p>
+      <w:r>
+        <w:t>Blockers / help needed:</w:t>
+      </w:r>
+    </w:p>
+    <w:p>
       <w:r>
         <w:t xml:space="preserve">• </w:t>
       </w:r>
-    </w:p>
-    <w:p>
-      <w:r>
-        <w:t xml:space="preserve">• </w:t>
-      </w:r>
-    </w:p>
-    <w:p>
-      <w:r>
-        <w:t>Blockers / help needed:</w:t>
-      </w:r>
-    </w:p>
-    <w:p>
-      <w:r>
-        <w:t xml:space="preserve">• </w:t>
+      <w:r>
+        <w:t>Improving recognition accuracy for complex hand gestures requires training a custom machine learning model rather than relying only on rule-based detection.</w:t>
       </w:r>
     </w:p>
     <w:p>
@@ -5945,8 +6194,14 @@
           <w:numId w:val="4"/>
         </w:numPr>
         <w:spacing w:after="0"/>
-      </w:pPr>
-      <w:r>
+        <w:rPr>
+          <w:highlight w:val="yellow"/>
+        </w:rPr>
+      </w:pPr>
+      <w:r>
+        <w:rPr>
+          <w:highlight w:val="yellow"/>
+        </w:rPr>
         <w:t>☐ Deployment target chosen and deployed</w:t>
       </w:r>
     </w:p>
@@ -5957,8 +6212,14 @@
           <w:numId w:val="4"/>
         </w:numPr>
         <w:spacing w:after="0"/>
-      </w:pPr>
-      <w:r>
+        <w:rPr>
+          <w:highlight w:val="yellow"/>
+        </w:rPr>
+      </w:pPr>
+      <w:r>
+        <w:rPr>
+          <w:highlight w:val="yellow"/>
+        </w:rPr>
         <w:t>☐ Environment variables set in deployment platform</w:t>
       </w:r>
     </w:p>
@@ -5969,8 +6230,14 @@
           <w:numId w:val="4"/>
         </w:numPr>
         <w:spacing w:after="0"/>
-      </w:pPr>
-      <w:r>
+        <w:rPr>
+          <w:highlight w:val="yellow"/>
+        </w:rPr>
+      </w:pPr>
+      <w:r>
+        <w:rPr>
+          <w:highlight w:val="yellow"/>
+        </w:rPr>
         <w:t>☐ Smoke tests run on deployed version</w:t>
       </w:r>
     </w:p>
@@ -5981,8 +6248,14 @@
           <w:numId w:val="4"/>
         </w:numPr>
         <w:spacing w:after="0"/>
-      </w:pPr>
-      <w:r>
+        <w:rPr>
+          <w:highlight w:val="yellow"/>
+        </w:rPr>
+      </w:pPr>
+      <w:r>
+        <w:rPr>
+          <w:highlight w:val="yellow"/>
+        </w:rPr>
         <w:t>☐ Performance checked (latency/cost)</w:t>
       </w:r>
     </w:p>
@@ -5993,8 +6266,14 @@
           <w:numId w:val="4"/>
         </w:numPr>
         <w:spacing w:after="40"/>
-      </w:pPr>
-      <w:r>
+        <w:rPr>
+          <w:highlight w:val="yellow"/>
+        </w:rPr>
+      </w:pPr>
+      <w:r>
+        <w:rPr>
+          <w:highlight w:val="yellow"/>
+        </w:rPr>
         <w:t>☐ Submission package checklist started</w:t>
       </w:r>
     </w:p>
@@ -6038,7 +6317,11 @@
           <w:tcPr>
             <w:tcW w:w="4320" w:type="dxa"/>
           </w:tcPr>
-          <w:p/>
+          <w:p>
+            <w:r>
+              <w:t>Local deployment using Streamlit with GitHub as the project repository. Future deployment planned using Streamlit Community Cloud or Hugging Face Spaces.</w:t>
+            </w:r>
+          </w:p>
         </w:tc>
       </w:tr>
       <w:tr>
@@ -6056,7 +6339,99 @@
           <w:tcPr>
             <w:tcW w:w="4320" w:type="dxa"/>
           </w:tcPr>
-          <w:p/>
+          <w:tbl>
+            <w:tblPr>
+              <w:tblW w:w="0" w:type="auto"/>
+              <w:tblCellSpacing w:w="15" w:type="dxa"/>
+              <w:tblCellMar>
+                <w:top w:w="15" w:type="dxa"/>
+                <w:left w:w="15" w:type="dxa"/>
+                <w:bottom w:w="15" w:type="dxa"/>
+                <w:right w:w="15" w:type="dxa"/>
+              </w:tblCellMar>
+              <w:tblLook w:val="04A0" w:firstRow="1" w:lastRow="0" w:firstColumn="1" w:lastColumn="0" w:noHBand="0" w:noVBand="1"/>
+            </w:tblPr>
+            <w:tblGrid>
+              <w:gridCol w:w="110"/>
+            </w:tblGrid>
+            <w:tr>
+              <w:trPr>
+                <w:tblCellSpacing w:w="15" w:type="dxa"/>
+              </w:trPr>
+              <w:tc>
+                <w:tcPr>
+                  <w:tcW w:w="36" w:type="dxa"/>
+                  <w:vAlign w:val="center"/>
+                  <w:hideMark/>
+                </w:tcPr>
+                <w:p>
+                  <w:pPr>
+                    <w:spacing w:after="0" w:line="240" w:lineRule="auto"/>
+                    <w:rPr>
+                      <w:lang w:val="en-US"/>
+                    </w:rPr>
+                  </w:pPr>
+                </w:p>
+              </w:tc>
+            </w:tr>
+          </w:tbl>
+          <w:p>
+            <w:pPr>
+              <w:rPr>
+                <w:vanish/>
+                <w:lang w:val="en-US"/>
+              </w:rPr>
+            </w:pPr>
+          </w:p>
+          <w:tbl>
+            <w:tblPr>
+              <w:tblW w:w="0" w:type="auto"/>
+              <w:tblCellSpacing w:w="15" w:type="dxa"/>
+              <w:tblCellMar>
+                <w:top w:w="15" w:type="dxa"/>
+                <w:left w:w="15" w:type="dxa"/>
+                <w:bottom w:w="15" w:type="dxa"/>
+                <w:right w:w="15" w:type="dxa"/>
+              </w:tblCellMar>
+              <w:tblLook w:val="04A0" w:firstRow="1" w:lastRow="0" w:firstColumn="1" w:lastColumn="0" w:noHBand="0" w:noVBand="1"/>
+            </w:tblPr>
+            <w:tblGrid>
+              <w:gridCol w:w="7348"/>
+            </w:tblGrid>
+            <w:tr>
+              <w:trPr>
+                <w:tblCellSpacing w:w="15" w:type="dxa"/>
+              </w:trPr>
+              <w:tc>
+                <w:tcPr>
+                  <w:tcW w:w="7288" w:type="dxa"/>
+                  <w:vAlign w:val="center"/>
+                  <w:hideMark/>
+                </w:tcPr>
+                <w:p>
+                  <w:pPr>
+                    <w:spacing w:after="0" w:line="240" w:lineRule="auto"/>
+                    <w:rPr>
+                      <w:lang w:val="en-US"/>
+                    </w:rPr>
+                  </w:pPr>
+                  <w:r>
+                    <w:rPr>
+                      <w:lang w:val="en-US"/>
+                    </w:rPr>
+                    <w:t>Localhost (Streamlit) — Cloud deployment planned after final refinements.</w:t>
+                  </w:r>
+                </w:p>
+              </w:tc>
+            </w:tr>
+          </w:tbl>
+          <w:p>
+            <w:pPr>
+              <w:rPr>
+                <w:lang w:val="en-US"/>
+              </w:rPr>
+            </w:pPr>
+          </w:p>
         </w:tc>
       </w:tr>
       <w:tr>
@@ -6074,7 +6449,11 @@
           <w:tcPr>
             <w:tcW w:w="4320" w:type="dxa"/>
           </w:tcPr>
-          <w:p/>
+          <w:p>
+            <w:r>
+              <w:t>Successfully tested configuration saving, Smart Mirror launch, live gesture detection, animation display, customization settings, and application startup without major errors.</w:t>
+            </w:r>
+          </w:p>
         </w:tc>
       </w:tr>
       <w:tr>
@@ -6092,7 +6471,11 @@
           <w:tcPr>
             <w:tcW w:w="4320" w:type="dxa"/>
           </w:tcPr>
-          <w:p/>
+          <w:p>
+            <w:r>
+              <w:t>Run the application locally using Streamlit and the Smart Mirror backend while debugging deployment issues. GitHub repository serves as the backup source for all project files.</w:t>
+            </w:r>
+          </w:p>
         </w:tc>
       </w:tr>
     </w:tbl>
@@ -6102,13 +6485,36 @@
       </w:r>
     </w:p>
     <w:p>
-      <w:r>
-        <w:t xml:space="preserve">• </w:t>
-      </w:r>
-    </w:p>
-    <w:p>
-      <w:r>
-        <w:t xml:space="preserve">• </w:t>
+      <w:pPr>
+        <w:pStyle w:val="ListParagraph"/>
+        <w:numPr>
+          <w:ilvl w:val="0"/>
+          <w:numId w:val="20"/>
+        </w:numPr>
+        <w:rPr>
+          <w:lang w:val="en-US"/>
+        </w:rPr>
+      </w:pPr>
+      <w:r>
+        <w:rPr>
+          <w:lang w:val="en-US"/>
+        </w:rPr>
+        <w:t xml:space="preserve">Focused on preparing the project for demonstration by reviewing the application flow, documentation, and deployment readiness. </w:t>
+      </w:r>
+    </w:p>
+    <w:p>
+      <w:pPr>
+        <w:pStyle w:val="ListParagraph"/>
+        <w:numPr>
+          <w:ilvl w:val="0"/>
+          <w:numId w:val="20"/>
+        </w:numPr>
+      </w:pPr>
+      <w:r>
+        <w:rPr>
+          <w:lang w:val="en-US"/>
+        </w:rPr>
+        <w:t>Chose to prioritize a stable and polished user experience over introducing additional features before the final submission.</w:t>
       </w:r>
     </w:p>
     <w:p>
@@ -6117,15 +6523,344 @@
       </w:r>
     </w:p>
     <w:p>
-      <w:r>
-        <w:t xml:space="preserve">• </w:t>
-      </w:r>
-    </w:p>
-    <w:p>
-      <w:r>
-        <w:br w:type="page"/>
-      </w:r>
-    </w:p>
+      <w:pPr>
+        <w:pStyle w:val="ListParagraph"/>
+        <w:numPr>
+          <w:ilvl w:val="0"/>
+          <w:numId w:val="24"/>
+        </w:numPr>
+      </w:pPr>
+      <w:r>
+        <w:t>Future deployment to a cloud platform will require adapting the application to support webcam access within a browser environment and improving gesture recognition accuracy.</w:t>
+      </w:r>
+    </w:p>
+    <w:p>
+      <w:pPr>
+        <w:rPr>
+          <w:b/>
+          <w:bCs/>
+          <w:lang w:val="en-US"/>
+        </w:rPr>
+      </w:pPr>
+      <w:r>
+        <w:rPr>
+          <w:b/>
+          <w:bCs/>
+          <w:lang w:val="en-US"/>
+        </w:rPr>
+        <w:t>Day 7 Progress Report</w:t>
+      </w:r>
+    </w:p>
+    <w:p>
+      <w:pPr>
+        <w:rPr>
+          <w:b/>
+          <w:bCs/>
+          <w:lang w:val="en-US"/>
+        </w:rPr>
+      </w:pPr>
+      <w:r>
+        <w:rPr>
+          <w:b/>
+          <w:bCs/>
+          <w:lang w:val="en-US"/>
+        </w:rPr>
+        <w:t>Final Review and Deployment</w:t>
+      </w:r>
+    </w:p>
+    <w:p>
+      <w:pPr>
+        <w:rPr>
+          <w:lang w:val="en-US"/>
+        </w:rPr>
+      </w:pPr>
+      <w:r>
+        <w:rPr>
+          <w:lang w:val="en-US"/>
+        </w:rPr>
+        <w:t>On Day 7, I focused on reviewing the overall architecture of Gesture AI Studios and preparing the project for its final demonstration. The application's interface, gesture recognition backend, documentation, and GitHub repository were reviewed to ensure they accurately represent the work completed throughout the challenge.</w:t>
+      </w:r>
+    </w:p>
+    <w:p>
+      <w:pPr>
+        <w:rPr>
+          <w:b/>
+          <w:bCs/>
+          <w:lang w:val="en-US"/>
+        </w:rPr>
+      </w:pPr>
+      <w:r>
+        <w:rPr>
+          <w:b/>
+          <w:bCs/>
+          <w:lang w:val="en-US"/>
+        </w:rPr>
+        <w:lastRenderedPageBreak/>
+        <w:t>Deployment Preparation</w:t>
+      </w:r>
+    </w:p>
+    <w:p>
+      <w:pPr>
+        <w:rPr>
+          <w:lang w:val="en-US"/>
+        </w:rPr>
+      </w:pPr>
+      <w:r>
+        <w:rPr>
+          <w:lang w:val="en-US"/>
+        </w:rPr>
+        <w:t>The administrator interface is fully operational using Streamlit and communicates successfully with the Smart Mirror backend. Configuration settings are saved through a JSON file and applied in real time when launching the Smart Mirror.</w:t>
+      </w:r>
+    </w:p>
+    <w:p>
+      <w:pPr>
+        <w:rPr>
+          <w:lang w:val="en-US"/>
+        </w:rPr>
+      </w:pPr>
+      <w:r>
+        <w:rPr>
+          <w:lang w:val="en-US"/>
+        </w:rPr>
+        <w:t>Although the project currently runs locally, the codebase has been organized to support future deployment using platforms such as Streamlit Community Cloud or Hugging Face Spaces.</w:t>
+      </w:r>
+    </w:p>
+    <w:p>
+      <w:pPr>
+        <w:rPr>
+          <w:b/>
+          <w:bCs/>
+          <w:lang w:val="en-US"/>
+        </w:rPr>
+      </w:pPr>
+      <w:r>
+        <w:rPr>
+          <w:b/>
+          <w:bCs/>
+          <w:lang w:val="en-US"/>
+        </w:rPr>
+        <w:t>Testing</w:t>
+      </w:r>
+    </w:p>
+    <w:p>
+      <w:pPr>
+        <w:rPr>
+          <w:lang w:val="en-US"/>
+        </w:rPr>
+      </w:pPr>
+      <w:r>
+        <w:rPr>
+          <w:lang w:val="en-US"/>
+        </w:rPr>
+        <w:t>Multiple end-to-end tests were performed to verify the complete workflow:</w:t>
+      </w:r>
+    </w:p>
+    <w:p>
+      <w:pPr>
+        <w:numPr>
+          <w:ilvl w:val="0"/>
+          <w:numId w:val="25"/>
+        </w:numPr>
+        <w:rPr>
+          <w:lang w:val="en-US"/>
+        </w:rPr>
+      </w:pPr>
+      <w:r>
+        <w:rPr>
+          <w:lang w:val="en-US"/>
+        </w:rPr>
+        <w:t>Opening the administrator dashboard.</w:t>
+      </w:r>
+    </w:p>
+    <w:p>
+      <w:pPr>
+        <w:numPr>
+          <w:ilvl w:val="0"/>
+          <w:numId w:val="25"/>
+        </w:numPr>
+        <w:rPr>
+          <w:lang w:val="en-US"/>
+        </w:rPr>
+      </w:pPr>
+      <w:r>
+        <w:rPr>
+          <w:lang w:val="en-US"/>
+        </w:rPr>
+        <w:t>Customizing gesture actions.</w:t>
+      </w:r>
+    </w:p>
+    <w:p>
+      <w:pPr>
+        <w:numPr>
+          <w:ilvl w:val="0"/>
+          <w:numId w:val="25"/>
+        </w:numPr>
+        <w:rPr>
+          <w:lang w:val="en-US"/>
+        </w:rPr>
+      </w:pPr>
+      <w:r>
+        <w:rPr>
+          <w:lang w:val="en-US"/>
+        </w:rPr>
+        <w:t>Saving configuration settings.</w:t>
+      </w:r>
+    </w:p>
+    <w:p>
+      <w:pPr>
+        <w:numPr>
+          <w:ilvl w:val="0"/>
+          <w:numId w:val="25"/>
+        </w:numPr>
+        <w:rPr>
+          <w:lang w:val="en-US"/>
+        </w:rPr>
+      </w:pPr>
+      <w:r>
+        <w:rPr>
+          <w:lang w:val="en-US"/>
+        </w:rPr>
+        <w:t>Launching the Smart Mirror.</w:t>
+      </w:r>
+    </w:p>
+    <w:p>
+      <w:pPr>
+        <w:numPr>
+          <w:ilvl w:val="0"/>
+          <w:numId w:val="25"/>
+        </w:numPr>
+        <w:rPr>
+          <w:lang w:val="en-US"/>
+        </w:rPr>
+      </w:pPr>
+      <w:r>
+        <w:rPr>
+          <w:lang w:val="en-US"/>
+        </w:rPr>
+        <w:t>Detecting gestures.</w:t>
+      </w:r>
+    </w:p>
+    <w:p>
+      <w:pPr>
+        <w:numPr>
+          <w:ilvl w:val="0"/>
+          <w:numId w:val="25"/>
+        </w:numPr>
+        <w:rPr>
+          <w:lang w:val="en-US"/>
+        </w:rPr>
+      </w:pPr>
+      <w:r>
+        <w:rPr>
+          <w:lang w:val="en-US"/>
+        </w:rPr>
+        <w:t>Displaying customized messages, colors, and animations.</w:t>
+      </w:r>
+    </w:p>
+    <w:p>
+      <w:pPr>
+        <w:rPr>
+          <w:lang w:val="en-US"/>
+        </w:rPr>
+      </w:pPr>
+      <w:r>
+        <w:rPr>
+          <w:lang w:val="en-US"/>
+        </w:rPr>
+        <w:t>These tests confirmed that the application functions correctly under normal usage.</w:t>
+      </w:r>
+    </w:p>
+    <w:p>
+      <w:pPr>
+        <w:rPr>
+          <w:b/>
+          <w:bCs/>
+          <w:lang w:val="en-US"/>
+        </w:rPr>
+      </w:pPr>
+      <w:r>
+        <w:rPr>
+          <w:b/>
+          <w:bCs/>
+          <w:lang w:val="en-US"/>
+        </w:rPr>
+        <w:t>Documentation</w:t>
+      </w:r>
+    </w:p>
+    <w:p>
+      <w:pPr>
+        <w:rPr>
+          <w:lang w:val="en-US"/>
+        </w:rPr>
+      </w:pPr>
+      <w:r>
+        <w:rPr>
+          <w:lang w:val="en-US"/>
+        </w:rPr>
+        <w:t>The GitHub repository has been updated with project files, documentation, screenshots, and progress reports. The project structure has also been reviewed to improve readability and maintainability.</w:t>
+      </w:r>
+    </w:p>
+    <w:p>
+      <w:pPr>
+        <w:rPr>
+          <w:b/>
+          <w:bCs/>
+          <w:lang w:val="en-US"/>
+        </w:rPr>
+      </w:pPr>
+      <w:r>
+        <w:rPr>
+          <w:b/>
+          <w:bCs/>
+          <w:lang w:val="en-US"/>
+        </w:rPr>
+        <w:t>Current Status</w:t>
+      </w:r>
+    </w:p>
+    <w:p>
+      <w:pPr>
+        <w:rPr>
+          <w:lang w:val="en-US"/>
+        </w:rPr>
+      </w:pPr>
+      <w:r>
+        <w:rPr>
+          <w:lang w:val="en-US"/>
+        </w:rPr>
+        <w:t>Gesture AI Studios now consists of a customizable administrator dashboard connected to a real-time AI-powered Smart Mirror capable of recognizing hand gestures and triggering interactive experiences.</w:t>
+      </w:r>
+    </w:p>
+    <w:p>
+      <w:pPr>
+        <w:rPr>
+          <w:b/>
+          <w:bCs/>
+          <w:lang w:val="en-US"/>
+        </w:rPr>
+      </w:pPr>
+      <w:r>
+        <w:rPr>
+          <w:b/>
+          <w:bCs/>
+          <w:lang w:val="en-US"/>
+        </w:rPr>
+        <w:t>Future Improvements</w:t>
+      </w:r>
+    </w:p>
+    <w:p>
+      <w:pPr>
+        <w:rPr>
+          <w:lang w:val="en-US"/>
+        </w:rPr>
+      </w:pPr>
+      <w:r>
+        <w:rPr>
+          <w:lang w:val="en-US"/>
+        </w:rPr>
+        <w:t>Future development will focus on replacing the current rule-based gesture recognition with a machine learning classifier trained on custom gesture datasets. Additional improvements include cloud deployment, multimedia interactions, project templates, gesture sequences, and multi-user support.</w:t>
+      </w:r>
+    </w:p>
+    <w:p/>
     <w:p>
       <w:pPr>
         <w:pStyle w:val="Heading1"/>
@@ -7158,6 +7893,119 @@
     </w:lvl>
   </w:abstractNum>
   <w:abstractNum w:abstractNumId="3" w15:restartNumberingAfterBreak="0">
+    <w:nsid w:val="0CEE4655"/>
+    <w:multiLevelType w:val="hybridMultilevel"/>
+    <w:tmpl w:val="CFC2BD0E"/>
+    <w:lvl w:ilvl="0" w:tplc="04090001">
+      <w:start w:val="1"/>
+      <w:numFmt w:val="bullet"/>
+      <w:lvlText w:val=""/>
+      <w:lvlJc w:val="left"/>
+      <w:pPr>
+        <w:ind w:left="720" w:hanging="360"/>
+      </w:pPr>
+      <w:rPr>
+        <w:rFonts w:ascii="Symbol" w:hAnsi="Symbol" w:hint="default"/>
+      </w:rPr>
+    </w:lvl>
+    <w:lvl w:ilvl="1" w:tplc="04090003" w:tentative="1">
+      <w:start w:val="1"/>
+      <w:numFmt w:val="bullet"/>
+      <w:lvlText w:val="o"/>
+      <w:lvlJc w:val="left"/>
+      <w:pPr>
+        <w:ind w:left="1440" w:hanging="360"/>
+      </w:pPr>
+      <w:rPr>
+        <w:rFonts w:ascii="Courier New" w:hAnsi="Courier New" w:cs="Courier New" w:hint="default"/>
+      </w:rPr>
+    </w:lvl>
+    <w:lvl w:ilvl="2" w:tplc="04090005" w:tentative="1">
+      <w:start w:val="1"/>
+      <w:numFmt w:val="bullet"/>
+      <w:lvlText w:val=""/>
+      <w:lvlJc w:val="left"/>
+      <w:pPr>
+        <w:ind w:left="2160" w:hanging="360"/>
+      </w:pPr>
+      <w:rPr>
+        <w:rFonts w:ascii="Wingdings" w:hAnsi="Wingdings" w:hint="default"/>
+      </w:rPr>
+    </w:lvl>
+    <w:lvl w:ilvl="3" w:tplc="04090001" w:tentative="1">
+      <w:start w:val="1"/>
+      <w:numFmt w:val="bullet"/>
+      <w:lvlText w:val=""/>
+      <w:lvlJc w:val="left"/>
+      <w:pPr>
+        <w:ind w:left="2880" w:hanging="360"/>
+      </w:pPr>
+      <w:rPr>
+        <w:rFonts w:ascii="Symbol" w:hAnsi="Symbol" w:hint="default"/>
+      </w:rPr>
+    </w:lvl>
+    <w:lvl w:ilvl="4" w:tplc="04090003" w:tentative="1">
+      <w:start w:val="1"/>
+      <w:numFmt w:val="bullet"/>
+      <w:lvlText w:val="o"/>
+      <w:lvlJc w:val="left"/>
+      <w:pPr>
+        <w:ind w:left="3600" w:hanging="360"/>
+      </w:pPr>
+      <w:rPr>
+        <w:rFonts w:ascii="Courier New" w:hAnsi="Courier New" w:cs="Courier New" w:hint="default"/>
+      </w:rPr>
+    </w:lvl>
+    <w:lvl w:ilvl="5" w:tplc="04090005" w:tentative="1">
+      <w:start w:val="1"/>
+      <w:numFmt w:val="bullet"/>
+      <w:lvlText w:val=""/>
+      <w:lvlJc w:val="left"/>
+      <w:pPr>
+        <w:ind w:left="4320" w:hanging="360"/>
+      </w:pPr>
+      <w:rPr>
+        <w:rFonts w:ascii="Wingdings" w:hAnsi="Wingdings" w:hint="default"/>
+      </w:rPr>
+    </w:lvl>
+    <w:lvl w:ilvl="6" w:tplc="04090001" w:tentative="1">
+      <w:start w:val="1"/>
+      <w:numFmt w:val="bullet"/>
+      <w:lvlText w:val=""/>
+      <w:lvlJc w:val="left"/>
+      <w:pPr>
+        <w:ind w:left="5040" w:hanging="360"/>
+      </w:pPr>
+      <w:rPr>
+        <w:rFonts w:ascii="Symbol" w:hAnsi="Symbol" w:hint="default"/>
+      </w:rPr>
+    </w:lvl>
+    <w:lvl w:ilvl="7" w:tplc="04090003" w:tentative="1">
+      <w:start w:val="1"/>
+      <w:numFmt w:val="bullet"/>
+      <w:lvlText w:val="o"/>
+      <w:lvlJc w:val="left"/>
+      <w:pPr>
+        <w:ind w:left="5760" w:hanging="360"/>
+      </w:pPr>
+      <w:rPr>
+        <w:rFonts w:ascii="Courier New" w:hAnsi="Courier New" w:cs="Courier New" w:hint="default"/>
+      </w:rPr>
+    </w:lvl>
+    <w:lvl w:ilvl="8" w:tplc="04090005" w:tentative="1">
+      <w:start w:val="1"/>
+      <w:numFmt w:val="bullet"/>
+      <w:lvlText w:val=""/>
+      <w:lvlJc w:val="left"/>
+      <w:pPr>
+        <w:ind w:left="6480" w:hanging="360"/>
+      </w:pPr>
+      <w:rPr>
+        <w:rFonts w:ascii="Wingdings" w:hAnsi="Wingdings" w:hint="default"/>
+      </w:rPr>
+    </w:lvl>
+  </w:abstractNum>
+  <w:abstractNum w:abstractNumId="4" w15:restartNumberingAfterBreak="0">
     <w:nsid w:val="0FDB0959"/>
     <w:multiLevelType w:val="multilevel"/>
     <w:tmpl w:val="B4362476"/>
@@ -7270,7 +8118,7 @@
       </w:rPr>
     </w:lvl>
   </w:abstractNum>
-  <w:abstractNum w:abstractNumId="4" w15:restartNumberingAfterBreak="0">
+  <w:abstractNum w:abstractNumId="5" w15:restartNumberingAfterBreak="0">
     <w:nsid w:val="155F187D"/>
     <w:multiLevelType w:val="hybridMultilevel"/>
     <w:tmpl w:val="4266A608"/>
@@ -7383,7 +8231,7 @@
       </w:rPr>
     </w:lvl>
   </w:abstractNum>
-  <w:abstractNum w:abstractNumId="5" w15:restartNumberingAfterBreak="0">
+  <w:abstractNum w:abstractNumId="6" w15:restartNumberingAfterBreak="0">
     <w:nsid w:val="15935AC0"/>
     <w:multiLevelType w:val="multilevel"/>
     <w:tmpl w:val="89B68FD4"/>
@@ -7496,7 +8344,7 @@
       </w:rPr>
     </w:lvl>
   </w:abstractNum>
-  <w:abstractNum w:abstractNumId="6" w15:restartNumberingAfterBreak="0">
+  <w:abstractNum w:abstractNumId="7" w15:restartNumberingAfterBreak="0">
     <w:nsid w:val="15B921A5"/>
     <w:multiLevelType w:val="multilevel"/>
     <w:tmpl w:val="E9D65116"/>
@@ -7609,7 +8457,7 @@
       </w:rPr>
     </w:lvl>
   </w:abstractNum>
-  <w:abstractNum w:abstractNumId="7" w15:restartNumberingAfterBreak="0">
+  <w:abstractNum w:abstractNumId="8" w15:restartNumberingAfterBreak="0">
     <w:nsid w:val="1CBC1F86"/>
     <w:multiLevelType w:val="multilevel"/>
     <w:tmpl w:val="18B65EB6"/>
@@ -7722,7 +8570,120 @@
       </w:rPr>
     </w:lvl>
   </w:abstractNum>
-  <w:abstractNum w:abstractNumId="8" w15:restartNumberingAfterBreak="0">
+  <w:abstractNum w:abstractNumId="9" w15:restartNumberingAfterBreak="0">
+    <w:nsid w:val="1F8E5404"/>
+    <w:multiLevelType w:val="hybridMultilevel"/>
+    <w:tmpl w:val="CDC826FC"/>
+    <w:lvl w:ilvl="0" w:tplc="04090001">
+      <w:start w:val="1"/>
+      <w:numFmt w:val="bullet"/>
+      <w:lvlText w:val=""/>
+      <w:lvlJc w:val="left"/>
+      <w:pPr>
+        <w:ind w:left="720" w:hanging="360"/>
+      </w:pPr>
+      <w:rPr>
+        <w:rFonts w:ascii="Symbol" w:hAnsi="Symbol" w:hint="default"/>
+      </w:rPr>
+    </w:lvl>
+    <w:lvl w:ilvl="1" w:tplc="04090003" w:tentative="1">
+      <w:start w:val="1"/>
+      <w:numFmt w:val="bullet"/>
+      <w:lvlText w:val="o"/>
+      <w:lvlJc w:val="left"/>
+      <w:pPr>
+        <w:ind w:left="1440" w:hanging="360"/>
+      </w:pPr>
+      <w:rPr>
+        <w:rFonts w:ascii="Courier New" w:hAnsi="Courier New" w:cs="Courier New" w:hint="default"/>
+      </w:rPr>
+    </w:lvl>
+    <w:lvl w:ilvl="2" w:tplc="04090005" w:tentative="1">
+      <w:start w:val="1"/>
+      <w:numFmt w:val="bullet"/>
+      <w:lvlText w:val=""/>
+      <w:lvlJc w:val="left"/>
+      <w:pPr>
+        <w:ind w:left="2160" w:hanging="360"/>
+      </w:pPr>
+      <w:rPr>
+        <w:rFonts w:ascii="Wingdings" w:hAnsi="Wingdings" w:hint="default"/>
+      </w:rPr>
+    </w:lvl>
+    <w:lvl w:ilvl="3" w:tplc="04090001" w:tentative="1">
+      <w:start w:val="1"/>
+      <w:numFmt w:val="bullet"/>
+      <w:lvlText w:val=""/>
+      <w:lvlJc w:val="left"/>
+      <w:pPr>
+        <w:ind w:left="2880" w:hanging="360"/>
+      </w:pPr>
+      <w:rPr>
+        <w:rFonts w:ascii="Symbol" w:hAnsi="Symbol" w:hint="default"/>
+      </w:rPr>
+    </w:lvl>
+    <w:lvl w:ilvl="4" w:tplc="04090003" w:tentative="1">
+      <w:start w:val="1"/>
+      <w:numFmt w:val="bullet"/>
+      <w:lvlText w:val="o"/>
+      <w:lvlJc w:val="left"/>
+      <w:pPr>
+        <w:ind w:left="3600" w:hanging="360"/>
+      </w:pPr>
+      <w:rPr>
+        <w:rFonts w:ascii="Courier New" w:hAnsi="Courier New" w:cs="Courier New" w:hint="default"/>
+      </w:rPr>
+    </w:lvl>
+    <w:lvl w:ilvl="5" w:tplc="04090005" w:tentative="1">
+      <w:start w:val="1"/>
+      <w:numFmt w:val="bullet"/>
+      <w:lvlText w:val=""/>
+      <w:lvlJc w:val="left"/>
+      <w:pPr>
+        <w:ind w:left="4320" w:hanging="360"/>
+      </w:pPr>
+      <w:rPr>
+        <w:rFonts w:ascii="Wingdings" w:hAnsi="Wingdings" w:hint="default"/>
+      </w:rPr>
+    </w:lvl>
+    <w:lvl w:ilvl="6" w:tplc="04090001" w:tentative="1">
+      <w:start w:val="1"/>
+      <w:numFmt w:val="bullet"/>
+      <w:lvlText w:val=""/>
+      <w:lvlJc w:val="left"/>
+      <w:pPr>
+        <w:ind w:left="5040" w:hanging="360"/>
+      </w:pPr>
+      <w:rPr>
+        <w:rFonts w:ascii="Symbol" w:hAnsi="Symbol" w:hint="default"/>
+      </w:rPr>
+    </w:lvl>
+    <w:lvl w:ilvl="7" w:tplc="04090003" w:tentative="1">
+      <w:start w:val="1"/>
+      <w:numFmt w:val="bullet"/>
+      <w:lvlText w:val="o"/>
+      <w:lvlJc w:val="left"/>
+      <w:pPr>
+        <w:ind w:left="5760" w:hanging="360"/>
+      </w:pPr>
+      <w:rPr>
+        <w:rFonts w:ascii="Courier New" w:hAnsi="Courier New" w:cs="Courier New" w:hint="default"/>
+      </w:rPr>
+    </w:lvl>
+    <w:lvl w:ilvl="8" w:tplc="04090005" w:tentative="1">
+      <w:start w:val="1"/>
+      <w:numFmt w:val="bullet"/>
+      <w:lvlText w:val=""/>
+      <w:lvlJc w:val="left"/>
+      <w:pPr>
+        <w:ind w:left="6480" w:hanging="360"/>
+      </w:pPr>
+      <w:rPr>
+        <w:rFonts w:ascii="Wingdings" w:hAnsi="Wingdings" w:hint="default"/>
+      </w:rPr>
+    </w:lvl>
+  </w:abstractNum>
+  <w:abstractNum w:abstractNumId="10" w15:restartNumberingAfterBreak="0">
     <w:nsid w:val="1FB35F6E"/>
     <w:multiLevelType w:val="hybridMultilevel"/>
     <w:tmpl w:val="6CD00770"/>
@@ -7834,7 +8795,7 @@
       </w:rPr>
     </w:lvl>
   </w:abstractNum>
-  <w:abstractNum w:abstractNumId="9" w15:restartNumberingAfterBreak="0">
+  <w:abstractNum w:abstractNumId="11" w15:restartNumberingAfterBreak="0">
     <w:nsid w:val="24377F16"/>
     <w:multiLevelType w:val="multilevel"/>
     <w:tmpl w:val="6E2C138E"/>
@@ -7983,7 +8944,7 @@
       </w:rPr>
     </w:lvl>
   </w:abstractNum>
-  <w:abstractNum w:abstractNumId="10" w15:restartNumberingAfterBreak="0">
+  <w:abstractNum w:abstractNumId="12" w15:restartNumberingAfterBreak="0">
     <w:nsid w:val="27E7760C"/>
     <w:multiLevelType w:val="multilevel"/>
     <w:tmpl w:val="D262B3C6"/>
@@ -8132,7 +9093,7 @@
       </w:rPr>
     </w:lvl>
   </w:abstractNum>
-  <w:abstractNum w:abstractNumId="11" w15:restartNumberingAfterBreak="0">
+  <w:abstractNum w:abstractNumId="13" w15:restartNumberingAfterBreak="0">
     <w:nsid w:val="30C828CB"/>
     <w:multiLevelType w:val="hybridMultilevel"/>
     <w:tmpl w:val="A7620370"/>
@@ -8244,7 +9205,120 @@
       </w:rPr>
     </w:lvl>
   </w:abstractNum>
-  <w:abstractNum w:abstractNumId="12" w15:restartNumberingAfterBreak="0">
+  <w:abstractNum w:abstractNumId="14" w15:restartNumberingAfterBreak="0">
+    <w:nsid w:val="36D7205A"/>
+    <w:multiLevelType w:val="hybridMultilevel"/>
+    <w:tmpl w:val="BB82E778"/>
+    <w:lvl w:ilvl="0" w:tplc="04090001">
+      <w:start w:val="1"/>
+      <w:numFmt w:val="bullet"/>
+      <w:lvlText w:val=""/>
+      <w:lvlJc w:val="left"/>
+      <w:pPr>
+        <w:ind w:left="720" w:hanging="360"/>
+      </w:pPr>
+      <w:rPr>
+        <w:rFonts w:ascii="Symbol" w:hAnsi="Symbol" w:hint="default"/>
+      </w:rPr>
+    </w:lvl>
+    <w:lvl w:ilvl="1" w:tplc="04090003" w:tentative="1">
+      <w:start w:val="1"/>
+      <w:numFmt w:val="bullet"/>
+      <w:lvlText w:val="o"/>
+      <w:lvlJc w:val="left"/>
+      <w:pPr>
+        <w:ind w:left="1440" w:hanging="360"/>
+      </w:pPr>
+      <w:rPr>
+        <w:rFonts w:ascii="Courier New" w:hAnsi="Courier New" w:cs="Courier New" w:hint="default"/>
+      </w:rPr>
+    </w:lvl>
+    <w:lvl w:ilvl="2" w:tplc="04090005" w:tentative="1">
+      <w:start w:val="1"/>
+      <w:numFmt w:val="bullet"/>
+      <w:lvlText w:val=""/>
+      <w:lvlJc w:val="left"/>
+      <w:pPr>
+        <w:ind w:left="2160" w:hanging="360"/>
+      </w:pPr>
+      <w:rPr>
+        <w:rFonts w:ascii="Wingdings" w:hAnsi="Wingdings" w:hint="default"/>
+      </w:rPr>
+    </w:lvl>
+    <w:lvl w:ilvl="3" w:tplc="04090001" w:tentative="1">
+      <w:start w:val="1"/>
+      <w:numFmt w:val="bullet"/>
+      <w:lvlText w:val=""/>
+      <w:lvlJc w:val="left"/>
+      <w:pPr>
+        <w:ind w:left="2880" w:hanging="360"/>
+      </w:pPr>
+      <w:rPr>
+        <w:rFonts w:ascii="Symbol" w:hAnsi="Symbol" w:hint="default"/>
+      </w:rPr>
+    </w:lvl>
+    <w:lvl w:ilvl="4" w:tplc="04090003" w:tentative="1">
+      <w:start w:val="1"/>
+      <w:numFmt w:val="bullet"/>
+      <w:lvlText w:val="o"/>
+      <w:lvlJc w:val="left"/>
+      <w:pPr>
+        <w:ind w:left="3600" w:hanging="360"/>
+      </w:pPr>
+      <w:rPr>
+        <w:rFonts w:ascii="Courier New" w:hAnsi="Courier New" w:cs="Courier New" w:hint="default"/>
+      </w:rPr>
+    </w:lvl>
+    <w:lvl w:ilvl="5" w:tplc="04090005" w:tentative="1">
+      <w:start w:val="1"/>
+      <w:numFmt w:val="bullet"/>
+      <w:lvlText w:val=""/>
+      <w:lvlJc w:val="left"/>
+      <w:pPr>
+        <w:ind w:left="4320" w:hanging="360"/>
+      </w:pPr>
+      <w:rPr>
+        <w:rFonts w:ascii="Wingdings" w:hAnsi="Wingdings" w:hint="default"/>
+      </w:rPr>
+    </w:lvl>
+    <w:lvl w:ilvl="6" w:tplc="04090001" w:tentative="1">
+      <w:start w:val="1"/>
+      <w:numFmt w:val="bullet"/>
+      <w:lvlText w:val=""/>
+      <w:lvlJc w:val="left"/>
+      <w:pPr>
+        <w:ind w:left="5040" w:hanging="360"/>
+      </w:pPr>
+      <w:rPr>
+        <w:rFonts w:ascii="Symbol" w:hAnsi="Symbol" w:hint="default"/>
+      </w:rPr>
+    </w:lvl>
+    <w:lvl w:ilvl="7" w:tplc="04090003" w:tentative="1">
+      <w:start w:val="1"/>
+      <w:numFmt w:val="bullet"/>
+      <w:lvlText w:val="o"/>
+      <w:lvlJc w:val="left"/>
+      <w:pPr>
+        <w:ind w:left="5760" w:hanging="360"/>
+      </w:pPr>
+      <w:rPr>
+        <w:rFonts w:ascii="Courier New" w:hAnsi="Courier New" w:cs="Courier New" w:hint="default"/>
+      </w:rPr>
+    </w:lvl>
+    <w:lvl w:ilvl="8" w:tplc="04090005" w:tentative="1">
+      <w:start w:val="1"/>
+      <w:numFmt w:val="bullet"/>
+      <w:lvlText w:val=""/>
+      <w:lvlJc w:val="left"/>
+      <w:pPr>
+        <w:ind w:left="6480" w:hanging="360"/>
+      </w:pPr>
+      <w:rPr>
+        <w:rFonts w:ascii="Wingdings" w:hAnsi="Wingdings" w:hint="default"/>
+      </w:rPr>
+    </w:lvl>
+  </w:abstractNum>
+  <w:abstractNum w:abstractNumId="15" w15:restartNumberingAfterBreak="0">
     <w:nsid w:val="42B260B7"/>
     <w:multiLevelType w:val="multilevel"/>
     <w:tmpl w:val="0B74B46E"/>
@@ -8393,7 +9467,7 @@
       </w:rPr>
     </w:lvl>
   </w:abstractNum>
-  <w:abstractNum w:abstractNumId="13" w15:restartNumberingAfterBreak="0">
+  <w:abstractNum w:abstractNumId="16" w15:restartNumberingAfterBreak="0">
     <w:nsid w:val="45965C31"/>
     <w:multiLevelType w:val="multilevel"/>
     <w:tmpl w:val="FAF2A56C"/>
@@ -8542,7 +9616,7 @@
       </w:rPr>
     </w:lvl>
   </w:abstractNum>
-  <w:abstractNum w:abstractNumId="14" w15:restartNumberingAfterBreak="0">
+  <w:abstractNum w:abstractNumId="17" w15:restartNumberingAfterBreak="0">
     <w:nsid w:val="48B50FC6"/>
     <w:multiLevelType w:val="multilevel"/>
     <w:tmpl w:val="AEF4799A"/>
@@ -8655,7 +9729,7 @@
       </w:rPr>
     </w:lvl>
   </w:abstractNum>
-  <w:abstractNum w:abstractNumId="15" w15:restartNumberingAfterBreak="0">
+  <w:abstractNum w:abstractNumId="18" w15:restartNumberingAfterBreak="0">
     <w:nsid w:val="5F90624B"/>
     <w:multiLevelType w:val="multilevel"/>
     <w:tmpl w:val="5D54B6EE"/>
@@ -8768,7 +9842,7 @@
       </w:rPr>
     </w:lvl>
   </w:abstractNum>
-  <w:abstractNum w:abstractNumId="16" w15:restartNumberingAfterBreak="0">
+  <w:abstractNum w:abstractNumId="19" w15:restartNumberingAfterBreak="0">
     <w:nsid w:val="6D4C5AB3"/>
     <w:multiLevelType w:val="hybridMultilevel"/>
     <w:tmpl w:val="8B92E3A4"/>
@@ -8880,7 +9954,156 @@
       </w:rPr>
     </w:lvl>
   </w:abstractNum>
-  <w:abstractNum w:abstractNumId="17" w15:restartNumberingAfterBreak="0">
+  <w:abstractNum w:abstractNumId="20" w15:restartNumberingAfterBreak="0">
+    <w:nsid w:val="6FE50269"/>
+    <w:multiLevelType w:val="multilevel"/>
+    <w:tmpl w:val="41BAF926"/>
+    <w:lvl w:ilvl="0">
+      <w:start w:val="1"/>
+      <w:numFmt w:val="bullet"/>
+      <w:lvlText w:val=""/>
+      <w:lvlJc w:val="left"/>
+      <w:pPr>
+        <w:tabs>
+          <w:tab w:val="num" w:pos="720"/>
+        </w:tabs>
+        <w:ind w:left="720" w:hanging="360"/>
+      </w:pPr>
+      <w:rPr>
+        <w:rFonts w:ascii="Symbol" w:hAnsi="Symbol" w:hint="default"/>
+        <w:sz w:val="20"/>
+      </w:rPr>
+    </w:lvl>
+    <w:lvl w:ilvl="1" w:tentative="1">
+      <w:start w:val="1"/>
+      <w:numFmt w:val="bullet"/>
+      <w:lvlText w:val="o"/>
+      <w:lvlJc w:val="left"/>
+      <w:pPr>
+        <w:tabs>
+          <w:tab w:val="num" w:pos="1440"/>
+        </w:tabs>
+        <w:ind w:left="1440" w:hanging="360"/>
+      </w:pPr>
+      <w:rPr>
+        <w:rFonts w:ascii="Courier New" w:hAnsi="Courier New" w:hint="default"/>
+        <w:sz w:val="20"/>
+      </w:rPr>
+    </w:lvl>
+    <w:lvl w:ilvl="2" w:tentative="1">
+      <w:start w:val="1"/>
+      <w:numFmt w:val="bullet"/>
+      <w:lvlText w:val=""/>
+      <w:lvlJc w:val="left"/>
+      <w:pPr>
+        <w:tabs>
+          <w:tab w:val="num" w:pos="2160"/>
+        </w:tabs>
+        <w:ind w:left="2160" w:hanging="360"/>
+      </w:pPr>
+      <w:rPr>
+        <w:rFonts w:ascii="Wingdings" w:hAnsi="Wingdings" w:hint="default"/>
+        <w:sz w:val="20"/>
+      </w:rPr>
+    </w:lvl>
+    <w:lvl w:ilvl="3" w:tentative="1">
+      <w:start w:val="1"/>
+      <w:numFmt w:val="bullet"/>
+      <w:lvlText w:val=""/>
+      <w:lvlJc w:val="left"/>
+      <w:pPr>
+        <w:tabs>
+          <w:tab w:val="num" w:pos="2880"/>
+        </w:tabs>
+        <w:ind w:left="2880" w:hanging="360"/>
+      </w:pPr>
+      <w:rPr>
+        <w:rFonts w:ascii="Wingdings" w:hAnsi="Wingdings" w:hint="default"/>
+        <w:sz w:val="20"/>
+      </w:rPr>
+    </w:lvl>
+    <w:lvl w:ilvl="4" w:tentative="1">
+      <w:start w:val="1"/>
+      <w:numFmt w:val="bullet"/>
+      <w:lvlText w:val=""/>
+      <w:lvlJc w:val="left"/>
+      <w:pPr>
+        <w:tabs>
+          <w:tab w:val="num" w:pos="3600"/>
+        </w:tabs>
+        <w:ind w:left="3600" w:hanging="360"/>
+      </w:pPr>
+      <w:rPr>
+        <w:rFonts w:ascii="Wingdings" w:hAnsi="Wingdings" w:hint="default"/>
+        <w:sz w:val="20"/>
+      </w:rPr>
+    </w:lvl>
+    <w:lvl w:ilvl="5" w:tentative="1">
+      <w:start w:val="1"/>
+      <w:numFmt w:val="bullet"/>
+      <w:lvlText w:val=""/>
+      <w:lvlJc w:val="left"/>
+      <w:pPr>
+        <w:tabs>
+          <w:tab w:val="num" w:pos="4320"/>
+        </w:tabs>
+        <w:ind w:left="4320" w:hanging="360"/>
+      </w:pPr>
+      <w:rPr>
+        <w:rFonts w:ascii="Wingdings" w:hAnsi="Wingdings" w:hint="default"/>
+        <w:sz w:val="20"/>
+      </w:rPr>
+    </w:lvl>
+    <w:lvl w:ilvl="6" w:tentative="1">
+      <w:start w:val="1"/>
+      <w:numFmt w:val="bullet"/>
+      <w:lvlText w:val=""/>
+      <w:lvlJc w:val="left"/>
+      <w:pPr>
+        <w:tabs>
+          <w:tab w:val="num" w:pos="5040"/>
+        </w:tabs>
+        <w:ind w:left="5040" w:hanging="360"/>
+      </w:pPr>
+      <w:rPr>
+        <w:rFonts w:ascii="Wingdings" w:hAnsi="Wingdings" w:hint="default"/>
+        <w:sz w:val="20"/>
+      </w:rPr>
+    </w:lvl>
+    <w:lvl w:ilvl="7" w:tentative="1">
+      <w:start w:val="1"/>
+      <w:numFmt w:val="bullet"/>
+      <w:lvlText w:val=""/>
+      <w:lvlJc w:val="left"/>
+      <w:pPr>
+        <w:tabs>
+          <w:tab w:val="num" w:pos="5760"/>
+        </w:tabs>
+        <w:ind w:left="5760" w:hanging="360"/>
+      </w:pPr>
+      <w:rPr>
+        <w:rFonts w:ascii="Wingdings" w:hAnsi="Wingdings" w:hint="default"/>
+        <w:sz w:val="20"/>
+      </w:rPr>
+    </w:lvl>
+    <w:lvl w:ilvl="8" w:tentative="1">
+      <w:start w:val="1"/>
+      <w:numFmt w:val="bullet"/>
+      <w:lvlText w:val=""/>
+      <w:lvlJc w:val="left"/>
+      <w:pPr>
+        <w:tabs>
+          <w:tab w:val="num" w:pos="6480"/>
+        </w:tabs>
+        <w:ind w:left="6480" w:hanging="360"/>
+      </w:pPr>
+      <w:rPr>
+        <w:rFonts w:ascii="Wingdings" w:hAnsi="Wingdings" w:hint="default"/>
+        <w:sz w:val="20"/>
+      </w:rPr>
+    </w:lvl>
+  </w:abstractNum>
+  <w:abstractNum w:abstractNumId="21" w15:restartNumberingAfterBreak="0">
     <w:nsid w:val="719F31B3"/>
     <w:multiLevelType w:val="multilevel"/>
     <w:tmpl w:val="ACBC53C4"/>
@@ -8993,7 +10216,7 @@
       </w:rPr>
     </w:lvl>
   </w:abstractNum>
-  <w:abstractNum w:abstractNumId="18" w15:restartNumberingAfterBreak="0">
+  <w:abstractNum w:abstractNumId="22" w15:restartNumberingAfterBreak="0">
     <w:nsid w:val="7294751F"/>
     <w:multiLevelType w:val="multilevel"/>
     <w:tmpl w:val="0CE046A8"/>
@@ -9106,7 +10329,120 @@
       </w:rPr>
     </w:lvl>
   </w:abstractNum>
-  <w:abstractNum w:abstractNumId="19" w15:restartNumberingAfterBreak="0">
+  <w:abstractNum w:abstractNumId="23" w15:restartNumberingAfterBreak="0">
+    <w:nsid w:val="76DA5334"/>
+    <w:multiLevelType w:val="multilevel"/>
+    <w:tmpl w:val="53BA593A"/>
+    <w:lvl w:ilvl="0">
+      <w:start w:val="1"/>
+      <w:numFmt w:val="decimal"/>
+      <w:lvlText w:val="%1."/>
+      <w:lvlJc w:val="left"/>
+      <w:pPr>
+        <w:tabs>
+          <w:tab w:val="num" w:pos="720"/>
+        </w:tabs>
+        <w:ind w:left="720" w:hanging="360"/>
+      </w:pPr>
+    </w:lvl>
+    <w:lvl w:ilvl="1" w:tentative="1">
+      <w:start w:val="1"/>
+      <w:numFmt w:val="decimal"/>
+      <w:lvlText w:val="%2."/>
+      <w:lvlJc w:val="left"/>
+      <w:pPr>
+        <w:tabs>
+          <w:tab w:val="num" w:pos="1440"/>
+        </w:tabs>
+        <w:ind w:left="1440" w:hanging="360"/>
+      </w:pPr>
+    </w:lvl>
+    <w:lvl w:ilvl="2" w:tentative="1">
+      <w:start w:val="1"/>
+      <w:numFmt w:val="decimal"/>
+      <w:lvlText w:val="%3."/>
+      <w:lvlJc w:val="left"/>
+      <w:pPr>
+        <w:tabs>
+          <w:tab w:val="num" w:pos="2160"/>
+        </w:tabs>
+        <w:ind w:left="2160" w:hanging="360"/>
+      </w:pPr>
+    </w:lvl>
+    <w:lvl w:ilvl="3" w:tentative="1">
+      <w:start w:val="1"/>
+      <w:numFmt w:val="decimal"/>
+      <w:lvlText w:val="%4."/>
+      <w:lvlJc w:val="left"/>
+      <w:pPr>
+        <w:tabs>
+          <w:tab w:val="num" w:pos="2880"/>
+        </w:tabs>
+        <w:ind w:left="2880" w:hanging="360"/>
+      </w:pPr>
+    </w:lvl>
+    <w:lvl w:ilvl="4" w:tentative="1">
+      <w:start w:val="1"/>
+      <w:numFmt w:val="decimal"/>
+      <w:lvlText w:val="%5."/>
+      <w:lvlJc w:val="left"/>
+      <w:pPr>
+        <w:tabs>
+          <w:tab w:val="num" w:pos="3600"/>
+        </w:tabs>
+        <w:ind w:left="3600" w:hanging="360"/>
+      </w:pPr>
+    </w:lvl>
+    <w:lvl w:ilvl="5" w:tentative="1">
+      <w:start w:val="1"/>
+      <w:numFmt w:val="decimal"/>
+      <w:lvlText w:val="%6."/>
+      <w:lvlJc w:val="left"/>
+      <w:pPr>
+        <w:tabs>
+          <w:tab w:val="num" w:pos="4320"/>
+        </w:tabs>
+        <w:ind w:left="4320" w:hanging="360"/>
+      </w:pPr>
+    </w:lvl>
+    <w:lvl w:ilvl="6" w:tentative="1">
+      <w:start w:val="1"/>
+      <w:numFmt w:val="decimal"/>
+      <w:lvlText w:val="%7."/>
+      <w:lvlJc w:val="left"/>
+      <w:pPr>
+        <w:tabs>
+          <w:tab w:val="num" w:pos="5040"/>
+        </w:tabs>
+        <w:ind w:left="5040" w:hanging="360"/>
+      </w:pPr>
+    </w:lvl>
+    <w:lvl w:ilvl="7" w:tentative="1">
+      <w:start w:val="1"/>
+      <w:numFmt w:val="decimal"/>
+      <w:lvlText w:val="%8."/>
+      <w:lvlJc w:val="left"/>
+      <w:pPr>
+        <w:tabs>
+          <w:tab w:val="num" w:pos="5760"/>
+        </w:tabs>
+        <w:ind w:left="5760" w:hanging="360"/>
+      </w:pPr>
+    </w:lvl>
+    <w:lvl w:ilvl="8" w:tentative="1">
+      <w:start w:val="1"/>
+      <w:numFmt w:val="decimal"/>
+      <w:lvlText w:val="%9."/>
+      <w:lvlJc w:val="left"/>
+      <w:pPr>
+        <w:tabs>
+          <w:tab w:val="num" w:pos="6480"/>
+        </w:tabs>
+        <w:ind w:left="6480" w:hanging="360"/>
+      </w:pPr>
+    </w:lvl>
+  </w:abstractNum>
+  <w:abstractNum w:abstractNumId="24" w15:restartNumberingAfterBreak="0">
     <w:nsid w:val="781F0F93"/>
     <w:multiLevelType w:val="multilevel"/>
     <w:tmpl w:val="677A3D68"/>
@@ -9220,64 +10556,79 @@
     </w:lvl>
   </w:abstractNum>
   <w:num w:numId="1" w16cid:durableId="1091974608">
-    <w:abstractNumId w:val="3"/>
+    <w:abstractNumId w:val="4"/>
   </w:num>
   <w:num w:numId="2" w16cid:durableId="216476576">
-    <w:abstractNumId w:val="14"/>
+    <w:abstractNumId w:val="17"/>
   </w:num>
   <w:num w:numId="3" w16cid:durableId="1759398743">
-    <w:abstractNumId w:val="17"/>
+    <w:abstractNumId w:val="21"/>
   </w:num>
   <w:num w:numId="4" w16cid:durableId="2047168883">
-    <w:abstractNumId w:val="15"/>
+    <w:abstractNumId w:val="18"/>
   </w:num>
   <w:num w:numId="5" w16cid:durableId="367877644">
-    <w:abstractNumId w:val="6"/>
+    <w:abstractNumId w:val="7"/>
   </w:num>
   <w:num w:numId="6" w16cid:durableId="1146775677">
-    <w:abstractNumId w:val="7"/>
+    <w:abstractNumId w:val="8"/>
   </w:num>
   <w:num w:numId="7" w16cid:durableId="351421425">
-    <w:abstractNumId w:val="19"/>
+    <w:abstractNumId w:val="24"/>
   </w:num>
   <w:num w:numId="8" w16cid:durableId="1290748980">
-    <w:abstractNumId w:val="18"/>
+    <w:abstractNumId w:val="22"/>
   </w:num>
   <w:num w:numId="9" w16cid:durableId="1424301968">
-    <w:abstractNumId w:val="5"/>
+    <w:abstractNumId w:val="6"/>
   </w:num>
   <w:num w:numId="10" w16cid:durableId="868492089">
     <w:abstractNumId w:val="2"/>
   </w:num>
   <w:num w:numId="11" w16cid:durableId="400294190">
-    <w:abstractNumId w:val="11"/>
+    <w:abstractNumId w:val="13"/>
   </w:num>
   <w:num w:numId="12" w16cid:durableId="2048485772">
-    <w:abstractNumId w:val="16"/>
+    <w:abstractNumId w:val="19"/>
   </w:num>
   <w:num w:numId="13" w16cid:durableId="602230517">
     <w:abstractNumId w:val="1"/>
   </w:num>
   <w:num w:numId="14" w16cid:durableId="1302927409">
-    <w:abstractNumId w:val="13"/>
+    <w:abstractNumId w:val="16"/>
   </w:num>
   <w:num w:numId="15" w16cid:durableId="675763303">
-    <w:abstractNumId w:val="12"/>
+    <w:abstractNumId w:val="15"/>
   </w:num>
   <w:num w:numId="16" w16cid:durableId="1487286115">
-    <w:abstractNumId w:val="9"/>
+    <w:abstractNumId w:val="11"/>
   </w:num>
   <w:num w:numId="17" w16cid:durableId="230315997">
     <w:abstractNumId w:val="0"/>
   </w:num>
   <w:num w:numId="18" w16cid:durableId="399521388">
-    <w:abstractNumId w:val="4"/>
+    <w:abstractNumId w:val="5"/>
   </w:num>
   <w:num w:numId="19" w16cid:durableId="598559544">
-    <w:abstractNumId w:val="8"/>
+    <w:abstractNumId w:val="10"/>
   </w:num>
   <w:num w:numId="20" w16cid:durableId="627857045">
-    <w:abstractNumId w:val="10"/>
+    <w:abstractNumId w:val="12"/>
+  </w:num>
+  <w:num w:numId="21" w16cid:durableId="795100439">
+    <w:abstractNumId w:val="23"/>
+  </w:num>
+  <w:num w:numId="22" w16cid:durableId="324355287">
+    <w:abstractNumId w:val="9"/>
+  </w:num>
+  <w:num w:numId="23" w16cid:durableId="1425957797">
+    <w:abstractNumId w:val="3"/>
+  </w:num>
+  <w:num w:numId="24" w16cid:durableId="1261137648">
+    <w:abstractNumId w:val="14"/>
+  </w:num>
+  <w:num w:numId="25" w16cid:durableId="1461610137">
+    <w:abstractNumId w:val="20"/>
   </w:num>
 </w:numbering>
 </file>

</xml_diff>